<commit_message>
atualização da aula 03/09/2026
</commit_message>
<xml_diff>
--- a/Apostila/Projeto Space for Men.docx
+++ b/Apostila/Projeto Space for Men.docx
@@ -272,6 +272,9 @@
         <w:jc w:val="center"/>
       </w:pPr>
       <w:r>
+        <w:rPr>
+          <w:noProof/>
+        </w:rPr>
         <w:drawing>
           <wp:inline distT="0" distB="0" distL="0" distR="0" wp14:anchorId="0220DECE" wp14:editId="4210413A">
             <wp:extent cx="6152400" cy="162000"/>
@@ -357,6 +360,9 @@
         <w:jc w:val="center"/>
       </w:pPr>
       <w:r>
+        <w:rPr>
+          <w:noProof/>
+        </w:rPr>
         <w:drawing>
           <wp:inline distT="0" distB="0" distL="0" distR="0" wp14:anchorId="6D2F5F8E" wp14:editId="0525EE34">
             <wp:extent cx="2581635" cy="1162212"/>
@@ -431,6 +437,9 @@
         <w:jc w:val="center"/>
       </w:pPr>
       <w:r>
+        <w:rPr>
+          <w:noProof/>
+        </w:rPr>
         <w:drawing>
           <wp:inline distT="0" distB="0" distL="0" distR="0" wp14:anchorId="513FD4D7" wp14:editId="4449F8F8">
             <wp:extent cx="6039907" cy="247650"/>
@@ -810,8 +819,6 @@
       <w:pPr>
         <w:jc w:val="center"/>
       </w:pPr>
-      <w:bookmarkStart w:id="0" w:name="_GoBack"/>
-      <w:bookmarkEnd w:id="0"/>
       <w:r>
         <w:rPr>
           <w:noProof/>
@@ -850,6 +857,4454 @@
                     <a:xfrm>
                       <a:off x="0" y="0"/>
                       <a:ext cx="2810510" cy="1143000"/>
+                    </a:xfrm>
+                    <a:prstGeom prst="rect">
+                      <a:avLst/>
+                    </a:prstGeom>
+                    <a:noFill/>
+                  </pic:spPr>
+                </pic:pic>
+              </a:graphicData>
+            </a:graphic>
+          </wp:inline>
+        </w:drawing>
+      </w:r>
+    </w:p>
+    <w:p>
+      <w:r>
+        <w:t>9-</w:t>
+      </w:r>
+      <w:proofErr w:type="gramStart"/>
+      <w:r>
+        <w:t>No itens</w:t>
+      </w:r>
+      <w:proofErr w:type="gramEnd"/>
+      <w:r>
+        <w:t xml:space="preserve"> da lista adicionamos </w:t>
+      </w:r>
+      <w:proofErr w:type="spellStart"/>
+      <w:r>
+        <w:t>class</w:t>
+      </w:r>
+      <w:proofErr w:type="spellEnd"/>
+      <w:r>
+        <w:t xml:space="preserve"> com mesmo nome para que o comportamentos se </w:t>
+      </w:r>
+      <w:proofErr w:type="spellStart"/>
+      <w:r>
+        <w:t>re´pita</w:t>
+      </w:r>
+      <w:proofErr w:type="spellEnd"/>
+      <w:r>
+        <w:t xml:space="preserve"> para todos os itens da lista </w:t>
+      </w:r>
+    </w:p>
+    <w:p>
+      <w:r>
+        <w:t>(os itens todos ficaram em itálico)</w:t>
+      </w:r>
+    </w:p>
+    <w:p>
+      <w:r>
+        <w:rPr>
+          <w:noProof/>
+        </w:rPr>
+        <w:drawing>
+          <wp:inline distT="0" distB="0" distL="0" distR="0" wp14:anchorId="634BEAEC" wp14:editId="08B5BCB6">
+            <wp:extent cx="3267531" cy="847843"/>
+            <wp:effectExtent l="0" t="0" r="9525" b="9525"/>
+            <wp:docPr id="11" name="Imagem 11"/>
+            <wp:cNvGraphicFramePr>
+              <a:graphicFrameLocks xmlns:a="http://schemas.openxmlformats.org/drawingml/2006/main" noChangeAspect="1"/>
+            </wp:cNvGraphicFramePr>
+            <a:graphic xmlns:a="http://schemas.openxmlformats.org/drawingml/2006/main">
+              <a:graphicData uri="http://schemas.openxmlformats.org/drawingml/2006/picture">
+                <pic:pic xmlns:pic="http://schemas.openxmlformats.org/drawingml/2006/picture">
+                  <pic:nvPicPr>
+                    <pic:cNvPr id="1" name=""/>
+                    <pic:cNvPicPr/>
+                  </pic:nvPicPr>
+                  <pic:blipFill>
+                    <a:blip r:embed="rId17"/>
+                    <a:stretch>
+                      <a:fillRect/>
+                    </a:stretch>
+                  </pic:blipFill>
+                  <pic:spPr>
+                    <a:xfrm>
+                      <a:off x="0" y="0"/>
+                      <a:ext cx="3267531" cy="847843"/>
+                    </a:xfrm>
+                    <a:prstGeom prst="rect">
+                      <a:avLst/>
+                    </a:prstGeom>
+                  </pic:spPr>
+                </pic:pic>
+              </a:graphicData>
+            </a:graphic>
+          </wp:inline>
+        </w:drawing>
+      </w:r>
+      <w:r>
+        <w:t xml:space="preserve">       </w:t>
+      </w:r>
+      <w:r>
+        <w:rPr>
+          <w:noProof/>
+        </w:rPr>
+        <w:drawing>
+          <wp:inline distT="0" distB="0" distL="0" distR="0" wp14:anchorId="79AE9176">
+            <wp:extent cx="1676400" cy="419100"/>
+            <wp:effectExtent l="0" t="0" r="0" b="0"/>
+            <wp:docPr id="12" name="Imagem 12"/>
+            <wp:cNvGraphicFramePr>
+              <a:graphicFrameLocks xmlns:a="http://schemas.openxmlformats.org/drawingml/2006/main" noChangeAspect="1"/>
+            </wp:cNvGraphicFramePr>
+            <a:graphic xmlns:a="http://schemas.openxmlformats.org/drawingml/2006/main">
+              <a:graphicData uri="http://schemas.openxmlformats.org/drawingml/2006/picture">
+                <pic:pic xmlns:pic="http://schemas.openxmlformats.org/drawingml/2006/picture">
+                  <pic:nvPicPr>
+                    <pic:cNvPr id="0" name="Picture 2"/>
+                    <pic:cNvPicPr>
+                      <a:picLocks noChangeAspect="1" noChangeArrowheads="1"/>
+                    </pic:cNvPicPr>
+                  </pic:nvPicPr>
+                  <pic:blipFill>
+                    <a:blip r:embed="rId18">
+                      <a:extLst>
+                        <a:ext uri="{28A0092B-C50C-407E-A947-70E740481C1C}">
+                          <a14:useLocalDpi xmlns:a14="http://schemas.microsoft.com/office/drawing/2010/main" val="0"/>
+                        </a:ext>
+                      </a:extLst>
+                    </a:blip>
+                    <a:srcRect/>
+                    <a:stretch>
+                      <a:fillRect/>
+                    </a:stretch>
+                  </pic:blipFill>
+                  <pic:spPr bwMode="auto">
+                    <a:xfrm>
+                      <a:off x="0" y="0"/>
+                      <a:ext cx="1676400" cy="419100"/>
+                    </a:xfrm>
+                    <a:prstGeom prst="rect">
+                      <a:avLst/>
+                    </a:prstGeom>
+                    <a:noFill/>
+                  </pic:spPr>
+                </pic:pic>
+              </a:graphicData>
+            </a:graphic>
+          </wp:inline>
+        </w:drawing>
+      </w:r>
+    </w:p>
+    <w:p/>
+    <w:p>
+      <w:r>
+        <w:t>10</w:t>
+      </w:r>
+      <w:r>
+        <w:t>-</w:t>
+      </w:r>
+      <w:r>
+        <w:t xml:space="preserve">Dividimos a nossa </w:t>
+      </w:r>
+      <w:proofErr w:type="spellStart"/>
+      <w:r>
+        <w:t>pagina</w:t>
+      </w:r>
+      <w:proofErr w:type="spellEnd"/>
+      <w:r>
+        <w:t xml:space="preserve"> em duas 2: primeira parte sendo a principal onde adicionamos uma </w:t>
+      </w:r>
+      <w:proofErr w:type="spellStart"/>
+      <w:r>
+        <w:t>div</w:t>
+      </w:r>
+      <w:proofErr w:type="spellEnd"/>
+      <w:r>
+        <w:t xml:space="preserve"> que iniciou acima do </w:t>
+      </w:r>
+      <w:proofErr w:type="spellStart"/>
+      <w:r>
+        <w:t>headere</w:t>
+      </w:r>
+      <w:proofErr w:type="spellEnd"/>
+      <w:r>
+        <w:t xml:space="preserve"> fechou no nosso </w:t>
+      </w:r>
+      <w:proofErr w:type="spellStart"/>
+      <w:r>
+        <w:t>ultimo</w:t>
+      </w:r>
+      <w:proofErr w:type="spellEnd"/>
+      <w:r>
+        <w:t xml:space="preserve"> </w:t>
+      </w:r>
+      <w:proofErr w:type="spellStart"/>
+      <w:r>
+        <w:t>paragrafo</w:t>
+      </w:r>
+      <w:proofErr w:type="spellEnd"/>
+      <w:r>
+        <w:t xml:space="preserve">. E deixamos o fundo dessa divisão com a cor branca </w:t>
+      </w:r>
+    </w:p>
+    <w:p>
+      <w:pPr>
+        <w:jc w:val="center"/>
+      </w:pPr>
+      <w:r>
+        <w:rPr>
+          <w:noProof/>
+        </w:rPr>
+        <w:drawing>
+          <wp:inline distT="0" distB="0" distL="0" distR="0" wp14:anchorId="0041F132" wp14:editId="41B016EC">
+            <wp:extent cx="5400040" cy="1730375"/>
+            <wp:effectExtent l="0" t="0" r="0" b="3175"/>
+            <wp:docPr id="13" name="Imagem 13"/>
+            <wp:cNvGraphicFramePr>
+              <a:graphicFrameLocks xmlns:a="http://schemas.openxmlformats.org/drawingml/2006/main" noChangeAspect="1"/>
+            </wp:cNvGraphicFramePr>
+            <a:graphic xmlns:a="http://schemas.openxmlformats.org/drawingml/2006/main">
+              <a:graphicData uri="http://schemas.openxmlformats.org/drawingml/2006/picture">
+                <pic:pic xmlns:pic="http://schemas.openxmlformats.org/drawingml/2006/picture">
+                  <pic:nvPicPr>
+                    <pic:cNvPr id="1" name=""/>
+                    <pic:cNvPicPr/>
+                  </pic:nvPicPr>
+                  <pic:blipFill>
+                    <a:blip r:embed="rId19"/>
+                    <a:stretch>
+                      <a:fillRect/>
+                    </a:stretch>
+                  </pic:blipFill>
+                  <pic:spPr>
+                    <a:xfrm>
+                      <a:off x="0" y="0"/>
+                      <a:ext cx="5400040" cy="1730375"/>
+                    </a:xfrm>
+                    <a:prstGeom prst="rect">
+                      <a:avLst/>
+                    </a:prstGeom>
+                  </pic:spPr>
+                </pic:pic>
+              </a:graphicData>
+            </a:graphic>
+          </wp:inline>
+        </w:drawing>
+      </w:r>
+    </w:p>
+    <w:p>
+      <w:pPr>
+        <w:jc w:val="center"/>
+      </w:pPr>
+      <w:r>
+        <w:rPr>
+          <w:noProof/>
+        </w:rPr>
+        <w:drawing>
+          <wp:inline distT="0" distB="0" distL="0" distR="0" wp14:anchorId="20812363">
+            <wp:extent cx="2076450" cy="495300"/>
+            <wp:effectExtent l="0" t="0" r="0" b="0"/>
+            <wp:docPr id="14" name="Imagem 14"/>
+            <wp:cNvGraphicFramePr>
+              <a:graphicFrameLocks xmlns:a="http://schemas.openxmlformats.org/drawingml/2006/main" noChangeAspect="1"/>
+            </wp:cNvGraphicFramePr>
+            <a:graphic xmlns:a="http://schemas.openxmlformats.org/drawingml/2006/main">
+              <a:graphicData uri="http://schemas.openxmlformats.org/drawingml/2006/picture">
+                <pic:pic xmlns:pic="http://schemas.openxmlformats.org/drawingml/2006/picture">
+                  <pic:nvPicPr>
+                    <pic:cNvPr id="0" name="Picture 3"/>
+                    <pic:cNvPicPr>
+                      <a:picLocks noChangeAspect="1" noChangeArrowheads="1"/>
+                    </pic:cNvPicPr>
+                  </pic:nvPicPr>
+                  <pic:blipFill>
+                    <a:blip r:embed="rId20">
+                      <a:extLst>
+                        <a:ext uri="{28A0092B-C50C-407E-A947-70E740481C1C}">
+                          <a14:useLocalDpi xmlns:a14="http://schemas.microsoft.com/office/drawing/2010/main" val="0"/>
+                        </a:ext>
+                      </a:extLst>
+                    </a:blip>
+                    <a:srcRect/>
+                    <a:stretch>
+                      <a:fillRect/>
+                    </a:stretch>
+                  </pic:blipFill>
+                  <pic:spPr bwMode="auto">
+                    <a:xfrm>
+                      <a:off x="0" y="0"/>
+                      <a:ext cx="2076450" cy="495300"/>
+                    </a:xfrm>
+                    <a:prstGeom prst="rect">
+                      <a:avLst/>
+                    </a:prstGeom>
+                    <a:noFill/>
+                  </pic:spPr>
+                </pic:pic>
+              </a:graphicData>
+            </a:graphic>
+          </wp:inline>
+        </w:drawing>
+      </w:r>
+    </w:p>
+    <w:p/>
+    <w:p>
+      <w:pPr>
+        <w:jc w:val="center"/>
+      </w:pPr>
+      <w:r>
+        <w:t xml:space="preserve">11- </w:t>
+      </w:r>
+      <w:r>
+        <w:t xml:space="preserve">E no outro </w:t>
+      </w:r>
+      <w:proofErr w:type="spellStart"/>
+      <w:r>
+        <w:t>paragrafo</w:t>
+      </w:r>
+      <w:proofErr w:type="spellEnd"/>
+      <w:r>
+        <w:t xml:space="preserve"> </w:t>
+      </w:r>
+      <w:r>
+        <w:t>colocamos a cor cinza</w:t>
+      </w:r>
+      <w:r>
+        <w:rPr>
+          <w:noProof/>
+        </w:rPr>
+        <w:drawing>
+          <wp:inline distT="0" distB="0" distL="0" distR="0" wp14:anchorId="36760CBE">
+            <wp:extent cx="5058410" cy="1847850"/>
+            <wp:effectExtent l="0" t="0" r="8890" b="0"/>
+            <wp:docPr id="15" name="Imagem 15"/>
+            <wp:cNvGraphicFramePr>
+              <a:graphicFrameLocks xmlns:a="http://schemas.openxmlformats.org/drawingml/2006/main" noChangeAspect="1"/>
+            </wp:cNvGraphicFramePr>
+            <a:graphic xmlns:a="http://schemas.openxmlformats.org/drawingml/2006/main">
+              <a:graphicData uri="http://schemas.openxmlformats.org/drawingml/2006/picture">
+                <pic:pic xmlns:pic="http://schemas.openxmlformats.org/drawingml/2006/picture">
+                  <pic:nvPicPr>
+                    <pic:cNvPr id="0" name="Picture 4"/>
+                    <pic:cNvPicPr>
+                      <a:picLocks noChangeAspect="1" noChangeArrowheads="1"/>
+                    </pic:cNvPicPr>
+                  </pic:nvPicPr>
+                  <pic:blipFill>
+                    <a:blip r:embed="rId21">
+                      <a:extLst>
+                        <a:ext uri="{28A0092B-C50C-407E-A947-70E740481C1C}">
+                          <a14:useLocalDpi xmlns:a14="http://schemas.microsoft.com/office/drawing/2010/main" val="0"/>
+                        </a:ext>
+                      </a:extLst>
+                    </a:blip>
+                    <a:srcRect/>
+                    <a:stretch>
+                      <a:fillRect/>
+                    </a:stretch>
+                  </pic:blipFill>
+                  <pic:spPr bwMode="auto">
+                    <a:xfrm>
+                      <a:off x="0" y="0"/>
+                      <a:ext cx="5058410" cy="1847850"/>
+                    </a:xfrm>
+                    <a:prstGeom prst="rect">
+                      <a:avLst/>
+                    </a:prstGeom>
+                    <a:noFill/>
+                  </pic:spPr>
+                </pic:pic>
+              </a:graphicData>
+            </a:graphic>
+          </wp:inline>
+        </w:drawing>
+      </w:r>
+    </w:p>
+    <w:p>
+      <w:pPr>
+        <w:jc w:val="center"/>
+      </w:pPr>
+      <w:r>
+        <w:rPr>
+          <w:noProof/>
+        </w:rPr>
+        <w:drawing>
+          <wp:inline distT="0" distB="0" distL="0" distR="0" wp14:anchorId="546922DF" wp14:editId="66EC9D4C">
+            <wp:extent cx="2076740" cy="638264"/>
+            <wp:effectExtent l="0" t="0" r="0" b="9525"/>
+            <wp:docPr id="16" name="Imagem 16"/>
+            <wp:cNvGraphicFramePr>
+              <a:graphicFrameLocks xmlns:a="http://schemas.openxmlformats.org/drawingml/2006/main" noChangeAspect="1"/>
+            </wp:cNvGraphicFramePr>
+            <a:graphic xmlns:a="http://schemas.openxmlformats.org/drawingml/2006/main">
+              <a:graphicData uri="http://schemas.openxmlformats.org/drawingml/2006/picture">
+                <pic:pic xmlns:pic="http://schemas.openxmlformats.org/drawingml/2006/picture">
+                  <pic:nvPicPr>
+                    <pic:cNvPr id="1" name=""/>
+                    <pic:cNvPicPr/>
+                  </pic:nvPicPr>
+                  <pic:blipFill>
+                    <a:blip r:embed="rId22"/>
+                    <a:stretch>
+                      <a:fillRect/>
+                    </a:stretch>
+                  </pic:blipFill>
+                  <pic:spPr>
+                    <a:xfrm>
+                      <a:off x="0" y="0"/>
+                      <a:ext cx="2076740" cy="638264"/>
+                    </a:xfrm>
+                    <a:prstGeom prst="rect">
+                      <a:avLst/>
+                    </a:prstGeom>
+                  </pic:spPr>
+                </pic:pic>
+              </a:graphicData>
+            </a:graphic>
+          </wp:inline>
+        </w:drawing>
+      </w:r>
+    </w:p>
+    <w:p/>
+    <w:p>
+      <w:r>
+        <w:t xml:space="preserve">12-Adicionamos uma imagem na </w:t>
+      </w:r>
+      <w:proofErr w:type="spellStart"/>
+      <w:r>
+        <w:t>div</w:t>
+      </w:r>
+      <w:proofErr w:type="spellEnd"/>
+      <w:r>
+        <w:t xml:space="preserve"> benefícios e reduzimos o tamanho da imagem</w:t>
+      </w:r>
+    </w:p>
+    <w:p>
+      <w:pPr>
+        <w:jc w:val="center"/>
+      </w:pPr>
+      <w:r>
+        <w:rPr>
+          <w:noProof/>
+        </w:rPr>
+        <w:drawing>
+          <wp:inline distT="0" distB="0" distL="0" distR="0" wp14:anchorId="7257909E">
+            <wp:extent cx="4429760" cy="238125"/>
+            <wp:effectExtent l="0" t="0" r="8890" b="9525"/>
+            <wp:docPr id="17" name="Imagem 17"/>
+            <wp:cNvGraphicFramePr>
+              <a:graphicFrameLocks xmlns:a="http://schemas.openxmlformats.org/drawingml/2006/main" noChangeAspect="1"/>
+            </wp:cNvGraphicFramePr>
+            <a:graphic xmlns:a="http://schemas.openxmlformats.org/drawingml/2006/main">
+              <a:graphicData uri="http://schemas.openxmlformats.org/drawingml/2006/picture">
+                <pic:pic xmlns:pic="http://schemas.openxmlformats.org/drawingml/2006/picture">
+                  <pic:nvPicPr>
+                    <pic:cNvPr id="0" name="Picture 5"/>
+                    <pic:cNvPicPr>
+                      <a:picLocks noChangeAspect="1" noChangeArrowheads="1"/>
+                    </pic:cNvPicPr>
+                  </pic:nvPicPr>
+                  <pic:blipFill>
+                    <a:blip r:embed="rId23">
+                      <a:extLst>
+                        <a:ext uri="{28A0092B-C50C-407E-A947-70E740481C1C}">
+                          <a14:useLocalDpi xmlns:a14="http://schemas.microsoft.com/office/drawing/2010/main" val="0"/>
+                        </a:ext>
+                      </a:extLst>
+                    </a:blip>
+                    <a:srcRect/>
+                    <a:stretch>
+                      <a:fillRect/>
+                    </a:stretch>
+                  </pic:blipFill>
+                  <pic:spPr bwMode="auto">
+                    <a:xfrm>
+                      <a:off x="0" y="0"/>
+                      <a:ext cx="4429760" cy="238125"/>
+                    </a:xfrm>
+                    <a:prstGeom prst="rect">
+                      <a:avLst/>
+                    </a:prstGeom>
+                    <a:noFill/>
+                  </pic:spPr>
+                </pic:pic>
+              </a:graphicData>
+            </a:graphic>
+          </wp:inline>
+        </w:drawing>
+      </w:r>
+    </w:p>
+    <w:p>
+      <w:pPr>
+        <w:jc w:val="center"/>
+      </w:pPr>
+      <w:r>
+        <w:rPr>
+          <w:noProof/>
+        </w:rPr>
+        <w:drawing>
+          <wp:inline distT="0" distB="0" distL="0" distR="0" wp14:anchorId="5A798FED">
+            <wp:extent cx="1476375" cy="600075"/>
+            <wp:effectExtent l="0" t="0" r="9525" b="9525"/>
+            <wp:docPr id="18" name="Imagem 18"/>
+            <wp:cNvGraphicFramePr>
+              <a:graphicFrameLocks xmlns:a="http://schemas.openxmlformats.org/drawingml/2006/main" noChangeAspect="1"/>
+            </wp:cNvGraphicFramePr>
+            <a:graphic xmlns:a="http://schemas.openxmlformats.org/drawingml/2006/main">
+              <a:graphicData uri="http://schemas.openxmlformats.org/drawingml/2006/picture">
+                <pic:pic xmlns:pic="http://schemas.openxmlformats.org/drawingml/2006/picture">
+                  <pic:nvPicPr>
+                    <pic:cNvPr id="0" name="Picture 6"/>
+                    <pic:cNvPicPr>
+                      <a:picLocks noChangeAspect="1" noChangeArrowheads="1"/>
+                    </pic:cNvPicPr>
+                  </pic:nvPicPr>
+                  <pic:blipFill>
+                    <a:blip r:embed="rId24">
+                      <a:extLst>
+                        <a:ext uri="{28A0092B-C50C-407E-A947-70E740481C1C}">
+                          <a14:useLocalDpi xmlns:a14="http://schemas.microsoft.com/office/drawing/2010/main" val="0"/>
+                        </a:ext>
+                      </a:extLst>
+                    </a:blip>
+                    <a:srcRect/>
+                    <a:stretch>
+                      <a:fillRect/>
+                    </a:stretch>
+                  </pic:blipFill>
+                  <pic:spPr bwMode="auto">
+                    <a:xfrm>
+                      <a:off x="0" y="0"/>
+                      <a:ext cx="1476375" cy="600075"/>
+                    </a:xfrm>
+                    <a:prstGeom prst="rect">
+                      <a:avLst/>
+                    </a:prstGeom>
+                    <a:noFill/>
+                  </pic:spPr>
+                </pic:pic>
+              </a:graphicData>
+            </a:graphic>
+          </wp:inline>
+        </w:drawing>
+      </w:r>
+    </w:p>
+    <w:p>
+      <w:r>
+        <w:t>13-Para colocar a lista ao lado da imagem mudamos a natureza da lista utilizando display: conforme a imagem abaixo.</w:t>
+      </w:r>
+    </w:p>
+    <w:p>
+      <w:pPr>
+        <w:jc w:val="center"/>
+      </w:pPr>
+      <w:r>
+        <w:rPr>
+          <w:noProof/>
+        </w:rPr>
+        <w:drawing>
+          <wp:inline distT="0" distB="0" distL="0" distR="0" wp14:anchorId="05C8F0B7">
+            <wp:extent cx="1838325" cy="514350"/>
+            <wp:effectExtent l="0" t="0" r="9525" b="0"/>
+            <wp:docPr id="19" name="Imagem 19"/>
+            <wp:cNvGraphicFramePr>
+              <a:graphicFrameLocks xmlns:a="http://schemas.openxmlformats.org/drawingml/2006/main" noChangeAspect="1"/>
+            </wp:cNvGraphicFramePr>
+            <a:graphic xmlns:a="http://schemas.openxmlformats.org/drawingml/2006/main">
+              <a:graphicData uri="http://schemas.openxmlformats.org/drawingml/2006/picture">
+                <pic:pic xmlns:pic="http://schemas.openxmlformats.org/drawingml/2006/picture">
+                  <pic:nvPicPr>
+                    <pic:cNvPr id="0" name="Picture 7"/>
+                    <pic:cNvPicPr>
+                      <a:picLocks noChangeAspect="1" noChangeArrowheads="1"/>
+                    </pic:cNvPicPr>
+                  </pic:nvPicPr>
+                  <pic:blipFill>
+                    <a:blip r:embed="rId25">
+                      <a:extLst>
+                        <a:ext uri="{28A0092B-C50C-407E-A947-70E740481C1C}">
+                          <a14:useLocalDpi xmlns:a14="http://schemas.microsoft.com/office/drawing/2010/main" val="0"/>
+                        </a:ext>
+                      </a:extLst>
+                    </a:blip>
+                    <a:srcRect/>
+                    <a:stretch>
+                      <a:fillRect/>
+                    </a:stretch>
+                  </pic:blipFill>
+                  <pic:spPr bwMode="auto">
+                    <a:xfrm>
+                      <a:off x="0" y="0"/>
+                      <a:ext cx="1838325" cy="514350"/>
+                    </a:xfrm>
+                    <a:prstGeom prst="rect">
+                      <a:avLst/>
+                    </a:prstGeom>
+                    <a:noFill/>
+                  </pic:spPr>
+                </pic:pic>
+              </a:graphicData>
+            </a:graphic>
+          </wp:inline>
+        </w:drawing>
+      </w:r>
+    </w:p>
+    <w:p>
+      <w:pPr>
+        <w:jc w:val="center"/>
+      </w:pPr>
+    </w:p>
+    <w:p>
+      <w:pPr>
+        <w:rPr>
+          <w:noProof/>
+        </w:rPr>
+      </w:pPr>
+    </w:p>
+    <w:p>
+      <w:r>
+        <w:rPr>
+          <w:noProof/>
+        </w:rPr>
+        <w:drawing>
+          <wp:inline distT="0" distB="0" distL="0" distR="0" wp14:anchorId="41B01D9C">
+            <wp:extent cx="5335905" cy="2207079"/>
+            <wp:effectExtent l="0" t="0" r="0" b="3175"/>
+            <wp:docPr id="20" name="Imagem 20"/>
+            <wp:cNvGraphicFramePr>
+              <a:graphicFrameLocks xmlns:a="http://schemas.openxmlformats.org/drawingml/2006/main" noChangeAspect="1"/>
+            </wp:cNvGraphicFramePr>
+            <a:graphic xmlns:a="http://schemas.openxmlformats.org/drawingml/2006/main">
+              <a:graphicData uri="http://schemas.openxmlformats.org/drawingml/2006/picture">
+                <pic:pic xmlns:pic="http://schemas.openxmlformats.org/drawingml/2006/picture">
+                  <pic:nvPicPr>
+                    <pic:cNvPr id="0" name="Picture 8"/>
+                    <pic:cNvPicPr>
+                      <a:picLocks noChangeAspect="1" noChangeArrowheads="1"/>
+                    </pic:cNvPicPr>
+                  </pic:nvPicPr>
+                  <pic:blipFill>
+                    <a:blip r:embed="rId26">
+                      <a:extLst>
+                        <a:ext uri="{28A0092B-C50C-407E-A947-70E740481C1C}">
+                          <a14:useLocalDpi xmlns:a14="http://schemas.microsoft.com/office/drawing/2010/main" val="0"/>
+                        </a:ext>
+                      </a:extLst>
+                    </a:blip>
+                    <a:srcRect/>
+                    <a:stretch>
+                      <a:fillRect/>
+                    </a:stretch>
+                  </pic:blipFill>
+                  <pic:spPr bwMode="auto">
+                    <a:xfrm>
+                      <a:off x="0" y="0"/>
+                      <a:ext cx="5366165" cy="2219596"/>
+                    </a:xfrm>
+                    <a:prstGeom prst="rect">
+                      <a:avLst/>
+                    </a:prstGeom>
+                    <a:noFill/>
+                  </pic:spPr>
+                </pic:pic>
+              </a:graphicData>
+            </a:graphic>
+          </wp:inline>
+        </w:drawing>
+      </w:r>
+    </w:p>
+    <w:p/>
+    <w:p>
+      <w:r>
+        <w:t xml:space="preserve">14-Para alinhar a </w:t>
+      </w:r>
+      <w:proofErr w:type="spellStart"/>
+      <w:r>
+        <w:t>listaao</w:t>
+      </w:r>
+      <w:proofErr w:type="spellEnd"/>
+      <w:r>
+        <w:t xml:space="preserve"> topo de imagem utilizamos os seguintes comandos:</w:t>
+      </w:r>
+    </w:p>
+    <w:p>
+      <w:pPr>
+        <w:jc w:val="center"/>
+      </w:pPr>
+      <w:r>
+        <w:rPr>
+          <w:noProof/>
+        </w:rPr>
+        <w:drawing>
+          <wp:inline distT="0" distB="0" distL="0" distR="0" wp14:anchorId="1630C7ED">
+            <wp:extent cx="1743075" cy="590550"/>
+            <wp:effectExtent l="0" t="0" r="9525" b="0"/>
+            <wp:docPr id="21" name="Imagem 21"/>
+            <wp:cNvGraphicFramePr>
+              <a:graphicFrameLocks xmlns:a="http://schemas.openxmlformats.org/drawingml/2006/main" noChangeAspect="1"/>
+            </wp:cNvGraphicFramePr>
+            <a:graphic xmlns:a="http://schemas.openxmlformats.org/drawingml/2006/main">
+              <a:graphicData uri="http://schemas.openxmlformats.org/drawingml/2006/picture">
+                <pic:pic xmlns:pic="http://schemas.openxmlformats.org/drawingml/2006/picture">
+                  <pic:nvPicPr>
+                    <pic:cNvPr id="0" name="Picture 9"/>
+                    <pic:cNvPicPr>
+                      <a:picLocks noChangeAspect="1" noChangeArrowheads="1"/>
+                    </pic:cNvPicPr>
+                  </pic:nvPicPr>
+                  <pic:blipFill>
+                    <a:blip r:embed="rId27">
+                      <a:extLst>
+                        <a:ext uri="{28A0092B-C50C-407E-A947-70E740481C1C}">
+                          <a14:useLocalDpi xmlns:a14="http://schemas.microsoft.com/office/drawing/2010/main" val="0"/>
+                        </a:ext>
+                      </a:extLst>
+                    </a:blip>
+                    <a:srcRect/>
+                    <a:stretch>
+                      <a:fillRect/>
+                    </a:stretch>
+                  </pic:blipFill>
+                  <pic:spPr bwMode="auto">
+                    <a:xfrm>
+                      <a:off x="0" y="0"/>
+                      <a:ext cx="1743075" cy="590550"/>
+                    </a:xfrm>
+                    <a:prstGeom prst="rect">
+                      <a:avLst/>
+                    </a:prstGeom>
+                    <a:noFill/>
+                  </pic:spPr>
+                </pic:pic>
+              </a:graphicData>
+            </a:graphic>
+          </wp:inline>
+        </w:drawing>
+      </w:r>
+    </w:p>
+    <w:p>
+      <w:pPr>
+        <w:jc w:val="center"/>
+      </w:pPr>
+    </w:p>
+    <w:p>
+      <w:pPr>
+        <w:jc w:val="center"/>
+      </w:pPr>
+      <w:r>
+        <w:rPr>
+          <w:noProof/>
+        </w:rPr>
+        <w:drawing>
+          <wp:inline distT="0" distB="0" distL="0" distR="0" wp14:anchorId="24A921E8">
+            <wp:extent cx="5850114" cy="2174730"/>
+            <wp:effectExtent l="0" t="0" r="0" b="0"/>
+            <wp:docPr id="22" name="Imagem 22"/>
+            <wp:cNvGraphicFramePr>
+              <a:graphicFrameLocks xmlns:a="http://schemas.openxmlformats.org/drawingml/2006/main" noChangeAspect="1"/>
+            </wp:cNvGraphicFramePr>
+            <a:graphic xmlns:a="http://schemas.openxmlformats.org/drawingml/2006/main">
+              <a:graphicData uri="http://schemas.openxmlformats.org/drawingml/2006/picture">
+                <pic:pic xmlns:pic="http://schemas.openxmlformats.org/drawingml/2006/picture">
+                  <pic:nvPicPr>
+                    <pic:cNvPr id="0" name="Picture 10"/>
+                    <pic:cNvPicPr>
+                      <a:picLocks noChangeAspect="1" noChangeArrowheads="1"/>
+                    </pic:cNvPicPr>
+                  </pic:nvPicPr>
+                  <pic:blipFill>
+                    <a:blip r:embed="rId28">
+                      <a:extLst>
+                        <a:ext uri="{28A0092B-C50C-407E-A947-70E740481C1C}">
+                          <a14:useLocalDpi xmlns:a14="http://schemas.microsoft.com/office/drawing/2010/main" val="0"/>
+                        </a:ext>
+                      </a:extLst>
+                    </a:blip>
+                    <a:srcRect/>
+                    <a:stretch>
+                      <a:fillRect/>
+                    </a:stretch>
+                  </pic:blipFill>
+                  <pic:spPr bwMode="auto">
+                    <a:xfrm>
+                      <a:off x="0" y="0"/>
+                      <a:ext cx="5951584" cy="2212450"/>
+                    </a:xfrm>
+                    <a:prstGeom prst="rect">
+                      <a:avLst/>
+                    </a:prstGeom>
+                    <a:noFill/>
+                  </pic:spPr>
+                </pic:pic>
+              </a:graphicData>
+            </a:graphic>
+          </wp:inline>
+        </w:drawing>
+      </w:r>
+    </w:p>
+    <w:p>
+      <w:r>
+        <w:t xml:space="preserve">15-ainda trabalhando com a </w:t>
+      </w:r>
+      <w:proofErr w:type="gramStart"/>
+      <w:r>
+        <w:t>lista  definimos</w:t>
+      </w:r>
+      <w:proofErr w:type="gramEnd"/>
+      <w:r>
+        <w:t xml:space="preserve"> um tamanho para que ela ocupe 20% de largura e colocamos </w:t>
+      </w:r>
+      <w:r>
+        <w:t>um  espaço externo do lado direito de 15% obtendo os seguintes resultados:</w:t>
+      </w:r>
+    </w:p>
+    <w:p/>
+    <w:p>
+      <w:pPr>
+        <w:jc w:val="center"/>
+      </w:pPr>
+      <w:r>
+        <w:rPr>
+          <w:noProof/>
+        </w:rPr>
+        <w:drawing>
+          <wp:inline distT="0" distB="0" distL="0" distR="0" wp14:anchorId="354C0172">
+            <wp:extent cx="1724025" cy="895350"/>
+            <wp:effectExtent l="0" t="0" r="9525" b="0"/>
+            <wp:docPr id="23" name="Imagem 23"/>
+            <wp:cNvGraphicFramePr>
+              <a:graphicFrameLocks xmlns:a="http://schemas.openxmlformats.org/drawingml/2006/main" noChangeAspect="1"/>
+            </wp:cNvGraphicFramePr>
+            <a:graphic xmlns:a="http://schemas.openxmlformats.org/drawingml/2006/main">
+              <a:graphicData uri="http://schemas.openxmlformats.org/drawingml/2006/picture">
+                <pic:pic xmlns:pic="http://schemas.openxmlformats.org/drawingml/2006/picture">
+                  <pic:nvPicPr>
+                    <pic:cNvPr id="0" name="Picture 11"/>
+                    <pic:cNvPicPr>
+                      <a:picLocks noChangeAspect="1" noChangeArrowheads="1"/>
+                    </pic:cNvPicPr>
+                  </pic:nvPicPr>
+                  <pic:blipFill>
+                    <a:blip r:embed="rId29">
+                      <a:extLst>
+                        <a:ext uri="{28A0092B-C50C-407E-A947-70E740481C1C}">
+                          <a14:useLocalDpi xmlns:a14="http://schemas.microsoft.com/office/drawing/2010/main" val="0"/>
+                        </a:ext>
+                      </a:extLst>
+                    </a:blip>
+                    <a:srcRect/>
+                    <a:stretch>
+                      <a:fillRect/>
+                    </a:stretch>
+                  </pic:blipFill>
+                  <pic:spPr bwMode="auto">
+                    <a:xfrm>
+                      <a:off x="0" y="0"/>
+                      <a:ext cx="1724025" cy="895350"/>
+                    </a:xfrm>
+                    <a:prstGeom prst="rect">
+                      <a:avLst/>
+                    </a:prstGeom>
+                    <a:noFill/>
+                  </pic:spPr>
+                </pic:pic>
+              </a:graphicData>
+            </a:graphic>
+          </wp:inline>
+        </w:drawing>
+      </w:r>
+    </w:p>
+    <w:p>
+      <w:pPr>
+        <w:jc w:val="center"/>
+      </w:pPr>
+    </w:p>
+    <w:p>
+      <w:pPr>
+        <w:jc w:val="center"/>
+      </w:pPr>
+      <w:r>
+        <w:rPr>
+          <w:noProof/>
+        </w:rPr>
+        <w:drawing>
+          <wp:inline distT="0" distB="0" distL="0" distR="0" wp14:anchorId="260520AF">
+            <wp:extent cx="6134523" cy="2279932"/>
+            <wp:effectExtent l="0" t="0" r="0" b="6350"/>
+            <wp:docPr id="24" name="Imagem 24"/>
+            <wp:cNvGraphicFramePr>
+              <a:graphicFrameLocks xmlns:a="http://schemas.openxmlformats.org/drawingml/2006/main" noChangeAspect="1"/>
+            </wp:cNvGraphicFramePr>
+            <a:graphic xmlns:a="http://schemas.openxmlformats.org/drawingml/2006/main">
+              <a:graphicData uri="http://schemas.openxmlformats.org/drawingml/2006/picture">
+                <pic:pic xmlns:pic="http://schemas.openxmlformats.org/drawingml/2006/picture">
+                  <pic:nvPicPr>
+                    <pic:cNvPr id="0" name="Picture 12"/>
+                    <pic:cNvPicPr>
+                      <a:picLocks noChangeAspect="1" noChangeArrowheads="1"/>
+                    </pic:cNvPicPr>
+                  </pic:nvPicPr>
+                  <pic:blipFill>
+                    <a:blip r:embed="rId30">
+                      <a:extLst>
+                        <a:ext uri="{28A0092B-C50C-407E-A947-70E740481C1C}">
+                          <a14:useLocalDpi xmlns:a14="http://schemas.microsoft.com/office/drawing/2010/main" val="0"/>
+                        </a:ext>
+                      </a:extLst>
+                    </a:blip>
+                    <a:srcRect/>
+                    <a:stretch>
+                      <a:fillRect/>
+                    </a:stretch>
+                  </pic:blipFill>
+                  <pic:spPr bwMode="auto">
+                    <a:xfrm>
+                      <a:off x="0" y="0"/>
+                      <a:ext cx="6232871" cy="2316484"/>
+                    </a:xfrm>
+                    <a:prstGeom prst="rect">
+                      <a:avLst/>
+                    </a:prstGeom>
+                    <a:noFill/>
+                  </pic:spPr>
+                </pic:pic>
+              </a:graphicData>
+            </a:graphic>
+          </wp:inline>
+        </w:drawing>
+      </w:r>
+    </w:p>
+    <w:p>
+      <w:pPr>
+        <w:jc w:val="center"/>
+      </w:pPr>
+    </w:p>
+    <w:p>
+      <w:pPr>
+        <w:jc w:val="center"/>
+      </w:pPr>
+    </w:p>
+    <w:p/>
+    <w:p>
+      <w:r>
+        <w:t xml:space="preserve">16-Na </w:t>
+      </w:r>
+      <w:proofErr w:type="spellStart"/>
+      <w:r>
+        <w:t>div</w:t>
+      </w:r>
+      <w:proofErr w:type="spellEnd"/>
+      <w:r>
+        <w:t xml:space="preserve"> benefícios centralizamos o subtítulo h2</w:t>
+      </w:r>
+    </w:p>
+    <w:p>
+      <w:pPr>
+        <w:jc w:val="center"/>
+      </w:pPr>
+      <w:r>
+        <w:rPr>
+          <w:noProof/>
+        </w:rPr>
+        <w:drawing>
+          <wp:inline distT="0" distB="0" distL="0" distR="0" wp14:anchorId="4D9160B4">
+            <wp:extent cx="1676400" cy="438150"/>
+            <wp:effectExtent l="0" t="0" r="0" b="0"/>
+            <wp:docPr id="25" name="Imagem 25"/>
+            <wp:cNvGraphicFramePr>
+              <a:graphicFrameLocks xmlns:a="http://schemas.openxmlformats.org/drawingml/2006/main" noChangeAspect="1"/>
+            </wp:cNvGraphicFramePr>
+            <a:graphic xmlns:a="http://schemas.openxmlformats.org/drawingml/2006/main">
+              <a:graphicData uri="http://schemas.openxmlformats.org/drawingml/2006/picture">
+                <pic:pic xmlns:pic="http://schemas.openxmlformats.org/drawingml/2006/picture">
+                  <pic:nvPicPr>
+                    <pic:cNvPr id="0" name="Picture 13"/>
+                    <pic:cNvPicPr>
+                      <a:picLocks noChangeAspect="1" noChangeArrowheads="1"/>
+                    </pic:cNvPicPr>
+                  </pic:nvPicPr>
+                  <pic:blipFill>
+                    <a:blip r:embed="rId31">
+                      <a:extLst>
+                        <a:ext uri="{28A0092B-C50C-407E-A947-70E740481C1C}">
+                          <a14:useLocalDpi xmlns:a14="http://schemas.microsoft.com/office/drawing/2010/main" val="0"/>
+                        </a:ext>
+                      </a:extLst>
+                    </a:blip>
+                    <a:srcRect/>
+                    <a:stretch>
+                      <a:fillRect/>
+                    </a:stretch>
+                  </pic:blipFill>
+                  <pic:spPr bwMode="auto">
+                    <a:xfrm>
+                      <a:off x="0" y="0"/>
+                      <a:ext cx="1676400" cy="438150"/>
+                    </a:xfrm>
+                    <a:prstGeom prst="rect">
+                      <a:avLst/>
+                    </a:prstGeom>
+                    <a:noFill/>
+                  </pic:spPr>
+                </pic:pic>
+              </a:graphicData>
+            </a:graphic>
+          </wp:inline>
+        </w:drawing>
+      </w:r>
+    </w:p>
+    <w:p>
+      <w:r>
+        <w:t xml:space="preserve">17- </w:t>
+      </w:r>
+      <w:proofErr w:type="gramStart"/>
+      <w:r>
+        <w:t>na</w:t>
+      </w:r>
+      <w:proofErr w:type="gramEnd"/>
+      <w:r>
+        <w:t xml:space="preserve"> </w:t>
+      </w:r>
+      <w:proofErr w:type="spellStart"/>
+      <w:r>
+        <w:t>div</w:t>
+      </w:r>
+      <w:proofErr w:type="spellEnd"/>
+      <w:r>
+        <w:t xml:space="preserve"> principal inserimos um espaço interno, tanto para cima, direita, baixo esquerda conforme código:</w:t>
+      </w:r>
+    </w:p>
+    <w:p>
+      <w:pPr>
+        <w:jc w:val="center"/>
+      </w:pPr>
+      <w:r>
+        <w:rPr>
+          <w:noProof/>
+        </w:rPr>
+        <w:drawing>
+          <wp:inline distT="0" distB="0" distL="0" distR="0" wp14:anchorId="61563C95">
+            <wp:extent cx="2038350" cy="695325"/>
+            <wp:effectExtent l="0" t="0" r="0" b="9525"/>
+            <wp:docPr id="26" name="Imagem 26"/>
+            <wp:cNvGraphicFramePr>
+              <a:graphicFrameLocks xmlns:a="http://schemas.openxmlformats.org/drawingml/2006/main" noChangeAspect="1"/>
+            </wp:cNvGraphicFramePr>
+            <a:graphic xmlns:a="http://schemas.openxmlformats.org/drawingml/2006/main">
+              <a:graphicData uri="http://schemas.openxmlformats.org/drawingml/2006/picture">
+                <pic:pic xmlns:pic="http://schemas.openxmlformats.org/drawingml/2006/picture">
+                  <pic:nvPicPr>
+                    <pic:cNvPr id="0" name="Picture 14"/>
+                    <pic:cNvPicPr>
+                      <a:picLocks noChangeAspect="1" noChangeArrowheads="1"/>
+                    </pic:cNvPicPr>
+                  </pic:nvPicPr>
+                  <pic:blipFill>
+                    <a:blip r:embed="rId32">
+                      <a:extLst>
+                        <a:ext uri="{28A0092B-C50C-407E-A947-70E740481C1C}">
+                          <a14:useLocalDpi xmlns:a14="http://schemas.microsoft.com/office/drawing/2010/main" val="0"/>
+                        </a:ext>
+                      </a:extLst>
+                    </a:blip>
+                    <a:srcRect/>
+                    <a:stretch>
+                      <a:fillRect/>
+                    </a:stretch>
+                  </pic:blipFill>
+                  <pic:spPr bwMode="auto">
+                    <a:xfrm>
+                      <a:off x="0" y="0"/>
+                      <a:ext cx="2038350" cy="695325"/>
+                    </a:xfrm>
+                    <a:prstGeom prst="rect">
+                      <a:avLst/>
+                    </a:prstGeom>
+                    <a:noFill/>
+                  </pic:spPr>
+                </pic:pic>
+              </a:graphicData>
+            </a:graphic>
+          </wp:inline>
+        </w:drawing>
+      </w:r>
+    </w:p>
+    <w:p>
+      <w:r>
+        <w:rPr>
+          <w:noProof/>
+        </w:rPr>
+        <w:drawing>
+          <wp:inline distT="0" distB="0" distL="0" distR="0" wp14:anchorId="08F973BE">
+            <wp:extent cx="5683042" cy="1054172"/>
+            <wp:effectExtent l="0" t="0" r="0" b="0"/>
+            <wp:docPr id="27" name="Imagem 27"/>
+            <wp:cNvGraphicFramePr>
+              <a:graphicFrameLocks xmlns:a="http://schemas.openxmlformats.org/drawingml/2006/main" noChangeAspect="1"/>
+            </wp:cNvGraphicFramePr>
+            <a:graphic xmlns:a="http://schemas.openxmlformats.org/drawingml/2006/main">
+              <a:graphicData uri="http://schemas.openxmlformats.org/drawingml/2006/picture">
+                <pic:pic xmlns:pic="http://schemas.openxmlformats.org/drawingml/2006/picture">
+                  <pic:nvPicPr>
+                    <pic:cNvPr id="0" name="Picture 15"/>
+                    <pic:cNvPicPr>
+                      <a:picLocks noChangeAspect="1" noChangeArrowheads="1"/>
+                    </pic:cNvPicPr>
+                  </pic:nvPicPr>
+                  <pic:blipFill>
+                    <a:blip r:embed="rId33">
+                      <a:extLst>
+                        <a:ext uri="{28A0092B-C50C-407E-A947-70E740481C1C}">
+                          <a14:useLocalDpi xmlns:a14="http://schemas.microsoft.com/office/drawing/2010/main" val="0"/>
+                        </a:ext>
+                      </a:extLst>
+                    </a:blip>
+                    <a:srcRect/>
+                    <a:stretch>
+                      <a:fillRect/>
+                    </a:stretch>
+                  </pic:blipFill>
+                  <pic:spPr bwMode="auto">
+                    <a:xfrm>
+                      <a:off x="0" y="0"/>
+                      <a:ext cx="6058948" cy="1123900"/>
+                    </a:xfrm>
+                    <a:prstGeom prst="rect">
+                      <a:avLst/>
+                    </a:prstGeom>
+                    <a:noFill/>
+                  </pic:spPr>
+                </pic:pic>
+              </a:graphicData>
+            </a:graphic>
+          </wp:inline>
+        </w:drawing>
+      </w:r>
+    </w:p>
+    <w:p/>
+    <w:p>
+      <w:r>
+        <w:t>18-</w:t>
+      </w:r>
+      <w:r>
+        <w:t xml:space="preserve">Para deixar o código mais limpo criamos uma </w:t>
+      </w:r>
+      <w:proofErr w:type="spellStart"/>
+      <w:r>
+        <w:t>class</w:t>
+      </w:r>
+      <w:proofErr w:type="spellEnd"/>
+      <w:r>
+        <w:t xml:space="preserve"> que centraliza todos os títulos e subtítulos:</w:t>
+      </w:r>
+    </w:p>
+    <w:p>
+      <w:pPr>
+        <w:jc w:val="center"/>
+      </w:pPr>
+      <w:r>
+        <w:rPr>
+          <w:noProof/>
+        </w:rPr>
+        <w:drawing>
+          <wp:inline distT="0" distB="0" distL="0" distR="0" wp14:anchorId="29295D5D" wp14:editId="37629714">
+            <wp:extent cx="2273418" cy="781050"/>
+            <wp:effectExtent l="0" t="0" r="0" b="0"/>
+            <wp:docPr id="32" name="Imagem 32"/>
+            <wp:cNvGraphicFramePr>
+              <a:graphicFrameLocks xmlns:a="http://schemas.openxmlformats.org/drawingml/2006/main" noChangeAspect="1"/>
+            </wp:cNvGraphicFramePr>
+            <a:graphic xmlns:a="http://schemas.openxmlformats.org/drawingml/2006/main">
+              <a:graphicData uri="http://schemas.openxmlformats.org/drawingml/2006/picture">
+                <pic:pic xmlns:pic="http://schemas.openxmlformats.org/drawingml/2006/picture">
+                  <pic:nvPicPr>
+                    <pic:cNvPr id="1" name=""/>
+                    <pic:cNvPicPr/>
+                  </pic:nvPicPr>
+                  <pic:blipFill>
+                    <a:blip r:embed="rId34"/>
+                    <a:stretch>
+                      <a:fillRect/>
+                    </a:stretch>
+                  </pic:blipFill>
+                  <pic:spPr>
+                    <a:xfrm>
+                      <a:off x="0" y="0"/>
+                      <a:ext cx="2294470" cy="788283"/>
+                    </a:xfrm>
+                    <a:prstGeom prst="rect">
+                      <a:avLst/>
+                    </a:prstGeom>
+                  </pic:spPr>
+                </pic:pic>
+              </a:graphicData>
+            </a:graphic>
+          </wp:inline>
+        </w:drawing>
+      </w:r>
+    </w:p>
+    <w:p>
+      <w:pPr>
+        <w:jc w:val="center"/>
+      </w:pPr>
+      <w:r>
+        <w:rPr>
+          <w:noProof/>
+        </w:rPr>
+        <w:drawing>
+          <wp:inline distT="0" distB="0" distL="0" distR="0" wp14:anchorId="2B9C0A30">
+            <wp:extent cx="3782060" cy="161925"/>
+            <wp:effectExtent l="0" t="0" r="8890" b="9525"/>
+            <wp:docPr id="28" name="Imagem 28"/>
+            <wp:cNvGraphicFramePr>
+              <a:graphicFrameLocks xmlns:a="http://schemas.openxmlformats.org/drawingml/2006/main" noChangeAspect="1"/>
+            </wp:cNvGraphicFramePr>
+            <a:graphic xmlns:a="http://schemas.openxmlformats.org/drawingml/2006/main">
+              <a:graphicData uri="http://schemas.openxmlformats.org/drawingml/2006/picture">
+                <pic:pic xmlns:pic="http://schemas.openxmlformats.org/drawingml/2006/picture">
+                  <pic:nvPicPr>
+                    <pic:cNvPr id="0" name="Picture 16"/>
+                    <pic:cNvPicPr>
+                      <a:picLocks noChangeAspect="1" noChangeArrowheads="1"/>
+                    </pic:cNvPicPr>
+                  </pic:nvPicPr>
+                  <pic:blipFill>
+                    <a:blip r:embed="rId35">
+                      <a:extLst>
+                        <a:ext uri="{28A0092B-C50C-407E-A947-70E740481C1C}">
+                          <a14:useLocalDpi xmlns:a14="http://schemas.microsoft.com/office/drawing/2010/main" val="0"/>
+                        </a:ext>
+                      </a:extLst>
+                    </a:blip>
+                    <a:srcRect/>
+                    <a:stretch>
+                      <a:fillRect/>
+                    </a:stretch>
+                  </pic:blipFill>
+                  <pic:spPr bwMode="auto">
+                    <a:xfrm>
+                      <a:off x="0" y="0"/>
+                      <a:ext cx="3782060" cy="161925"/>
+                    </a:xfrm>
+                    <a:prstGeom prst="rect">
+                      <a:avLst/>
+                    </a:prstGeom>
+                    <a:noFill/>
+                  </pic:spPr>
+                </pic:pic>
+              </a:graphicData>
+            </a:graphic>
+          </wp:inline>
+        </w:drawing>
+      </w:r>
+    </w:p>
+    <w:p>
+      <w:pPr>
+        <w:jc w:val="center"/>
+      </w:pPr>
+      <w:r>
+        <w:rPr>
+          <w:noProof/>
+        </w:rPr>
+        <w:drawing>
+          <wp:inline distT="0" distB="0" distL="0" distR="0" wp14:anchorId="2C023C72">
+            <wp:extent cx="2848610" cy="171450"/>
+            <wp:effectExtent l="0" t="0" r="8890" b="0"/>
+            <wp:docPr id="29" name="Imagem 29"/>
+            <wp:cNvGraphicFramePr>
+              <a:graphicFrameLocks xmlns:a="http://schemas.openxmlformats.org/drawingml/2006/main" noChangeAspect="1"/>
+            </wp:cNvGraphicFramePr>
+            <a:graphic xmlns:a="http://schemas.openxmlformats.org/drawingml/2006/main">
+              <a:graphicData uri="http://schemas.openxmlformats.org/drawingml/2006/picture">
+                <pic:pic xmlns:pic="http://schemas.openxmlformats.org/drawingml/2006/picture">
+                  <pic:nvPicPr>
+                    <pic:cNvPr id="0" name="Picture 17"/>
+                    <pic:cNvPicPr>
+                      <a:picLocks noChangeAspect="1" noChangeArrowheads="1"/>
+                    </pic:cNvPicPr>
+                  </pic:nvPicPr>
+                  <pic:blipFill>
+                    <a:blip r:embed="rId36">
+                      <a:extLst>
+                        <a:ext uri="{28A0092B-C50C-407E-A947-70E740481C1C}">
+                          <a14:useLocalDpi xmlns:a14="http://schemas.microsoft.com/office/drawing/2010/main" val="0"/>
+                        </a:ext>
+                      </a:extLst>
+                    </a:blip>
+                    <a:srcRect/>
+                    <a:stretch>
+                      <a:fillRect/>
+                    </a:stretch>
+                  </pic:blipFill>
+                  <pic:spPr bwMode="auto">
+                    <a:xfrm>
+                      <a:off x="0" y="0"/>
+                      <a:ext cx="2848610" cy="171450"/>
+                    </a:xfrm>
+                    <a:prstGeom prst="rect">
+                      <a:avLst/>
+                    </a:prstGeom>
+                    <a:noFill/>
+                  </pic:spPr>
+                </pic:pic>
+              </a:graphicData>
+            </a:graphic>
+          </wp:inline>
+        </w:drawing>
+      </w:r>
+    </w:p>
+    <w:p>
+      <w:pPr>
+        <w:jc w:val="center"/>
+      </w:pPr>
+    </w:p>
+    <w:p>
+      <w:pPr>
+        <w:jc w:val="center"/>
+      </w:pPr>
+    </w:p>
+    <w:p>
+      <w:pPr>
+        <w:jc w:val="center"/>
+      </w:pPr>
+    </w:p>
+    <w:p>
+      <w:pPr>
+        <w:jc w:val="center"/>
+      </w:pPr>
+    </w:p>
+    <w:p>
+      <w:pPr>
+        <w:jc w:val="center"/>
+      </w:pPr>
+    </w:p>
+    <w:p>
+      <w:pPr>
+        <w:jc w:val="center"/>
+      </w:pPr>
+    </w:p>
+    <w:p>
+      <w:pPr>
+        <w:jc w:val="center"/>
+      </w:pPr>
+    </w:p>
+    <w:p>
+      <w:pPr>
+        <w:jc w:val="center"/>
+      </w:pPr>
+    </w:p>
+    <w:p>
+      <w:pPr>
+        <w:jc w:val="center"/>
+      </w:pPr>
+    </w:p>
+    <w:p>
+      <w:pPr>
+        <w:jc w:val="center"/>
+      </w:pPr>
+    </w:p>
+    <w:p>
+      <w:pPr>
+        <w:jc w:val="center"/>
+      </w:pPr>
+    </w:p>
+    <w:p>
+      <w:r>
+        <w:t xml:space="preserve">19-Criamos dois arquivos no projeto produtos.html e o produtos.css e ligamos o </w:t>
+      </w:r>
+      <w:proofErr w:type="spellStart"/>
+      <w:r>
+        <w:t>css</w:t>
+      </w:r>
+      <w:proofErr w:type="spellEnd"/>
+      <w:r>
+        <w:t xml:space="preserve"> no </w:t>
+      </w:r>
+      <w:proofErr w:type="gramStart"/>
+      <w:r>
+        <w:t>produtos.html .</w:t>
+      </w:r>
+      <w:proofErr w:type="gramEnd"/>
+    </w:p>
+    <w:p>
+      <w:pPr>
+        <w:jc w:val="center"/>
+      </w:pPr>
+      <w:r>
+        <w:rPr>
+          <w:noProof/>
+        </w:rPr>
+        <w:drawing>
+          <wp:inline distT="0" distB="0" distL="0" distR="0" wp14:anchorId="7760DDFB" wp14:editId="22258894">
+            <wp:extent cx="2305372" cy="1505160"/>
+            <wp:effectExtent l="0" t="0" r="0" b="0"/>
+            <wp:docPr id="30" name="Imagem 30"/>
+            <wp:cNvGraphicFramePr>
+              <a:graphicFrameLocks xmlns:a="http://schemas.openxmlformats.org/drawingml/2006/main" noChangeAspect="1"/>
+            </wp:cNvGraphicFramePr>
+            <a:graphic xmlns:a="http://schemas.openxmlformats.org/drawingml/2006/main">
+              <a:graphicData uri="http://schemas.openxmlformats.org/drawingml/2006/picture">
+                <pic:pic xmlns:pic="http://schemas.openxmlformats.org/drawingml/2006/picture">
+                  <pic:nvPicPr>
+                    <pic:cNvPr id="1" name=""/>
+                    <pic:cNvPicPr/>
+                  </pic:nvPicPr>
+                  <pic:blipFill>
+                    <a:blip r:embed="rId37"/>
+                    <a:stretch>
+                      <a:fillRect/>
+                    </a:stretch>
+                  </pic:blipFill>
+                  <pic:spPr>
+                    <a:xfrm>
+                      <a:off x="0" y="0"/>
+                      <a:ext cx="2305372" cy="1505160"/>
+                    </a:xfrm>
+                    <a:prstGeom prst="rect">
+                      <a:avLst/>
+                    </a:prstGeom>
+                  </pic:spPr>
+                </pic:pic>
+              </a:graphicData>
+            </a:graphic>
+          </wp:inline>
+        </w:drawing>
+      </w:r>
+    </w:p>
+    <w:p>
+      <w:pPr>
+        <w:jc w:val="center"/>
+      </w:pPr>
+      <w:r>
+        <w:rPr>
+          <w:noProof/>
+        </w:rPr>
+        <w:drawing>
+          <wp:inline distT="0" distB="0" distL="0" distR="0" wp14:anchorId="1B8FE6B3">
+            <wp:extent cx="5048885" cy="1200150"/>
+            <wp:effectExtent l="0" t="0" r="0" b="0"/>
+            <wp:docPr id="33" name="Imagem 33"/>
+            <wp:cNvGraphicFramePr>
+              <a:graphicFrameLocks xmlns:a="http://schemas.openxmlformats.org/drawingml/2006/main" noChangeAspect="1"/>
+            </wp:cNvGraphicFramePr>
+            <a:graphic xmlns:a="http://schemas.openxmlformats.org/drawingml/2006/main">
+              <a:graphicData uri="http://schemas.openxmlformats.org/drawingml/2006/picture">
+                <pic:pic xmlns:pic="http://schemas.openxmlformats.org/drawingml/2006/picture">
+                  <pic:nvPicPr>
+                    <pic:cNvPr id="0" name="Picture 3"/>
+                    <pic:cNvPicPr>
+                      <a:picLocks noChangeAspect="1" noChangeArrowheads="1"/>
+                    </pic:cNvPicPr>
+                  </pic:nvPicPr>
+                  <pic:blipFill>
+                    <a:blip r:embed="rId38">
+                      <a:extLst>
+                        <a:ext uri="{28A0092B-C50C-407E-A947-70E740481C1C}">
+                          <a14:useLocalDpi xmlns:a14="http://schemas.microsoft.com/office/drawing/2010/main" val="0"/>
+                        </a:ext>
+                      </a:extLst>
+                    </a:blip>
+                    <a:srcRect/>
+                    <a:stretch>
+                      <a:fillRect/>
+                    </a:stretch>
+                  </pic:blipFill>
+                  <pic:spPr bwMode="auto">
+                    <a:xfrm>
+                      <a:off x="0" y="0"/>
+                      <a:ext cx="5048885" cy="1200150"/>
+                    </a:xfrm>
+                    <a:prstGeom prst="rect">
+                      <a:avLst/>
+                    </a:prstGeom>
+                    <a:noFill/>
+                  </pic:spPr>
+                </pic:pic>
+              </a:graphicData>
+            </a:graphic>
+          </wp:inline>
+        </w:drawing>
+      </w:r>
+    </w:p>
+    <w:p>
+      <w:pPr>
+        <w:jc w:val="center"/>
+      </w:pPr>
+    </w:p>
+    <w:p>
+      <w:r>
+        <w:t xml:space="preserve">20- Na página do produto.html estruturamos colocando o header, </w:t>
+      </w:r>
+      <w:proofErr w:type="spellStart"/>
+      <w:r>
+        <w:t>main</w:t>
+      </w:r>
+      <w:proofErr w:type="spellEnd"/>
+      <w:r>
+        <w:t xml:space="preserve"> e </w:t>
+      </w:r>
+      <w:proofErr w:type="spellStart"/>
+      <w:r>
+        <w:t>footer</w:t>
+      </w:r>
+      <w:proofErr w:type="spellEnd"/>
+      <w:r>
+        <w:t xml:space="preserve"> dentro do header inserimos uma imagem que será o logo do site e criamos uma lista não ordenada para que mais tarde ela será o menu do nosso site. </w:t>
+      </w:r>
+    </w:p>
+    <w:p/>
+    <w:p>
+      <w:pPr>
+        <w:jc w:val="center"/>
+      </w:pPr>
+      <w:r>
+        <w:rPr>
+          <w:noProof/>
+        </w:rPr>
+        <w:drawing>
+          <wp:inline distT="0" distB="0" distL="0" distR="0" wp14:anchorId="67888379">
+            <wp:extent cx="3439160" cy="1343025"/>
+            <wp:effectExtent l="0" t="0" r="8890" b="9525"/>
+            <wp:docPr id="34" name="Imagem 34"/>
+            <wp:cNvGraphicFramePr>
+              <a:graphicFrameLocks xmlns:a="http://schemas.openxmlformats.org/drawingml/2006/main" noChangeAspect="1"/>
+            </wp:cNvGraphicFramePr>
+            <a:graphic xmlns:a="http://schemas.openxmlformats.org/drawingml/2006/main">
+              <a:graphicData uri="http://schemas.openxmlformats.org/drawingml/2006/picture">
+                <pic:pic xmlns:pic="http://schemas.openxmlformats.org/drawingml/2006/picture">
+                  <pic:nvPicPr>
+                    <pic:cNvPr id="0" name="Picture 4"/>
+                    <pic:cNvPicPr>
+                      <a:picLocks noChangeAspect="1" noChangeArrowheads="1"/>
+                    </pic:cNvPicPr>
+                  </pic:nvPicPr>
+                  <pic:blipFill>
+                    <a:blip r:embed="rId39">
+                      <a:extLst>
+                        <a:ext uri="{28A0092B-C50C-407E-A947-70E740481C1C}">
+                          <a14:useLocalDpi xmlns:a14="http://schemas.microsoft.com/office/drawing/2010/main" val="0"/>
+                        </a:ext>
+                      </a:extLst>
+                    </a:blip>
+                    <a:srcRect/>
+                    <a:stretch>
+                      <a:fillRect/>
+                    </a:stretch>
+                  </pic:blipFill>
+                  <pic:spPr bwMode="auto">
+                    <a:xfrm>
+                      <a:off x="0" y="0"/>
+                      <a:ext cx="3439160" cy="1343025"/>
+                    </a:xfrm>
+                    <a:prstGeom prst="rect">
+                      <a:avLst/>
+                    </a:prstGeom>
+                    <a:noFill/>
+                  </pic:spPr>
+                </pic:pic>
+              </a:graphicData>
+            </a:graphic>
+          </wp:inline>
+        </w:drawing>
+      </w:r>
+    </w:p>
+    <w:p>
+      <w:r>
+        <w:t xml:space="preserve">21- No produto.css inserimos uma cor de fundo no header e no </w:t>
+      </w:r>
+      <w:proofErr w:type="spellStart"/>
+      <w:r>
+        <w:t>html</w:t>
+      </w:r>
+      <w:proofErr w:type="spellEnd"/>
+      <w:r>
+        <w:t xml:space="preserve"> adicionamos a </w:t>
+      </w:r>
+      <w:proofErr w:type="spellStart"/>
+      <w:r>
+        <w:t>tag</w:t>
+      </w:r>
+      <w:proofErr w:type="spellEnd"/>
+      <w:r>
+        <w:t xml:space="preserve">: </w:t>
+      </w:r>
+      <w:proofErr w:type="spellStart"/>
+      <w:r>
+        <w:t>nav</w:t>
+      </w:r>
+      <w:proofErr w:type="spellEnd"/>
+      <w:r>
+        <w:t xml:space="preserve"> que significa </w:t>
+      </w:r>
+      <w:proofErr w:type="gramStart"/>
+      <w:r>
+        <w:t>navegação ou seja</w:t>
+      </w:r>
+      <w:proofErr w:type="gramEnd"/>
+      <w:r>
+        <w:t xml:space="preserve"> nossa lista se tornar um menu para navegar entre páginas</w:t>
+      </w:r>
+    </w:p>
+    <w:p>
+      <w:pPr>
+        <w:jc w:val="center"/>
+      </w:pPr>
+      <w:r>
+        <w:rPr>
+          <w:noProof/>
+        </w:rPr>
+        <w:drawing>
+          <wp:inline distT="0" distB="0" distL="0" distR="0" wp14:anchorId="6D6BDD60" wp14:editId="16429700">
+            <wp:extent cx="2314898" cy="543001"/>
+            <wp:effectExtent l="0" t="0" r="0" b="9525"/>
+            <wp:docPr id="35" name="Imagem 35"/>
+            <wp:cNvGraphicFramePr>
+              <a:graphicFrameLocks xmlns:a="http://schemas.openxmlformats.org/drawingml/2006/main" noChangeAspect="1"/>
+            </wp:cNvGraphicFramePr>
+            <a:graphic xmlns:a="http://schemas.openxmlformats.org/drawingml/2006/main">
+              <a:graphicData uri="http://schemas.openxmlformats.org/drawingml/2006/picture">
+                <pic:pic xmlns:pic="http://schemas.openxmlformats.org/drawingml/2006/picture">
+                  <pic:nvPicPr>
+                    <pic:cNvPr id="1" name=""/>
+                    <pic:cNvPicPr/>
+                  </pic:nvPicPr>
+                  <pic:blipFill>
+                    <a:blip r:embed="rId40"/>
+                    <a:stretch>
+                      <a:fillRect/>
+                    </a:stretch>
+                  </pic:blipFill>
+                  <pic:spPr>
+                    <a:xfrm>
+                      <a:off x="0" y="0"/>
+                      <a:ext cx="2314898" cy="543001"/>
+                    </a:xfrm>
+                    <a:prstGeom prst="rect">
+                      <a:avLst/>
+                    </a:prstGeom>
+                  </pic:spPr>
+                </pic:pic>
+              </a:graphicData>
+            </a:graphic>
+          </wp:inline>
+        </w:drawing>
+      </w:r>
+    </w:p>
+    <w:p>
+      <w:pPr>
+        <w:jc w:val="center"/>
+      </w:pPr>
+      <w:r>
+        <w:rPr>
+          <w:noProof/>
+        </w:rPr>
+        <w:drawing>
+          <wp:inline distT="0" distB="0" distL="0" distR="0" wp14:anchorId="53242606">
+            <wp:extent cx="3438525" cy="1341120"/>
+            <wp:effectExtent l="0" t="0" r="9525" b="0"/>
+            <wp:docPr id="40" name="Imagem 40"/>
+            <wp:cNvGraphicFramePr>
+              <a:graphicFrameLocks xmlns:a="http://schemas.openxmlformats.org/drawingml/2006/main" noChangeAspect="1"/>
+            </wp:cNvGraphicFramePr>
+            <a:graphic xmlns:a="http://schemas.openxmlformats.org/drawingml/2006/main">
+              <a:graphicData uri="http://schemas.openxmlformats.org/drawingml/2006/picture">
+                <pic:pic xmlns:pic="http://schemas.openxmlformats.org/drawingml/2006/picture">
+                  <pic:nvPicPr>
+                    <pic:cNvPr id="0" name="Picture 9"/>
+                    <pic:cNvPicPr>
+                      <a:picLocks noChangeAspect="1" noChangeArrowheads="1"/>
+                    </pic:cNvPicPr>
+                  </pic:nvPicPr>
+                  <pic:blipFill>
+                    <a:blip r:embed="rId41">
+                      <a:extLst>
+                        <a:ext uri="{28A0092B-C50C-407E-A947-70E740481C1C}">
+                          <a14:useLocalDpi xmlns:a14="http://schemas.microsoft.com/office/drawing/2010/main" val="0"/>
+                        </a:ext>
+                      </a:extLst>
+                    </a:blip>
+                    <a:srcRect/>
+                    <a:stretch>
+                      <a:fillRect/>
+                    </a:stretch>
+                  </pic:blipFill>
+                  <pic:spPr bwMode="auto">
+                    <a:xfrm>
+                      <a:off x="0" y="0"/>
+                      <a:ext cx="3438525" cy="1341120"/>
+                    </a:xfrm>
+                    <a:prstGeom prst="rect">
+                      <a:avLst/>
+                    </a:prstGeom>
+                    <a:noFill/>
+                  </pic:spPr>
+                </pic:pic>
+              </a:graphicData>
+            </a:graphic>
+          </wp:inline>
+        </w:drawing>
+      </w:r>
+    </w:p>
+    <w:p>
+      <w:pPr>
+        <w:jc w:val="center"/>
+      </w:pPr>
+    </w:p>
+    <w:p>
+      <w:pPr>
+        <w:jc w:val="center"/>
+      </w:pPr>
+    </w:p>
+    <w:p>
+      <w:pPr>
+        <w:jc w:val="center"/>
+      </w:pPr>
+    </w:p>
+    <w:p>
+      <w:pPr>
+        <w:jc w:val="center"/>
+      </w:pPr>
+    </w:p>
+    <w:p>
+      <w:pPr>
+        <w:jc w:val="center"/>
+      </w:pPr>
+    </w:p>
+    <w:p>
+      <w:pPr>
+        <w:jc w:val="center"/>
+      </w:pPr>
+    </w:p>
+    <w:p>
+      <w:r>
+        <w:t xml:space="preserve">22-Na lista ordenada incluímos uma ancora a </w:t>
+      </w:r>
+      <w:proofErr w:type="spellStart"/>
+      <w:r>
+        <w:t>tag</w:t>
+      </w:r>
+      <w:proofErr w:type="spellEnd"/>
+      <w:r>
+        <w:t xml:space="preserve"> a para </w:t>
+      </w:r>
+      <w:proofErr w:type="spellStart"/>
+      <w:r>
+        <w:t>vriar</w:t>
+      </w:r>
+      <w:proofErr w:type="spellEnd"/>
+      <w:r>
+        <w:t xml:space="preserve"> os links entre aas paginas conforme </w:t>
+      </w:r>
+      <w:proofErr w:type="gramStart"/>
+      <w:r>
+        <w:t>imagem .</w:t>
+      </w:r>
+      <w:proofErr w:type="gramEnd"/>
+    </w:p>
+    <w:p/>
+    <w:p>
+      <w:pPr>
+        <w:jc w:val="center"/>
+      </w:pPr>
+      <w:r>
+        <w:rPr>
+          <w:noProof/>
+        </w:rPr>
+        <w:drawing>
+          <wp:inline distT="0" distB="0" distL="0" distR="0" wp14:anchorId="2E92237F">
+            <wp:extent cx="3486785" cy="1724025"/>
+            <wp:effectExtent l="0" t="0" r="0" b="9525"/>
+            <wp:docPr id="37" name="Imagem 37"/>
+            <wp:cNvGraphicFramePr>
+              <a:graphicFrameLocks xmlns:a="http://schemas.openxmlformats.org/drawingml/2006/main" noChangeAspect="1"/>
+            </wp:cNvGraphicFramePr>
+            <a:graphic xmlns:a="http://schemas.openxmlformats.org/drawingml/2006/main">
+              <a:graphicData uri="http://schemas.openxmlformats.org/drawingml/2006/picture">
+                <pic:pic xmlns:pic="http://schemas.openxmlformats.org/drawingml/2006/picture">
+                  <pic:nvPicPr>
+                    <pic:cNvPr id="0" name="Picture 6"/>
+                    <pic:cNvPicPr>
+                      <a:picLocks noChangeAspect="1" noChangeArrowheads="1"/>
+                    </pic:cNvPicPr>
+                  </pic:nvPicPr>
+                  <pic:blipFill>
+                    <a:blip r:embed="rId42">
+                      <a:extLst>
+                        <a:ext uri="{28A0092B-C50C-407E-A947-70E740481C1C}">
+                          <a14:useLocalDpi xmlns:a14="http://schemas.microsoft.com/office/drawing/2010/main" val="0"/>
+                        </a:ext>
+                      </a:extLst>
+                    </a:blip>
+                    <a:srcRect/>
+                    <a:stretch>
+                      <a:fillRect/>
+                    </a:stretch>
+                  </pic:blipFill>
+                  <pic:spPr bwMode="auto">
+                    <a:xfrm>
+                      <a:off x="0" y="0"/>
+                      <a:ext cx="3486785" cy="1724025"/>
+                    </a:xfrm>
+                    <a:prstGeom prst="rect">
+                      <a:avLst/>
+                    </a:prstGeom>
+                    <a:noFill/>
+                  </pic:spPr>
+                </pic:pic>
+              </a:graphicData>
+            </a:graphic>
+          </wp:inline>
+        </w:drawing>
+      </w:r>
+    </w:p>
+    <w:p>
+      <w:pPr>
+        <w:jc w:val="center"/>
+      </w:pPr>
+    </w:p>
+    <w:p>
+      <w:r>
+        <w:t xml:space="preserve">23-Para colocar a nossa lista os itens um do lado do outro para que assim </w:t>
+      </w:r>
+      <w:r>
+        <w:t xml:space="preserve">possamos </w:t>
+      </w:r>
+      <w:proofErr w:type="gramStart"/>
+      <w:r>
+        <w:t>ter  um</w:t>
+      </w:r>
+      <w:proofErr w:type="gramEnd"/>
+      <w:r>
+        <w:t xml:space="preserve"> menu horizontal utilizamos o </w:t>
+      </w:r>
+      <w:proofErr w:type="spellStart"/>
+      <w:r>
+        <w:t>css</w:t>
+      </w:r>
+      <w:proofErr w:type="spellEnd"/>
+      <w:r>
+        <w:t xml:space="preserve"> por </w:t>
+      </w:r>
+      <w:proofErr w:type="spellStart"/>
+      <w:r>
+        <w:t>referencia</w:t>
+      </w:r>
+      <w:proofErr w:type="spellEnd"/>
+      <w:r>
+        <w:t xml:space="preserve"> ou seja no nosso site a onde tive </w:t>
+      </w:r>
+      <w:proofErr w:type="spellStart"/>
+      <w:r>
+        <w:t>nav</w:t>
+      </w:r>
+      <w:proofErr w:type="spellEnd"/>
+      <w:r>
+        <w:t xml:space="preserve"> e li deixar a natureza (display) de forma </w:t>
+      </w:r>
+      <w:proofErr w:type="spellStart"/>
+      <w:r>
+        <w:t>inline</w:t>
+      </w:r>
+      <w:proofErr w:type="spellEnd"/>
+      <w:r>
+        <w:t xml:space="preserve"> em linha .</w:t>
+      </w:r>
+    </w:p>
+    <w:p>
+      <w:pPr>
+        <w:jc w:val="center"/>
+      </w:pPr>
+      <w:r>
+        <w:rPr>
+          <w:noProof/>
+        </w:rPr>
+        <w:drawing>
+          <wp:inline distT="0" distB="0" distL="0" distR="0" wp14:anchorId="4801166D">
+            <wp:extent cx="2685738" cy="762000"/>
+            <wp:effectExtent l="0" t="0" r="635" b="0"/>
+            <wp:docPr id="38" name="Imagem 38"/>
+            <wp:cNvGraphicFramePr>
+              <a:graphicFrameLocks xmlns:a="http://schemas.openxmlformats.org/drawingml/2006/main" noChangeAspect="1"/>
+            </wp:cNvGraphicFramePr>
+            <a:graphic xmlns:a="http://schemas.openxmlformats.org/drawingml/2006/main">
+              <a:graphicData uri="http://schemas.openxmlformats.org/drawingml/2006/picture">
+                <pic:pic xmlns:pic="http://schemas.openxmlformats.org/drawingml/2006/picture">
+                  <pic:nvPicPr>
+                    <pic:cNvPr id="0" name="Picture 7"/>
+                    <pic:cNvPicPr>
+                      <a:picLocks noChangeAspect="1" noChangeArrowheads="1"/>
+                    </pic:cNvPicPr>
+                  </pic:nvPicPr>
+                  <pic:blipFill>
+                    <a:blip r:embed="rId43">
+                      <a:extLst>
+                        <a:ext uri="{28A0092B-C50C-407E-A947-70E740481C1C}">
+                          <a14:useLocalDpi xmlns:a14="http://schemas.microsoft.com/office/drawing/2010/main" val="0"/>
+                        </a:ext>
+                      </a:extLst>
+                    </a:blip>
+                    <a:srcRect/>
+                    <a:stretch>
+                      <a:fillRect/>
+                    </a:stretch>
+                  </pic:blipFill>
+                  <pic:spPr bwMode="auto">
+                    <a:xfrm>
+                      <a:off x="0" y="0"/>
+                      <a:ext cx="2693237" cy="764128"/>
+                    </a:xfrm>
+                    <a:prstGeom prst="rect">
+                      <a:avLst/>
+                    </a:prstGeom>
+                    <a:noFill/>
+                  </pic:spPr>
+                </pic:pic>
+              </a:graphicData>
+            </a:graphic>
+          </wp:inline>
+        </w:drawing>
+      </w:r>
+      <w:r>
+        <w:t xml:space="preserve">         </w:t>
+      </w:r>
+      <w:r>
+        <w:rPr>
+          <w:noProof/>
+        </w:rPr>
+        <w:drawing>
+          <wp:inline distT="0" distB="0" distL="0" distR="0" wp14:anchorId="3C2CE2AB">
+            <wp:extent cx="2181225" cy="2820035"/>
+            <wp:effectExtent l="0" t="0" r="9525" b="0"/>
+            <wp:docPr id="39" name="Imagem 39"/>
+            <wp:cNvGraphicFramePr>
+              <a:graphicFrameLocks xmlns:a="http://schemas.openxmlformats.org/drawingml/2006/main" noChangeAspect="1"/>
+            </wp:cNvGraphicFramePr>
+            <a:graphic xmlns:a="http://schemas.openxmlformats.org/drawingml/2006/main">
+              <a:graphicData uri="http://schemas.openxmlformats.org/drawingml/2006/picture">
+                <pic:pic xmlns:pic="http://schemas.openxmlformats.org/drawingml/2006/picture">
+                  <pic:nvPicPr>
+                    <pic:cNvPr id="0" name="Picture 8"/>
+                    <pic:cNvPicPr>
+                      <a:picLocks noChangeAspect="1" noChangeArrowheads="1"/>
+                    </pic:cNvPicPr>
+                  </pic:nvPicPr>
+                  <pic:blipFill>
+                    <a:blip r:embed="rId44">
+                      <a:extLst>
+                        <a:ext uri="{28A0092B-C50C-407E-A947-70E740481C1C}">
+                          <a14:useLocalDpi xmlns:a14="http://schemas.microsoft.com/office/drawing/2010/main" val="0"/>
+                        </a:ext>
+                      </a:extLst>
+                    </a:blip>
+                    <a:srcRect/>
+                    <a:stretch>
+                      <a:fillRect/>
+                    </a:stretch>
+                  </pic:blipFill>
+                  <pic:spPr bwMode="auto">
+                    <a:xfrm>
+                      <a:off x="0" y="0"/>
+                      <a:ext cx="2181225" cy="2820035"/>
+                    </a:xfrm>
+                    <a:prstGeom prst="rect">
+                      <a:avLst/>
+                    </a:prstGeom>
+                    <a:noFill/>
+                  </pic:spPr>
+                </pic:pic>
+              </a:graphicData>
+            </a:graphic>
+          </wp:inline>
+        </w:drawing>
+      </w:r>
+    </w:p>
+    <w:p>
+      <w:pPr>
+        <w:jc w:val="center"/>
+      </w:pPr>
+    </w:p>
+    <w:p>
+      <w:pPr>
+        <w:jc w:val="center"/>
+      </w:pPr>
+    </w:p>
+    <w:p>
+      <w:r>
+        <w:t>24-</w:t>
+      </w:r>
+      <w:r>
+        <w:t>Adicionamos</w:t>
+      </w:r>
+      <w:r>
+        <w:t xml:space="preserve"> a nossa lista o </w:t>
+      </w:r>
+      <w:proofErr w:type="spellStart"/>
+      <w:r>
+        <w:t>uppercase</w:t>
+      </w:r>
+      <w:proofErr w:type="spellEnd"/>
+      <w:r>
+        <w:t xml:space="preserve"> para todo o texto fique em letras </w:t>
+      </w:r>
+      <w:proofErr w:type="gramStart"/>
+      <w:r>
+        <w:t>maiúsculas  e</w:t>
+      </w:r>
+      <w:proofErr w:type="gramEnd"/>
+      <w:r>
+        <w:t xml:space="preserve"> utilizamos a </w:t>
+      </w:r>
+      <w:proofErr w:type="spellStart"/>
+      <w:r>
+        <w:t>referencia</w:t>
+      </w:r>
+      <w:proofErr w:type="spellEnd"/>
+      <w:r>
+        <w:t xml:space="preserve"> do </w:t>
+      </w:r>
+      <w:proofErr w:type="spellStart"/>
+      <w:r>
+        <w:t>nav</w:t>
+      </w:r>
+      <w:proofErr w:type="spellEnd"/>
+      <w:r>
+        <w:t xml:space="preserve"> a que os textos dos nossos links e definimos que a cor seria preta do texto.</w:t>
+      </w:r>
+    </w:p>
+    <w:p>
+      <w:pPr>
+        <w:jc w:val="center"/>
+      </w:pPr>
+      <w:r>
+        <w:rPr>
+          <w:noProof/>
+        </w:rPr>
+        <w:drawing>
+          <wp:inline distT="0" distB="0" distL="0" distR="0" wp14:anchorId="48F7AB11" wp14:editId="7263B1C7">
+            <wp:extent cx="3201827" cy="771525"/>
+            <wp:effectExtent l="0" t="0" r="0" b="0"/>
+            <wp:docPr id="41" name="Imagem 41"/>
+            <wp:cNvGraphicFramePr>
+              <a:graphicFrameLocks xmlns:a="http://schemas.openxmlformats.org/drawingml/2006/main" noChangeAspect="1"/>
+            </wp:cNvGraphicFramePr>
+            <a:graphic xmlns:a="http://schemas.openxmlformats.org/drawingml/2006/main">
+              <a:graphicData uri="http://schemas.openxmlformats.org/drawingml/2006/picture">
+                <pic:pic xmlns:pic="http://schemas.openxmlformats.org/drawingml/2006/picture">
+                  <pic:nvPicPr>
+                    <pic:cNvPr id="1" name=""/>
+                    <pic:cNvPicPr/>
+                  </pic:nvPicPr>
+                  <pic:blipFill>
+                    <a:blip r:embed="rId45"/>
+                    <a:stretch>
+                      <a:fillRect/>
+                    </a:stretch>
+                  </pic:blipFill>
+                  <pic:spPr>
+                    <a:xfrm>
+                      <a:off x="0" y="0"/>
+                      <a:ext cx="3211966" cy="773968"/>
+                    </a:xfrm>
+                    <a:prstGeom prst="rect">
+                      <a:avLst/>
+                    </a:prstGeom>
+                  </pic:spPr>
+                </pic:pic>
+              </a:graphicData>
+            </a:graphic>
+          </wp:inline>
+        </w:drawing>
+      </w:r>
+    </w:p>
+    <w:p/>
+    <w:p>
+      <w:pPr>
+        <w:jc w:val="center"/>
+      </w:pPr>
+    </w:p>
+    <w:p>
+      <w:r>
+        <w:t>25-</w:t>
+      </w:r>
+      <w:r>
+        <w:t xml:space="preserve">Ainda trabalhando com o </w:t>
+      </w:r>
+      <w:proofErr w:type="spellStart"/>
+      <w:r>
+        <w:t>nav</w:t>
+      </w:r>
+      <w:proofErr w:type="spellEnd"/>
+      <w:r>
+        <w:t xml:space="preserve"> a inserirmos os seguintes comandos:</w:t>
+      </w:r>
+    </w:p>
+    <w:p>
+      <w:pPr>
+        <w:pStyle w:val="PargrafodaLista"/>
+        <w:numPr>
+          <w:ilvl w:val="0"/>
+          <w:numId w:val="1"/>
+        </w:numPr>
+      </w:pPr>
+      <w:r>
+        <w:t>Deixamos o texto mais encorpado.</w:t>
+      </w:r>
+    </w:p>
+    <w:p>
+      <w:pPr>
+        <w:pStyle w:val="PargrafodaLista"/>
+        <w:numPr>
+          <w:ilvl w:val="0"/>
+          <w:numId w:val="1"/>
+        </w:numPr>
+      </w:pPr>
+      <w:r>
+        <w:t xml:space="preserve">Aumentamos o tamanho da fonte. </w:t>
+      </w:r>
+    </w:p>
+    <w:p>
+      <w:pPr>
+        <w:pStyle w:val="PargrafodaLista"/>
+        <w:numPr>
+          <w:ilvl w:val="0"/>
+          <w:numId w:val="1"/>
+        </w:numPr>
+      </w:pPr>
+      <w:r>
+        <w:t>Tiramos a linha que sublinhava o texto.</w:t>
+      </w:r>
+    </w:p>
+    <w:p/>
+    <w:p>
+      <w:pPr>
+        <w:pStyle w:val="PargrafodaLista"/>
+        <w:jc w:val="center"/>
+      </w:pPr>
+      <w:r>
+        <w:rPr>
+          <w:noProof/>
+        </w:rPr>
+        <w:drawing>
+          <wp:inline distT="0" distB="0" distL="0" distR="0" wp14:anchorId="6126E30B">
+            <wp:extent cx="2524125" cy="1514475"/>
+            <wp:effectExtent l="0" t="0" r="9525" b="9525"/>
+            <wp:docPr id="42" name="Imagem 42"/>
+            <wp:cNvGraphicFramePr>
+              <a:graphicFrameLocks xmlns:a="http://schemas.openxmlformats.org/drawingml/2006/main" noChangeAspect="1"/>
+            </wp:cNvGraphicFramePr>
+            <a:graphic xmlns:a="http://schemas.openxmlformats.org/drawingml/2006/main">
+              <a:graphicData uri="http://schemas.openxmlformats.org/drawingml/2006/picture">
+                <pic:pic xmlns:pic="http://schemas.openxmlformats.org/drawingml/2006/picture">
+                  <pic:nvPicPr>
+                    <pic:cNvPr id="0" name="Picture 10"/>
+                    <pic:cNvPicPr>
+                      <a:picLocks noChangeAspect="1" noChangeArrowheads="1"/>
+                    </pic:cNvPicPr>
+                  </pic:nvPicPr>
+                  <pic:blipFill>
+                    <a:blip r:embed="rId46">
+                      <a:extLst>
+                        <a:ext uri="{28A0092B-C50C-407E-A947-70E740481C1C}">
+                          <a14:useLocalDpi xmlns:a14="http://schemas.microsoft.com/office/drawing/2010/main" val="0"/>
+                        </a:ext>
+                      </a:extLst>
+                    </a:blip>
+                    <a:srcRect/>
+                    <a:stretch>
+                      <a:fillRect/>
+                    </a:stretch>
+                  </pic:blipFill>
+                  <pic:spPr bwMode="auto">
+                    <a:xfrm>
+                      <a:off x="0" y="0"/>
+                      <a:ext cx="2524125" cy="1514475"/>
+                    </a:xfrm>
+                    <a:prstGeom prst="rect">
+                      <a:avLst/>
+                    </a:prstGeom>
+                    <a:noFill/>
+                  </pic:spPr>
+                </pic:pic>
+              </a:graphicData>
+            </a:graphic>
+          </wp:inline>
+        </w:drawing>
+      </w:r>
+    </w:p>
+    <w:p>
+      <w:pPr>
+        <w:pStyle w:val="PargrafodaLista"/>
+        <w:jc w:val="center"/>
+      </w:pPr>
+    </w:p>
+    <w:p>
+      <w:pPr>
+        <w:pStyle w:val="PargrafodaLista"/>
+        <w:jc w:val="center"/>
+      </w:pPr>
+    </w:p>
+    <w:p>
+      <w:pPr>
+        <w:pStyle w:val="PargrafodaLista"/>
+        <w:jc w:val="center"/>
+      </w:pPr>
+    </w:p>
+    <w:p>
+      <w:pPr>
+        <w:pStyle w:val="PargrafodaLista"/>
+        <w:jc w:val="center"/>
+      </w:pPr>
+    </w:p>
+    <w:p>
+      <w:pPr>
+        <w:pStyle w:val="PargrafodaLista"/>
+        <w:jc w:val="center"/>
+      </w:pPr>
+    </w:p>
+    <w:p>
+      <w:pPr>
+        <w:pStyle w:val="PargrafodaLista"/>
+        <w:jc w:val="center"/>
+      </w:pPr>
+    </w:p>
+    <w:p>
+      <w:pPr>
+        <w:pStyle w:val="PargrafodaLista"/>
+        <w:jc w:val="center"/>
+      </w:pPr>
+    </w:p>
+    <w:p>
+      <w:pPr>
+        <w:pStyle w:val="PargrafodaLista"/>
+        <w:jc w:val="center"/>
+      </w:pPr>
+    </w:p>
+    <w:p>
+      <w:pPr>
+        <w:pStyle w:val="PargrafodaLista"/>
+        <w:jc w:val="center"/>
+      </w:pPr>
+    </w:p>
+    <w:p>
+      <w:pPr>
+        <w:pStyle w:val="PargrafodaLista"/>
+        <w:jc w:val="center"/>
+      </w:pPr>
+    </w:p>
+    <w:p>
+      <w:pPr>
+        <w:pStyle w:val="PargrafodaLista"/>
+        <w:jc w:val="center"/>
+      </w:pPr>
+    </w:p>
+    <w:p>
+      <w:pPr>
+        <w:pStyle w:val="PargrafodaLista"/>
+        <w:jc w:val="center"/>
+      </w:pPr>
+    </w:p>
+    <w:p>
+      <w:pPr>
+        <w:pStyle w:val="PargrafodaLista"/>
+        <w:jc w:val="center"/>
+      </w:pPr>
+    </w:p>
+    <w:p>
+      <w:pPr>
+        <w:pStyle w:val="PargrafodaLista"/>
+        <w:jc w:val="center"/>
+      </w:pPr>
+    </w:p>
+    <w:p>
+      <w:pPr>
+        <w:pStyle w:val="PargrafodaLista"/>
+        <w:jc w:val="center"/>
+      </w:pPr>
+    </w:p>
+    <w:p>
+      <w:pPr>
+        <w:pStyle w:val="PargrafodaLista"/>
+        <w:jc w:val="center"/>
+      </w:pPr>
+    </w:p>
+    <w:p>
+      <w:pPr>
+        <w:pStyle w:val="PargrafodaLista"/>
+        <w:jc w:val="center"/>
+      </w:pPr>
+    </w:p>
+    <w:p>
+      <w:pPr>
+        <w:pStyle w:val="PargrafodaLista"/>
+        <w:jc w:val="center"/>
+      </w:pPr>
+    </w:p>
+    <w:p>
+      <w:pPr>
+        <w:pStyle w:val="PargrafodaLista"/>
+        <w:jc w:val="center"/>
+      </w:pPr>
+    </w:p>
+    <w:p>
+      <w:pPr>
+        <w:pStyle w:val="PargrafodaLista"/>
+        <w:jc w:val="center"/>
+      </w:pPr>
+    </w:p>
+    <w:p>
+      <w:pPr>
+        <w:pStyle w:val="PargrafodaLista"/>
+        <w:jc w:val="center"/>
+      </w:pPr>
+    </w:p>
+    <w:p>
+      <w:pPr>
+        <w:pStyle w:val="PargrafodaLista"/>
+      </w:pPr>
+      <w:r>
+        <w:t>26-Para melhorar o espaço entre os itens do menu utilizamos o código:</w:t>
+      </w:r>
+    </w:p>
+    <w:p>
+      <w:pPr>
+        <w:pStyle w:val="PargrafodaLista"/>
+      </w:pPr>
+    </w:p>
+    <w:p>
+      <w:pPr>
+        <w:pStyle w:val="PargrafodaLista"/>
+        <w:jc w:val="center"/>
+      </w:pPr>
+      <w:r>
+        <w:rPr>
+          <w:noProof/>
+        </w:rPr>
+        <w:drawing>
+          <wp:inline distT="0" distB="0" distL="0" distR="0" wp14:anchorId="184FA5F6">
+            <wp:extent cx="1743075" cy="638175"/>
+            <wp:effectExtent l="0" t="0" r="9525" b="9525"/>
+            <wp:docPr id="43" name="Imagem 43"/>
+            <wp:cNvGraphicFramePr>
+              <a:graphicFrameLocks xmlns:a="http://schemas.openxmlformats.org/drawingml/2006/main" noChangeAspect="1"/>
+            </wp:cNvGraphicFramePr>
+            <a:graphic xmlns:a="http://schemas.openxmlformats.org/drawingml/2006/main">
+              <a:graphicData uri="http://schemas.openxmlformats.org/drawingml/2006/picture">
+                <pic:pic xmlns:pic="http://schemas.openxmlformats.org/drawingml/2006/picture">
+                  <pic:nvPicPr>
+                    <pic:cNvPr id="0" name="Picture 11"/>
+                    <pic:cNvPicPr>
+                      <a:picLocks noChangeAspect="1" noChangeArrowheads="1"/>
+                    </pic:cNvPicPr>
+                  </pic:nvPicPr>
+                  <pic:blipFill>
+                    <a:blip r:embed="rId47">
+                      <a:extLst>
+                        <a:ext uri="{28A0092B-C50C-407E-A947-70E740481C1C}">
+                          <a14:useLocalDpi xmlns:a14="http://schemas.microsoft.com/office/drawing/2010/main" val="0"/>
+                        </a:ext>
+                      </a:extLst>
+                    </a:blip>
+                    <a:srcRect/>
+                    <a:stretch>
+                      <a:fillRect/>
+                    </a:stretch>
+                  </pic:blipFill>
+                  <pic:spPr bwMode="auto">
+                    <a:xfrm>
+                      <a:off x="0" y="0"/>
+                      <a:ext cx="1743075" cy="638175"/>
+                    </a:xfrm>
+                    <a:prstGeom prst="rect">
+                      <a:avLst/>
+                    </a:prstGeom>
+                    <a:noFill/>
+                  </pic:spPr>
+                </pic:pic>
+              </a:graphicData>
+            </a:graphic>
+          </wp:inline>
+        </w:drawing>
+      </w:r>
+    </w:p>
+    <w:p>
+      <w:pPr>
+        <w:pStyle w:val="PargrafodaLista"/>
+        <w:jc w:val="center"/>
+      </w:pPr>
+    </w:p>
+    <w:p>
+      <w:pPr>
+        <w:pStyle w:val="PargrafodaLista"/>
+        <w:jc w:val="center"/>
+      </w:pPr>
+    </w:p>
+    <w:p>
+      <w:pPr>
+        <w:pStyle w:val="PargrafodaLista"/>
+        <w:jc w:val="center"/>
+      </w:pPr>
+      <w:r>
+        <w:rPr>
+          <w:noProof/>
+        </w:rPr>
+        <w:drawing>
+          <wp:inline distT="0" distB="0" distL="0" distR="0" wp14:anchorId="08288C2D">
+            <wp:extent cx="4544060" cy="2905760"/>
+            <wp:effectExtent l="0" t="0" r="8890" b="8890"/>
+            <wp:docPr id="45" name="Imagem 45"/>
+            <wp:cNvGraphicFramePr>
+              <a:graphicFrameLocks xmlns:a="http://schemas.openxmlformats.org/drawingml/2006/main" noChangeAspect="1"/>
+            </wp:cNvGraphicFramePr>
+            <a:graphic xmlns:a="http://schemas.openxmlformats.org/drawingml/2006/main">
+              <a:graphicData uri="http://schemas.openxmlformats.org/drawingml/2006/picture">
+                <pic:pic xmlns:pic="http://schemas.openxmlformats.org/drawingml/2006/picture">
+                  <pic:nvPicPr>
+                    <pic:cNvPr id="0" name="Picture 13"/>
+                    <pic:cNvPicPr>
+                      <a:picLocks noChangeAspect="1" noChangeArrowheads="1"/>
+                    </pic:cNvPicPr>
+                  </pic:nvPicPr>
+                  <pic:blipFill>
+                    <a:blip r:embed="rId48">
+                      <a:extLst>
+                        <a:ext uri="{28A0092B-C50C-407E-A947-70E740481C1C}">
+                          <a14:useLocalDpi xmlns:a14="http://schemas.microsoft.com/office/drawing/2010/main" val="0"/>
+                        </a:ext>
+                      </a:extLst>
+                    </a:blip>
+                    <a:srcRect/>
+                    <a:stretch>
+                      <a:fillRect/>
+                    </a:stretch>
+                  </pic:blipFill>
+                  <pic:spPr bwMode="auto">
+                    <a:xfrm>
+                      <a:off x="0" y="0"/>
+                      <a:ext cx="4544060" cy="2905760"/>
+                    </a:xfrm>
+                    <a:prstGeom prst="rect">
+                      <a:avLst/>
+                    </a:prstGeom>
+                    <a:noFill/>
+                  </pic:spPr>
+                </pic:pic>
+              </a:graphicData>
+            </a:graphic>
+          </wp:inline>
+        </w:drawing>
+      </w:r>
+    </w:p>
+    <w:p>
+      <w:pPr>
+        <w:pStyle w:val="PargrafodaLista"/>
+        <w:jc w:val="center"/>
+      </w:pPr>
+    </w:p>
+    <w:p>
+      <w:pPr>
+        <w:pStyle w:val="PargrafodaLista"/>
+      </w:pPr>
+      <w:r>
+        <w:t xml:space="preserve">27-Para resetar o </w:t>
+      </w:r>
+      <w:proofErr w:type="spellStart"/>
+      <w:r>
+        <w:t>css</w:t>
+      </w:r>
+      <w:proofErr w:type="spellEnd"/>
+      <w:r>
+        <w:t xml:space="preserve"> do navegador utilizamos o reset.css onde tiramos do </w:t>
+      </w:r>
+      <w:proofErr w:type="gramStart"/>
+      <w:r>
+        <w:t>seguintes site</w:t>
+      </w:r>
+      <w:proofErr w:type="gramEnd"/>
+      <w:r>
+        <w:t>:</w:t>
+      </w:r>
+    </w:p>
+    <w:p>
+      <w:pPr>
+        <w:pStyle w:val="PargrafodaLista"/>
+      </w:pPr>
+      <w:hyperlink r:id="rId49" w:history="1">
+        <w:r>
+          <w:rPr>
+            <w:rStyle w:val="Hyperlink"/>
+          </w:rPr>
+          <w:t>https://meyerweb.com/eric/tools/css/reset/</w:t>
+        </w:r>
+      </w:hyperlink>
+    </w:p>
+    <w:p>
+      <w:pPr>
+        <w:pStyle w:val="PargrafodaLista"/>
+      </w:pPr>
+    </w:p>
+    <w:p>
+      <w:pPr>
+        <w:pStyle w:val="PargrafodaLista"/>
+      </w:pPr>
+    </w:p>
+    <w:p>
+      <w:pPr>
+        <w:pStyle w:val="PargrafodaLista"/>
+      </w:pPr>
+    </w:p>
+    <w:p>
+      <w:pPr>
+        <w:pStyle w:val="PargrafodaLista"/>
+      </w:pPr>
+    </w:p>
+    <w:p>
+      <w:pPr>
+        <w:pStyle w:val="PargrafodaLista"/>
+      </w:pPr>
+    </w:p>
+    <w:p>
+      <w:pPr>
+        <w:pStyle w:val="PargrafodaLista"/>
+      </w:pPr>
+    </w:p>
+    <w:p>
+      <w:pPr>
+        <w:pStyle w:val="PargrafodaLista"/>
+      </w:pPr>
+    </w:p>
+    <w:p>
+      <w:pPr>
+        <w:pStyle w:val="PargrafodaLista"/>
+      </w:pPr>
+    </w:p>
+    <w:p>
+      <w:pPr>
+        <w:pStyle w:val="PargrafodaLista"/>
+      </w:pPr>
+    </w:p>
+    <w:p>
+      <w:pPr>
+        <w:pStyle w:val="PargrafodaLista"/>
+      </w:pPr>
+    </w:p>
+    <w:p>
+      <w:pPr>
+        <w:pStyle w:val="PargrafodaLista"/>
+      </w:pPr>
+    </w:p>
+    <w:p>
+      <w:pPr>
+        <w:pStyle w:val="PargrafodaLista"/>
+      </w:pPr>
+    </w:p>
+    <w:p>
+      <w:pPr>
+        <w:pStyle w:val="PargrafodaLista"/>
+      </w:pPr>
+    </w:p>
+    <w:p>
+      <w:pPr>
+        <w:pStyle w:val="PargrafodaLista"/>
+      </w:pPr>
+    </w:p>
+    <w:p>
+      <w:pPr>
+        <w:pStyle w:val="PargrafodaLista"/>
+      </w:pPr>
+    </w:p>
+    <w:p>
+      <w:pPr>
+        <w:pStyle w:val="PargrafodaLista"/>
+      </w:pPr>
+    </w:p>
+    <w:p>
+      <w:pPr>
+        <w:pStyle w:val="PargrafodaLista"/>
+      </w:pPr>
+    </w:p>
+    <w:p>
+      <w:pPr>
+        <w:pStyle w:val="PargrafodaLista"/>
+      </w:pPr>
+    </w:p>
+    <w:p>
+      <w:pPr>
+        <w:pStyle w:val="PargrafodaLista"/>
+      </w:pPr>
+    </w:p>
+    <w:p>
+      <w:pPr>
+        <w:pStyle w:val="PargrafodaLista"/>
+      </w:pPr>
+    </w:p>
+    <w:p>
+      <w:pPr>
+        <w:pStyle w:val="PargrafodaLista"/>
+      </w:pPr>
+      <w:r>
+        <w:t xml:space="preserve">Criamos um arquivo chamado reset.css e adicionamos ao nosso site ele retirou todo </w:t>
+      </w:r>
+      <w:proofErr w:type="spellStart"/>
+      <w:r>
+        <w:t>css</w:t>
+      </w:r>
+      <w:proofErr w:type="spellEnd"/>
+      <w:r>
+        <w:t xml:space="preserve"> do navegador deixando apenas o nosso </w:t>
+      </w:r>
+      <w:proofErr w:type="spellStart"/>
+      <w:r>
+        <w:t>css</w:t>
+      </w:r>
+      <w:proofErr w:type="spellEnd"/>
+      <w:r>
+        <w:t xml:space="preserve"> </w:t>
+      </w:r>
+    </w:p>
+    <w:p>
+      <w:pPr>
+        <w:pStyle w:val="PargrafodaLista"/>
+      </w:pPr>
+    </w:p>
+    <w:p>
+      <w:pPr>
+        <w:pStyle w:val="PargrafodaLista"/>
+      </w:pPr>
+    </w:p>
+    <w:p>
+      <w:pPr>
+        <w:pStyle w:val="PargrafodaLista"/>
+      </w:pPr>
+      <w:r>
+        <w:rPr>
+          <w:noProof/>
+        </w:rPr>
+        <w:drawing>
+          <wp:inline distT="0" distB="0" distL="0" distR="0" wp14:anchorId="2C92E9A2" wp14:editId="41C5A265">
+            <wp:extent cx="3228975" cy="4015158"/>
+            <wp:effectExtent l="0" t="0" r="0" b="4445"/>
+            <wp:docPr id="46" name="Imagem 46"/>
+            <wp:cNvGraphicFramePr>
+              <a:graphicFrameLocks xmlns:a="http://schemas.openxmlformats.org/drawingml/2006/main" noChangeAspect="1"/>
+            </wp:cNvGraphicFramePr>
+            <a:graphic xmlns:a="http://schemas.openxmlformats.org/drawingml/2006/main">
+              <a:graphicData uri="http://schemas.openxmlformats.org/drawingml/2006/picture">
+                <pic:pic xmlns:pic="http://schemas.openxmlformats.org/drawingml/2006/picture">
+                  <pic:nvPicPr>
+                    <pic:cNvPr id="1" name=""/>
+                    <pic:cNvPicPr/>
+                  </pic:nvPicPr>
+                  <pic:blipFill>
+                    <a:blip r:embed="rId50"/>
+                    <a:stretch>
+                      <a:fillRect/>
+                    </a:stretch>
+                  </pic:blipFill>
+                  <pic:spPr>
+                    <a:xfrm>
+                      <a:off x="0" y="0"/>
+                      <a:ext cx="3315480" cy="4122724"/>
+                    </a:xfrm>
+                    <a:prstGeom prst="rect">
+                      <a:avLst/>
+                    </a:prstGeom>
+                  </pic:spPr>
+                </pic:pic>
+              </a:graphicData>
+            </a:graphic>
+          </wp:inline>
+        </w:drawing>
+      </w:r>
+    </w:p>
+    <w:p>
+      <w:pPr>
+        <w:pStyle w:val="PargrafodaLista"/>
+      </w:pPr>
+    </w:p>
+    <w:p>
+      <w:pPr>
+        <w:pStyle w:val="PargrafodaLista"/>
+      </w:pPr>
+    </w:p>
+    <w:p>
+      <w:pPr>
+        <w:pStyle w:val="PargrafodaLista"/>
+      </w:pPr>
+      <w:r>
+        <w:rPr>
+          <w:noProof/>
+        </w:rPr>
+        <w:drawing>
+          <wp:inline distT="0" distB="0" distL="0" distR="0" wp14:anchorId="5FB0DD13">
+            <wp:extent cx="4610735" cy="1057275"/>
+            <wp:effectExtent l="0" t="0" r="0" b="9525"/>
+            <wp:docPr id="47" name="Imagem 47"/>
+            <wp:cNvGraphicFramePr>
+              <a:graphicFrameLocks xmlns:a="http://schemas.openxmlformats.org/drawingml/2006/main" noChangeAspect="1"/>
+            </wp:cNvGraphicFramePr>
+            <a:graphic xmlns:a="http://schemas.openxmlformats.org/drawingml/2006/main">
+              <a:graphicData uri="http://schemas.openxmlformats.org/drawingml/2006/picture">
+                <pic:pic xmlns:pic="http://schemas.openxmlformats.org/drawingml/2006/picture">
+                  <pic:nvPicPr>
+                    <pic:cNvPr id="0" name="Picture 14"/>
+                    <pic:cNvPicPr>
+                      <a:picLocks noChangeAspect="1" noChangeArrowheads="1"/>
+                    </pic:cNvPicPr>
+                  </pic:nvPicPr>
+                  <pic:blipFill>
+                    <a:blip r:embed="rId51">
+                      <a:extLst>
+                        <a:ext uri="{28A0092B-C50C-407E-A947-70E740481C1C}">
+                          <a14:useLocalDpi xmlns:a14="http://schemas.microsoft.com/office/drawing/2010/main" val="0"/>
+                        </a:ext>
+                      </a:extLst>
+                    </a:blip>
+                    <a:srcRect/>
+                    <a:stretch>
+                      <a:fillRect/>
+                    </a:stretch>
+                  </pic:blipFill>
+                  <pic:spPr bwMode="auto">
+                    <a:xfrm>
+                      <a:off x="0" y="0"/>
+                      <a:ext cx="4610735" cy="1057275"/>
+                    </a:xfrm>
+                    <a:prstGeom prst="rect">
+                      <a:avLst/>
+                    </a:prstGeom>
+                    <a:noFill/>
+                  </pic:spPr>
+                </pic:pic>
+              </a:graphicData>
+            </a:graphic>
+          </wp:inline>
+        </w:drawing>
+      </w:r>
+    </w:p>
+    <w:p>
+      <w:pPr>
+        <w:pStyle w:val="PargrafodaLista"/>
+      </w:pPr>
+    </w:p>
+    <w:p>
+      <w:pPr>
+        <w:pStyle w:val="PargrafodaLista"/>
+        <w:rPr>
+          <w:u w:val="single"/>
+        </w:rPr>
+      </w:pPr>
+      <w:proofErr w:type="spellStart"/>
+      <w:r>
+        <w:t>Obs:O</w:t>
+      </w:r>
+      <w:proofErr w:type="spellEnd"/>
+      <w:r>
+        <w:t xml:space="preserve"> reset sempre tem que ficar em cima do nosso </w:t>
+      </w:r>
+      <w:proofErr w:type="spellStart"/>
+      <w:r>
+        <w:t>css</w:t>
+      </w:r>
+      <w:proofErr w:type="spellEnd"/>
+      <w:r>
+        <w:t xml:space="preserve"> senão ele iria reseta o </w:t>
+      </w:r>
+      <w:proofErr w:type="spellStart"/>
+      <w:r>
+        <w:t>css</w:t>
+      </w:r>
+      <w:proofErr w:type="spellEnd"/>
+      <w:r>
+        <w:t xml:space="preserve"> q estamos trabalhando em </w:t>
+      </w:r>
+      <w:proofErr w:type="gramStart"/>
+      <w:r>
+        <w:t>nossa página</w:t>
+      </w:r>
+      <w:r>
+        <w:rPr>
+          <w:u w:val="single"/>
+        </w:rPr>
+        <w:t>s</w:t>
+      </w:r>
+      <w:proofErr w:type="gramEnd"/>
+    </w:p>
+    <w:p>
+      <w:pPr>
+        <w:pStyle w:val="PargrafodaLista"/>
+        <w:rPr>
+          <w:u w:val="single"/>
+        </w:rPr>
+      </w:pPr>
+    </w:p>
+    <w:p>
+      <w:pPr>
+        <w:pStyle w:val="PargrafodaLista"/>
+        <w:rPr>
+          <w:u w:val="single"/>
+        </w:rPr>
+      </w:pPr>
+      <w:r>
+        <w:rPr>
+          <w:u w:val="single"/>
+        </w:rPr>
+        <w:t>28-</w:t>
+      </w:r>
+    </w:p>
+    <w:p>
+      <w:pPr>
+        <w:pStyle w:val="PargrafodaLista"/>
+        <w:rPr>
+          <w:u w:val="single"/>
+        </w:rPr>
+      </w:pPr>
+    </w:p>
+    <w:p>
+      <w:pPr>
+        <w:pStyle w:val="PargrafodaLista"/>
+        <w:rPr>
+          <w:u w:val="single"/>
+        </w:rPr>
+      </w:pPr>
+    </w:p>
+    <w:p>
+      <w:pPr>
+        <w:pStyle w:val="PargrafodaLista"/>
+        <w:rPr>
+          <w:u w:val="single"/>
+        </w:rPr>
+      </w:pPr>
+    </w:p>
+    <w:p>
+      <w:pPr>
+        <w:pStyle w:val="PargrafodaLista"/>
+        <w:rPr>
+          <w:u w:val="single"/>
+        </w:rPr>
+      </w:pPr>
+    </w:p>
+    <w:p>
+      <w:pPr>
+        <w:pStyle w:val="PargrafodaLista"/>
+        <w:rPr>
+          <w:u w:val="single"/>
+        </w:rPr>
+      </w:pPr>
+    </w:p>
+    <w:p>
+      <w:pPr>
+        <w:pStyle w:val="PargrafodaLista"/>
+        <w:rPr>
+          <w:u w:val="single"/>
+        </w:rPr>
+      </w:pPr>
+    </w:p>
+    <w:p>
+      <w:pPr>
+        <w:pStyle w:val="PargrafodaLista"/>
+        <w:rPr>
+          <w:u w:val="single"/>
+        </w:rPr>
+      </w:pPr>
+    </w:p>
+    <w:p>
+      <w:pPr>
+        <w:pStyle w:val="PargrafodaLista"/>
+        <w:rPr>
+          <w:u w:val="single"/>
+        </w:rPr>
+      </w:pPr>
+    </w:p>
+    <w:p>
+      <w:pPr>
+        <w:pStyle w:val="PargrafodaLista"/>
+        <w:rPr>
+          <w:u w:val="single"/>
+        </w:rPr>
+      </w:pPr>
+    </w:p>
+    <w:p>
+      <w:pPr>
+        <w:pStyle w:val="PargrafodaLista"/>
+        <w:rPr>
+          <w:u w:val="single"/>
+        </w:rPr>
+      </w:pPr>
+    </w:p>
+    <w:p>
+      <w:pPr>
+        <w:pStyle w:val="PargrafodaLista"/>
+      </w:pPr>
+      <w:r>
+        <w:t xml:space="preserve">29-Ao centralizar a altura do menu dentro do header utilizamos o inspecionar de código ou </w:t>
+      </w:r>
+      <w:proofErr w:type="spellStart"/>
+      <w:r>
+        <w:t>devtool</w:t>
+      </w:r>
+      <w:proofErr w:type="spellEnd"/>
+      <w:r>
+        <w:t xml:space="preserve"> para saber a altura do elemento dentro o header apertando o F12</w:t>
+      </w:r>
+    </w:p>
+    <w:p>
+      <w:pPr>
+        <w:pStyle w:val="PargrafodaLista"/>
+      </w:pPr>
+    </w:p>
+    <w:p>
+      <w:pPr>
+        <w:pStyle w:val="PargrafodaLista"/>
+        <w:rPr>
+          <w:u w:val="single"/>
+        </w:rPr>
+      </w:pPr>
+      <w:r>
+        <w:rPr>
+          <w:noProof/>
+        </w:rPr>
+        <w:drawing>
+          <wp:inline distT="0" distB="0" distL="0" distR="0" wp14:anchorId="1637878D" wp14:editId="4F898612">
+            <wp:extent cx="5400040" cy="2515870"/>
+            <wp:effectExtent l="0" t="0" r="0" b="0"/>
+            <wp:docPr id="31" name="Imagem 31"/>
+            <wp:cNvGraphicFramePr>
+              <a:graphicFrameLocks xmlns:a="http://schemas.openxmlformats.org/drawingml/2006/main" noChangeAspect="1"/>
+            </wp:cNvGraphicFramePr>
+            <a:graphic xmlns:a="http://schemas.openxmlformats.org/drawingml/2006/main">
+              <a:graphicData uri="http://schemas.openxmlformats.org/drawingml/2006/picture">
+                <pic:pic xmlns:pic="http://schemas.openxmlformats.org/drawingml/2006/picture">
+                  <pic:nvPicPr>
+                    <pic:cNvPr id="1" name=""/>
+                    <pic:cNvPicPr/>
+                  </pic:nvPicPr>
+                  <pic:blipFill>
+                    <a:blip r:embed="rId52"/>
+                    <a:stretch>
+                      <a:fillRect/>
+                    </a:stretch>
+                  </pic:blipFill>
+                  <pic:spPr>
+                    <a:xfrm>
+                      <a:off x="0" y="0"/>
+                      <a:ext cx="5400040" cy="2515870"/>
+                    </a:xfrm>
+                    <a:prstGeom prst="rect">
+                      <a:avLst/>
+                    </a:prstGeom>
+                  </pic:spPr>
+                </pic:pic>
+              </a:graphicData>
+            </a:graphic>
+          </wp:inline>
+        </w:drawing>
+      </w:r>
+    </w:p>
+    <w:p>
+      <w:pPr>
+        <w:pStyle w:val="PargrafodaLista"/>
+      </w:pPr>
+    </w:p>
+    <w:p>
+      <w:pPr>
+        <w:pStyle w:val="PargrafodaLista"/>
+      </w:pPr>
+      <w:r>
+        <w:t xml:space="preserve">Conforme imagem acima verificamos que é 253px a altura do header então dividimos esse valor e colocamos em nosso código </w:t>
+      </w:r>
+      <w:r>
+        <w:t>126px</w:t>
+      </w:r>
+    </w:p>
+    <w:p>
+      <w:pPr>
+        <w:pStyle w:val="PargrafodaLista"/>
+      </w:pPr>
+    </w:p>
+    <w:p>
+      <w:pPr>
+        <w:pStyle w:val="PargrafodaLista"/>
+      </w:pPr>
+      <w:r>
+        <w:rPr>
+          <w:noProof/>
+        </w:rPr>
+        <w:drawing>
+          <wp:inline distT="0" distB="0" distL="0" distR="0" wp14:anchorId="2FED871B">
+            <wp:extent cx="3152775" cy="1508690"/>
+            <wp:effectExtent l="0" t="0" r="0" b="0"/>
+            <wp:docPr id="36" name="Imagem 36"/>
+            <wp:cNvGraphicFramePr>
+              <a:graphicFrameLocks xmlns:a="http://schemas.openxmlformats.org/drawingml/2006/main" noChangeAspect="1"/>
+            </wp:cNvGraphicFramePr>
+            <a:graphic xmlns:a="http://schemas.openxmlformats.org/drawingml/2006/main">
+              <a:graphicData uri="http://schemas.openxmlformats.org/drawingml/2006/picture">
+                <pic:pic xmlns:pic="http://schemas.openxmlformats.org/drawingml/2006/picture">
+                  <pic:nvPicPr>
+                    <pic:cNvPr id="0" name="Picture 2"/>
+                    <pic:cNvPicPr>
+                      <a:picLocks noChangeAspect="1" noChangeArrowheads="1"/>
+                    </pic:cNvPicPr>
+                  </pic:nvPicPr>
+                  <pic:blipFill>
+                    <a:blip r:embed="rId53">
+                      <a:extLst>
+                        <a:ext uri="{28A0092B-C50C-407E-A947-70E740481C1C}">
+                          <a14:useLocalDpi xmlns:a14="http://schemas.microsoft.com/office/drawing/2010/main" val="0"/>
+                        </a:ext>
+                      </a:extLst>
+                    </a:blip>
+                    <a:srcRect/>
+                    <a:stretch>
+                      <a:fillRect/>
+                    </a:stretch>
+                  </pic:blipFill>
+                  <pic:spPr bwMode="auto">
+                    <a:xfrm>
+                      <a:off x="0" y="0"/>
+                      <a:ext cx="3200907" cy="1531723"/>
+                    </a:xfrm>
+                    <a:prstGeom prst="rect">
+                      <a:avLst/>
+                    </a:prstGeom>
+                    <a:noFill/>
+                  </pic:spPr>
+                </pic:pic>
+              </a:graphicData>
+            </a:graphic>
+          </wp:inline>
+        </w:drawing>
+      </w:r>
+    </w:p>
+    <w:p>
+      <w:pPr>
+        <w:pStyle w:val="PargrafodaLista"/>
+      </w:pPr>
+    </w:p>
+    <w:p>
+      <w:pPr>
+        <w:pStyle w:val="PargrafodaLista"/>
+      </w:pPr>
+      <w:r>
+        <w:rPr>
+          <w:noProof/>
+        </w:rPr>
+        <w:drawing>
+          <wp:inline distT="0" distB="0" distL="0" distR="0" wp14:anchorId="450AB1B8">
+            <wp:extent cx="5695117" cy="1060651"/>
+            <wp:effectExtent l="0" t="0" r="1270" b="6350"/>
+            <wp:docPr id="44" name="Imagem 44"/>
+            <wp:cNvGraphicFramePr>
+              <a:graphicFrameLocks xmlns:a="http://schemas.openxmlformats.org/drawingml/2006/main" noChangeAspect="1"/>
+            </wp:cNvGraphicFramePr>
+            <a:graphic xmlns:a="http://schemas.openxmlformats.org/drawingml/2006/main">
+              <a:graphicData uri="http://schemas.openxmlformats.org/drawingml/2006/picture">
+                <pic:pic xmlns:pic="http://schemas.openxmlformats.org/drawingml/2006/picture">
+                  <pic:nvPicPr>
+                    <pic:cNvPr id="0" name="Picture 3"/>
+                    <pic:cNvPicPr>
+                      <a:picLocks noChangeAspect="1" noChangeArrowheads="1"/>
+                    </pic:cNvPicPr>
+                  </pic:nvPicPr>
+                  <pic:blipFill>
+                    <a:blip r:embed="rId54">
+                      <a:extLst>
+                        <a:ext uri="{28A0092B-C50C-407E-A947-70E740481C1C}">
+                          <a14:useLocalDpi xmlns:a14="http://schemas.microsoft.com/office/drawing/2010/main" val="0"/>
+                        </a:ext>
+                      </a:extLst>
+                    </a:blip>
+                    <a:srcRect/>
+                    <a:stretch>
+                      <a:fillRect/>
+                    </a:stretch>
+                  </pic:blipFill>
+                  <pic:spPr bwMode="auto">
+                    <a:xfrm>
+                      <a:off x="0" y="0"/>
+                      <a:ext cx="5949575" cy="1108041"/>
+                    </a:xfrm>
+                    <a:prstGeom prst="rect">
+                      <a:avLst/>
+                    </a:prstGeom>
+                    <a:noFill/>
+                  </pic:spPr>
+                </pic:pic>
+              </a:graphicData>
+            </a:graphic>
+          </wp:inline>
+        </w:drawing>
+      </w:r>
+    </w:p>
+    <w:p>
+      <w:pPr>
+        <w:pStyle w:val="PargrafodaLista"/>
+      </w:pPr>
+    </w:p>
+    <w:p>
+      <w:pPr>
+        <w:pStyle w:val="PargrafodaLista"/>
+      </w:pPr>
+      <w:r>
+        <w:t>30-Para centralizar o logo e nossa lista (</w:t>
+      </w:r>
+      <w:proofErr w:type="gramStart"/>
+      <w:r>
+        <w:t>menu)  envolvemos</w:t>
+      </w:r>
+      <w:proofErr w:type="gramEnd"/>
+      <w:r>
+        <w:t xml:space="preserve"> eles dentro de uma lista chamada </w:t>
+      </w:r>
+      <w:proofErr w:type="spellStart"/>
+      <w:r>
+        <w:t>div</w:t>
+      </w:r>
+      <w:proofErr w:type="spellEnd"/>
+      <w:r>
+        <w:t xml:space="preserve"> caixa.</w:t>
+      </w:r>
+    </w:p>
+    <w:p>
+      <w:pPr>
+        <w:pStyle w:val="PargrafodaLista"/>
+      </w:pPr>
+      <w:r>
+        <w:rPr>
+          <w:noProof/>
+        </w:rPr>
+        <w:drawing>
+          <wp:inline distT="0" distB="0" distL="0" distR="0" wp14:anchorId="5FE43183">
+            <wp:extent cx="3239135" cy="1533525"/>
+            <wp:effectExtent l="0" t="0" r="0" b="9525"/>
+            <wp:docPr id="48" name="Imagem 48"/>
+            <wp:cNvGraphicFramePr>
+              <a:graphicFrameLocks xmlns:a="http://schemas.openxmlformats.org/drawingml/2006/main" noChangeAspect="1"/>
+            </wp:cNvGraphicFramePr>
+            <a:graphic xmlns:a="http://schemas.openxmlformats.org/drawingml/2006/main">
+              <a:graphicData uri="http://schemas.openxmlformats.org/drawingml/2006/picture">
+                <pic:pic xmlns:pic="http://schemas.openxmlformats.org/drawingml/2006/picture">
+                  <pic:nvPicPr>
+                    <pic:cNvPr id="0" name="Picture 4"/>
+                    <pic:cNvPicPr>
+                      <a:picLocks noChangeAspect="1" noChangeArrowheads="1"/>
+                    </pic:cNvPicPr>
+                  </pic:nvPicPr>
+                  <pic:blipFill>
+                    <a:blip r:embed="rId55">
+                      <a:extLst>
+                        <a:ext uri="{28A0092B-C50C-407E-A947-70E740481C1C}">
+                          <a14:useLocalDpi xmlns:a14="http://schemas.microsoft.com/office/drawing/2010/main" val="0"/>
+                        </a:ext>
+                      </a:extLst>
+                    </a:blip>
+                    <a:srcRect/>
+                    <a:stretch>
+                      <a:fillRect/>
+                    </a:stretch>
+                  </pic:blipFill>
+                  <pic:spPr bwMode="auto">
+                    <a:xfrm>
+                      <a:off x="0" y="0"/>
+                      <a:ext cx="3239135" cy="1533525"/>
+                    </a:xfrm>
+                    <a:prstGeom prst="rect">
+                      <a:avLst/>
+                    </a:prstGeom>
+                    <a:noFill/>
+                  </pic:spPr>
+                </pic:pic>
+              </a:graphicData>
+            </a:graphic>
+          </wp:inline>
+        </w:drawing>
+      </w:r>
+    </w:p>
+    <w:p>
+      <w:pPr>
+        <w:pStyle w:val="PargrafodaLista"/>
+      </w:pPr>
+    </w:p>
+    <w:p>
+      <w:pPr>
+        <w:pStyle w:val="PargrafodaLista"/>
+      </w:pPr>
+      <w:r>
+        <w:t xml:space="preserve">31- E definimos </w:t>
+      </w:r>
+      <w:r>
+        <w:t xml:space="preserve">uma largura para </w:t>
+      </w:r>
+      <w:proofErr w:type="spellStart"/>
+      <w:r>
+        <w:t>div</w:t>
+      </w:r>
+      <w:proofErr w:type="spellEnd"/>
+      <w:r>
+        <w:t xml:space="preserve"> caixa, deixando uma medida padrão e centralizar tanto a logo com a lista utilizando o </w:t>
+      </w:r>
+      <w:proofErr w:type="spellStart"/>
+      <w:r>
+        <w:t>margin</w:t>
+      </w:r>
+      <w:proofErr w:type="spellEnd"/>
+      <w:r>
+        <w:t>: 0 auto.</w:t>
+      </w:r>
+    </w:p>
+    <w:p>
+      <w:pPr>
+        <w:pStyle w:val="PargrafodaLista"/>
+      </w:pPr>
+    </w:p>
+    <w:p>
+      <w:pPr>
+        <w:pStyle w:val="PargrafodaLista"/>
+      </w:pPr>
+      <w:r>
+        <w:t xml:space="preserve">Como header estava utilizando position </w:t>
+      </w:r>
+      <w:proofErr w:type="spellStart"/>
+      <w:r>
+        <w:t>absolute</w:t>
+      </w:r>
+      <w:proofErr w:type="spellEnd"/>
+      <w:r>
+        <w:t xml:space="preserve"> na </w:t>
+      </w:r>
+      <w:proofErr w:type="spellStart"/>
+      <w:r>
+        <w:t>div</w:t>
+      </w:r>
+      <w:proofErr w:type="spellEnd"/>
+      <w:r>
+        <w:t xml:space="preserve"> se fez necessário colocar position </w:t>
+      </w:r>
+      <w:proofErr w:type="spellStart"/>
+      <w:r>
+        <w:t>relative</w:t>
+      </w:r>
+      <w:proofErr w:type="spellEnd"/>
+      <w:r>
+        <w:t xml:space="preserve"> para que a lista ficasse centralizada automaticamente tanto pra direito como pra esquerda </w:t>
+      </w:r>
+    </w:p>
+    <w:p>
+      <w:pPr>
+        <w:pStyle w:val="PargrafodaLista"/>
+      </w:pPr>
+    </w:p>
+    <w:p>
+      <w:pPr>
+        <w:pStyle w:val="PargrafodaLista"/>
+        <w:jc w:val="center"/>
+      </w:pPr>
+      <w:r>
+        <w:drawing>
+          <wp:inline distT="0" distB="0" distL="0" distR="0" wp14:anchorId="5164AC14" wp14:editId="58240916">
+            <wp:extent cx="2162175" cy="1207448"/>
+            <wp:effectExtent l="0" t="0" r="0" b="0"/>
+            <wp:docPr id="49" name="Imagem 49"/>
+            <wp:cNvGraphicFramePr>
+              <a:graphicFrameLocks xmlns:a="http://schemas.openxmlformats.org/drawingml/2006/main" noChangeAspect="1"/>
+            </wp:cNvGraphicFramePr>
+            <a:graphic xmlns:a="http://schemas.openxmlformats.org/drawingml/2006/main">
+              <a:graphicData uri="http://schemas.openxmlformats.org/drawingml/2006/picture">
+                <pic:pic xmlns:pic="http://schemas.openxmlformats.org/drawingml/2006/picture">
+                  <pic:nvPicPr>
+                    <pic:cNvPr id="1" name=""/>
+                    <pic:cNvPicPr/>
+                  </pic:nvPicPr>
+                  <pic:blipFill>
+                    <a:blip r:embed="rId56"/>
+                    <a:stretch>
+                      <a:fillRect/>
+                    </a:stretch>
+                  </pic:blipFill>
+                  <pic:spPr>
+                    <a:xfrm>
+                      <a:off x="0" y="0"/>
+                      <a:ext cx="2204940" cy="1231330"/>
+                    </a:xfrm>
+                    <a:prstGeom prst="rect">
+                      <a:avLst/>
+                    </a:prstGeom>
+                  </pic:spPr>
+                </pic:pic>
+              </a:graphicData>
+            </a:graphic>
+          </wp:inline>
+        </w:drawing>
+      </w:r>
+    </w:p>
+    <w:p>
+      <w:pPr>
+        <w:pStyle w:val="PargrafodaLista"/>
+        <w:jc w:val="center"/>
+      </w:pPr>
+    </w:p>
+    <w:p>
+      <w:pPr>
+        <w:pStyle w:val="PargrafodaLista"/>
+      </w:pPr>
+      <w:r>
+        <w:rPr>
+          <w:noProof/>
+        </w:rPr>
+        <w:drawing>
+          <wp:inline distT="0" distB="0" distL="0" distR="0" wp14:anchorId="67A6DC30">
+            <wp:extent cx="5437399" cy="1160979"/>
+            <wp:effectExtent l="0" t="0" r="0" b="1270"/>
+            <wp:docPr id="52" name="Imagem 52"/>
+            <wp:cNvGraphicFramePr>
+              <a:graphicFrameLocks xmlns:a="http://schemas.openxmlformats.org/drawingml/2006/main" noChangeAspect="1"/>
+            </wp:cNvGraphicFramePr>
+            <a:graphic xmlns:a="http://schemas.openxmlformats.org/drawingml/2006/main">
+              <a:graphicData uri="http://schemas.openxmlformats.org/drawingml/2006/picture">
+                <pic:pic xmlns:pic="http://schemas.openxmlformats.org/drawingml/2006/picture">
+                  <pic:nvPicPr>
+                    <pic:cNvPr id="0" name="Picture 4"/>
+                    <pic:cNvPicPr>
+                      <a:picLocks noChangeAspect="1" noChangeArrowheads="1"/>
+                    </pic:cNvPicPr>
+                  </pic:nvPicPr>
+                  <pic:blipFill>
+                    <a:blip r:embed="rId57">
+                      <a:extLst>
+                        <a:ext uri="{28A0092B-C50C-407E-A947-70E740481C1C}">
+                          <a14:useLocalDpi xmlns:a14="http://schemas.microsoft.com/office/drawing/2010/main" val="0"/>
+                        </a:ext>
+                      </a:extLst>
+                    </a:blip>
+                    <a:srcRect/>
+                    <a:stretch>
+                      <a:fillRect/>
+                    </a:stretch>
+                  </pic:blipFill>
+                  <pic:spPr bwMode="auto">
+                    <a:xfrm>
+                      <a:off x="0" y="0"/>
+                      <a:ext cx="5663166" cy="1209184"/>
+                    </a:xfrm>
+                    <a:prstGeom prst="rect">
+                      <a:avLst/>
+                    </a:prstGeom>
+                    <a:noFill/>
+                  </pic:spPr>
+                </pic:pic>
+              </a:graphicData>
+            </a:graphic>
+          </wp:inline>
+        </w:drawing>
+      </w:r>
+    </w:p>
+    <w:p>
+      <w:pPr>
+        <w:pStyle w:val="PargrafodaLista"/>
+        <w:jc w:val="center"/>
+      </w:pPr>
+    </w:p>
+    <w:p>
+      <w:pPr>
+        <w:pStyle w:val="PargrafodaLista"/>
+        <w:jc w:val="center"/>
+      </w:pPr>
+    </w:p>
+    <w:p>
+      <w:pPr>
+        <w:pStyle w:val="PargrafodaLista"/>
+        <w:jc w:val="center"/>
+      </w:pPr>
+    </w:p>
+    <w:p>
+      <w:pPr>
+        <w:pStyle w:val="PargrafodaLista"/>
+        <w:jc w:val="center"/>
+      </w:pPr>
+    </w:p>
+    <w:p>
+      <w:pPr>
+        <w:pStyle w:val="PargrafodaLista"/>
+      </w:pPr>
+      <w:r>
+        <w:t xml:space="preserve">32-Para melhorar o espaço interno do header utilizamos o </w:t>
+      </w:r>
+      <w:proofErr w:type="spellStart"/>
+      <w:r>
+        <w:t>padding</w:t>
+      </w:r>
+      <w:proofErr w:type="spellEnd"/>
+      <w:r>
+        <w:t xml:space="preserve"> tanto para cima quanto pra baixo conforme a imagem do código.</w:t>
+      </w:r>
+    </w:p>
+    <w:p>
+      <w:pPr>
+        <w:pStyle w:val="PargrafodaLista"/>
+      </w:pPr>
+    </w:p>
+    <w:p>
+      <w:pPr>
+        <w:pStyle w:val="PargrafodaLista"/>
+        <w:jc w:val="center"/>
+      </w:pPr>
+      <w:r>
+        <w:rPr>
+          <w:noProof/>
+        </w:rPr>
+        <w:drawing>
+          <wp:inline distT="0" distB="0" distL="0" distR="0" wp14:anchorId="1F1FF1B1">
+            <wp:extent cx="2753591" cy="857250"/>
+            <wp:effectExtent l="0" t="0" r="8890" b="0"/>
+            <wp:docPr id="50" name="Imagem 50"/>
+            <wp:cNvGraphicFramePr>
+              <a:graphicFrameLocks xmlns:a="http://schemas.openxmlformats.org/drawingml/2006/main" noChangeAspect="1"/>
+            </wp:cNvGraphicFramePr>
+            <a:graphic xmlns:a="http://schemas.openxmlformats.org/drawingml/2006/main">
+              <a:graphicData uri="http://schemas.openxmlformats.org/drawingml/2006/picture">
+                <pic:pic xmlns:pic="http://schemas.openxmlformats.org/drawingml/2006/picture">
+                  <pic:nvPicPr>
+                    <pic:cNvPr id="0" name="Picture 2"/>
+                    <pic:cNvPicPr>
+                      <a:picLocks noChangeAspect="1" noChangeArrowheads="1"/>
+                    </pic:cNvPicPr>
+                  </pic:nvPicPr>
+                  <pic:blipFill>
+                    <a:blip r:embed="rId58">
+                      <a:extLst>
+                        <a:ext uri="{28A0092B-C50C-407E-A947-70E740481C1C}">
+                          <a14:useLocalDpi xmlns:a14="http://schemas.microsoft.com/office/drawing/2010/main" val="0"/>
+                        </a:ext>
+                      </a:extLst>
+                    </a:blip>
+                    <a:srcRect/>
+                    <a:stretch>
+                      <a:fillRect/>
+                    </a:stretch>
+                  </pic:blipFill>
+                  <pic:spPr bwMode="auto">
+                    <a:xfrm>
+                      <a:off x="0" y="0"/>
+                      <a:ext cx="2757363" cy="858424"/>
+                    </a:xfrm>
+                    <a:prstGeom prst="rect">
+                      <a:avLst/>
+                    </a:prstGeom>
+                    <a:noFill/>
+                  </pic:spPr>
+                </pic:pic>
+              </a:graphicData>
+            </a:graphic>
+          </wp:inline>
+        </w:drawing>
+      </w:r>
+    </w:p>
+    <w:p>
+      <w:pPr>
+        <w:pStyle w:val="PargrafodaLista"/>
+        <w:jc w:val="center"/>
+      </w:pPr>
+    </w:p>
+    <w:p>
+      <w:pPr>
+        <w:pStyle w:val="PargrafodaLista"/>
+        <w:jc w:val="center"/>
+      </w:pPr>
+      <w:r>
+        <w:rPr>
+          <w:noProof/>
+        </w:rPr>
+        <w:drawing>
+          <wp:inline distT="0" distB="0" distL="0" distR="0" wp14:anchorId="0BFA6953" wp14:editId="20A7445C">
+            <wp:extent cx="4996319" cy="1066800"/>
+            <wp:effectExtent l="0" t="0" r="0" b="0"/>
+            <wp:docPr id="51" name="Imagem 51"/>
+            <wp:cNvGraphicFramePr>
+              <a:graphicFrameLocks xmlns:a="http://schemas.openxmlformats.org/drawingml/2006/main" noChangeAspect="1"/>
+            </wp:cNvGraphicFramePr>
+            <a:graphic xmlns:a="http://schemas.openxmlformats.org/drawingml/2006/main">
+              <a:graphicData uri="http://schemas.openxmlformats.org/drawingml/2006/picture">
+                <pic:pic xmlns:pic="http://schemas.openxmlformats.org/drawingml/2006/picture">
+                  <pic:nvPicPr>
+                    <pic:cNvPr id="0" name="Picture 3"/>
+                    <pic:cNvPicPr>
+                      <a:picLocks noChangeAspect="1" noChangeArrowheads="1"/>
+                    </pic:cNvPicPr>
+                  </pic:nvPicPr>
+                  <pic:blipFill>
+                    <a:blip r:embed="rId57" cstate="print">
+                      <a:extLst>
+                        <a:ext uri="{28A0092B-C50C-407E-A947-70E740481C1C}">
+                          <a14:useLocalDpi xmlns:a14="http://schemas.microsoft.com/office/drawing/2010/main" val="0"/>
+                        </a:ext>
+                      </a:extLst>
+                    </a:blip>
+                    <a:srcRect/>
+                    <a:stretch>
+                      <a:fillRect/>
+                    </a:stretch>
+                  </pic:blipFill>
+                  <pic:spPr bwMode="auto">
+                    <a:xfrm>
+                      <a:off x="0" y="0"/>
+                      <a:ext cx="5114992" cy="1092139"/>
+                    </a:xfrm>
+                    <a:prstGeom prst="rect">
+                      <a:avLst/>
+                    </a:prstGeom>
+                    <a:noFill/>
+                  </pic:spPr>
+                </pic:pic>
+              </a:graphicData>
+            </a:graphic>
+          </wp:inline>
+        </w:drawing>
+      </w:r>
+    </w:p>
+    <w:p>
+      <w:pPr>
+        <w:pStyle w:val="PargrafodaLista"/>
+        <w:jc w:val="center"/>
+      </w:pPr>
+    </w:p>
+    <w:p>
+      <w:pPr>
+        <w:pStyle w:val="PargrafodaLista"/>
+        <w:jc w:val="center"/>
+      </w:pPr>
+    </w:p>
+    <w:p>
+      <w:pPr>
+        <w:pStyle w:val="PargrafodaLista"/>
+        <w:jc w:val="center"/>
+      </w:pPr>
+    </w:p>
+    <w:p>
+      <w:pPr>
+        <w:pStyle w:val="PargrafodaLista"/>
+        <w:jc w:val="center"/>
+      </w:pPr>
+    </w:p>
+    <w:p>
+      <w:pPr>
+        <w:pStyle w:val="PargrafodaLista"/>
+        <w:jc w:val="center"/>
+      </w:pPr>
+    </w:p>
+    <w:p>
+      <w:pPr>
+        <w:pStyle w:val="PargrafodaLista"/>
+      </w:pPr>
+    </w:p>
+    <w:p>
+      <w:pPr>
+        <w:pStyle w:val="PargrafodaLista"/>
+      </w:pPr>
+      <w:r>
+        <w:t xml:space="preserve">33- Dentro do </w:t>
+      </w:r>
+      <w:proofErr w:type="spellStart"/>
+      <w:r>
+        <w:t>main</w:t>
+      </w:r>
+      <w:proofErr w:type="spellEnd"/>
+      <w:r>
+        <w:t xml:space="preserve"> criamos uma lista não ordenada que inserimos os itens com </w:t>
+      </w:r>
+      <w:proofErr w:type="gramStart"/>
+      <w:r>
+        <w:t>subtítulo ,</w:t>
+      </w:r>
+      <w:proofErr w:type="gramEnd"/>
+      <w:r>
+        <w:t xml:space="preserve"> imagem e </w:t>
+      </w:r>
+      <w:proofErr w:type="spellStart"/>
+      <w:r>
+        <w:t>paragrafo</w:t>
+      </w:r>
+      <w:proofErr w:type="spellEnd"/>
+      <w:r>
+        <w:t>.</w:t>
+      </w:r>
+    </w:p>
+    <w:p>
+      <w:pPr>
+        <w:pStyle w:val="PargrafodaLista"/>
+      </w:pPr>
+    </w:p>
+    <w:p>
+      <w:pPr>
+        <w:pStyle w:val="PargrafodaLista"/>
+      </w:pPr>
+    </w:p>
+    <w:p>
+      <w:pPr>
+        <w:pStyle w:val="PargrafodaLista"/>
+        <w:jc w:val="center"/>
+      </w:pPr>
+      <w:r>
+        <w:rPr>
+          <w:noProof/>
+        </w:rPr>
+        <w:drawing>
+          <wp:inline distT="0" distB="0" distL="0" distR="0" wp14:anchorId="5BE3164E">
+            <wp:extent cx="4391660" cy="3648710"/>
+            <wp:effectExtent l="0" t="0" r="8890" b="8890"/>
+            <wp:docPr id="53" name="Imagem 53"/>
+            <wp:cNvGraphicFramePr>
+              <a:graphicFrameLocks xmlns:a="http://schemas.openxmlformats.org/drawingml/2006/main" noChangeAspect="1"/>
+            </wp:cNvGraphicFramePr>
+            <a:graphic xmlns:a="http://schemas.openxmlformats.org/drawingml/2006/main">
+              <a:graphicData uri="http://schemas.openxmlformats.org/drawingml/2006/picture">
+                <pic:pic xmlns:pic="http://schemas.openxmlformats.org/drawingml/2006/picture">
+                  <pic:nvPicPr>
+                    <pic:cNvPr id="0" name="Picture 5"/>
+                    <pic:cNvPicPr>
+                      <a:picLocks noChangeAspect="1" noChangeArrowheads="1"/>
+                    </pic:cNvPicPr>
+                  </pic:nvPicPr>
+                  <pic:blipFill>
+                    <a:blip r:embed="rId59">
+                      <a:extLst>
+                        <a:ext uri="{28A0092B-C50C-407E-A947-70E740481C1C}">
+                          <a14:useLocalDpi xmlns:a14="http://schemas.microsoft.com/office/drawing/2010/main" val="0"/>
+                        </a:ext>
+                      </a:extLst>
+                    </a:blip>
+                    <a:srcRect/>
+                    <a:stretch>
+                      <a:fillRect/>
+                    </a:stretch>
+                  </pic:blipFill>
+                  <pic:spPr bwMode="auto">
+                    <a:xfrm>
+                      <a:off x="0" y="0"/>
+                      <a:ext cx="4391660" cy="3648710"/>
+                    </a:xfrm>
+                    <a:prstGeom prst="rect">
+                      <a:avLst/>
+                    </a:prstGeom>
+                    <a:noFill/>
+                  </pic:spPr>
+                </pic:pic>
+              </a:graphicData>
+            </a:graphic>
+          </wp:inline>
+        </w:drawing>
+      </w:r>
+    </w:p>
+    <w:p>
+      <w:pPr>
+        <w:pStyle w:val="PargrafodaLista"/>
+      </w:pPr>
+      <w:r>
+        <w:t xml:space="preserve"> </w:t>
+      </w:r>
+    </w:p>
+    <w:p>
+      <w:pPr>
+        <w:pStyle w:val="PargrafodaLista"/>
+      </w:pPr>
+      <w:r>
+        <w:t xml:space="preserve">34- Para colocar os itens </w:t>
+      </w:r>
+      <w:r>
+        <w:t>da lista</w:t>
+      </w:r>
+      <w:r>
+        <w:t xml:space="preserve"> de produtos um ao lado do outro adicionamos um </w:t>
+      </w:r>
+      <w:proofErr w:type="spellStart"/>
+      <w:r>
+        <w:t>class</w:t>
+      </w:r>
+      <w:proofErr w:type="spellEnd"/>
+      <w:r>
+        <w:t xml:space="preserve"> no </w:t>
+      </w:r>
+      <w:proofErr w:type="spellStart"/>
+      <w:r>
+        <w:t>html</w:t>
+      </w:r>
+      <w:proofErr w:type="spellEnd"/>
+      <w:r>
+        <w:t xml:space="preserve"> chamada produtos e no </w:t>
+      </w:r>
+      <w:proofErr w:type="spellStart"/>
+      <w:r>
+        <w:t>css</w:t>
+      </w:r>
+      <w:proofErr w:type="spellEnd"/>
+      <w:r>
+        <w:t xml:space="preserve"> mudamos a natureza da </w:t>
+      </w:r>
+      <w:proofErr w:type="spellStart"/>
+      <w:r>
+        <w:t>lsita</w:t>
+      </w:r>
+      <w:proofErr w:type="spellEnd"/>
+      <w:r>
+        <w:t xml:space="preserve"> para </w:t>
+      </w:r>
+      <w:proofErr w:type="spellStart"/>
+      <w:r>
+        <w:t>inline-block</w:t>
+      </w:r>
+      <w:proofErr w:type="spellEnd"/>
+      <w:r>
+        <w:t>.</w:t>
+      </w:r>
+    </w:p>
+    <w:p>
+      <w:pPr>
+        <w:pStyle w:val="PargrafodaLista"/>
+      </w:pPr>
+      <w:r>
+        <w:t xml:space="preserve">           </w:t>
+      </w:r>
+      <w:r>
+        <w:drawing>
+          <wp:inline distT="0" distB="0" distL="0" distR="0" wp14:anchorId="3A4A3AD3" wp14:editId="4CBF93C8">
+            <wp:extent cx="3277057" cy="2619741"/>
+            <wp:effectExtent l="0" t="0" r="0" b="9525"/>
+            <wp:docPr id="54" name="Imagem 54"/>
+            <wp:cNvGraphicFramePr>
+              <a:graphicFrameLocks xmlns:a="http://schemas.openxmlformats.org/drawingml/2006/main" noChangeAspect="1"/>
+            </wp:cNvGraphicFramePr>
+            <a:graphic xmlns:a="http://schemas.openxmlformats.org/drawingml/2006/main">
+              <a:graphicData uri="http://schemas.openxmlformats.org/drawingml/2006/picture">
+                <pic:pic xmlns:pic="http://schemas.openxmlformats.org/drawingml/2006/picture">
+                  <pic:nvPicPr>
+                    <pic:cNvPr id="1" name=""/>
+                    <pic:cNvPicPr/>
+                  </pic:nvPicPr>
+                  <pic:blipFill>
+                    <a:blip r:embed="rId60"/>
+                    <a:stretch>
+                      <a:fillRect/>
+                    </a:stretch>
+                  </pic:blipFill>
+                  <pic:spPr>
+                    <a:xfrm>
+                      <a:off x="0" y="0"/>
+                      <a:ext cx="3277057" cy="2619741"/>
+                    </a:xfrm>
+                    <a:prstGeom prst="rect">
+                      <a:avLst/>
+                    </a:prstGeom>
+                  </pic:spPr>
+                </pic:pic>
+              </a:graphicData>
+            </a:graphic>
+          </wp:inline>
+        </w:drawing>
+      </w:r>
+    </w:p>
+    <w:p>
+      <w:pPr>
+        <w:pStyle w:val="PargrafodaLista"/>
+        <w:jc w:val="center"/>
+      </w:pPr>
+      <w:r>
+        <w:rPr>
+          <w:noProof/>
+        </w:rPr>
+        <w:drawing>
+          <wp:inline distT="0" distB="0" distL="0" distR="0" wp14:anchorId="2F77D98B" wp14:editId="23E176F9">
+            <wp:extent cx="2171700" cy="735965"/>
+            <wp:effectExtent l="0" t="0" r="0" b="6985"/>
+            <wp:docPr id="55" name="Imagem 55"/>
+            <wp:cNvGraphicFramePr>
+              <a:graphicFrameLocks xmlns:a="http://schemas.openxmlformats.org/drawingml/2006/main" noChangeAspect="1"/>
+            </wp:cNvGraphicFramePr>
+            <a:graphic xmlns:a="http://schemas.openxmlformats.org/drawingml/2006/main">
+              <a:graphicData uri="http://schemas.openxmlformats.org/drawingml/2006/picture">
+                <pic:pic xmlns:pic="http://schemas.openxmlformats.org/drawingml/2006/picture">
+                  <pic:nvPicPr>
+                    <pic:cNvPr id="0" name="Picture 6"/>
+                    <pic:cNvPicPr>
+                      <a:picLocks noChangeAspect="1" noChangeArrowheads="1"/>
+                    </pic:cNvPicPr>
+                  </pic:nvPicPr>
+                  <pic:blipFill>
+                    <a:blip r:embed="rId61">
+                      <a:extLst>
+                        <a:ext uri="{28A0092B-C50C-407E-A947-70E740481C1C}">
+                          <a14:useLocalDpi xmlns:a14="http://schemas.microsoft.com/office/drawing/2010/main" val="0"/>
+                        </a:ext>
+                      </a:extLst>
+                    </a:blip>
+                    <a:srcRect/>
+                    <a:stretch>
+                      <a:fillRect/>
+                    </a:stretch>
+                  </pic:blipFill>
+                  <pic:spPr bwMode="auto">
+                    <a:xfrm>
+                      <a:off x="0" y="0"/>
+                      <a:ext cx="2191497" cy="742674"/>
+                    </a:xfrm>
+                    <a:prstGeom prst="rect">
+                      <a:avLst/>
+                    </a:prstGeom>
+                    <a:noFill/>
+                  </pic:spPr>
+                </pic:pic>
+              </a:graphicData>
+            </a:graphic>
+          </wp:inline>
+        </w:drawing>
+      </w:r>
+    </w:p>
+    <w:p>
+      <w:r>
+        <w:t xml:space="preserve">                                         </w:t>
+      </w:r>
+      <w:r>
+        <w:rPr>
+          <w:noProof/>
+        </w:rPr>
+        <w:drawing>
+          <wp:inline distT="0" distB="0" distL="0" distR="0" wp14:anchorId="405D6E73">
+            <wp:extent cx="5448242" cy="2152650"/>
+            <wp:effectExtent l="0" t="0" r="635" b="0"/>
+            <wp:docPr id="56" name="Imagem 56"/>
+            <wp:cNvGraphicFramePr>
+              <a:graphicFrameLocks xmlns:a="http://schemas.openxmlformats.org/drawingml/2006/main" noChangeAspect="1"/>
+            </wp:cNvGraphicFramePr>
+            <a:graphic xmlns:a="http://schemas.openxmlformats.org/drawingml/2006/main">
+              <a:graphicData uri="http://schemas.openxmlformats.org/drawingml/2006/picture">
+                <pic:pic xmlns:pic="http://schemas.openxmlformats.org/drawingml/2006/picture">
+                  <pic:nvPicPr>
+                    <pic:cNvPr id="0" name="Picture 7"/>
+                    <pic:cNvPicPr>
+                      <a:picLocks noChangeAspect="1" noChangeArrowheads="1"/>
+                    </pic:cNvPicPr>
+                  </pic:nvPicPr>
+                  <pic:blipFill>
+                    <a:blip r:embed="rId62">
+                      <a:extLst>
+                        <a:ext uri="{28A0092B-C50C-407E-A947-70E740481C1C}">
+                          <a14:useLocalDpi xmlns:a14="http://schemas.microsoft.com/office/drawing/2010/main" val="0"/>
+                        </a:ext>
+                      </a:extLst>
+                    </a:blip>
+                    <a:srcRect/>
+                    <a:stretch>
+                      <a:fillRect/>
+                    </a:stretch>
+                  </pic:blipFill>
+                  <pic:spPr bwMode="auto">
+                    <a:xfrm>
+                      <a:off x="0" y="0"/>
+                      <a:ext cx="5483246" cy="2166480"/>
+                    </a:xfrm>
+                    <a:prstGeom prst="rect">
+                      <a:avLst/>
+                    </a:prstGeom>
+                    <a:noFill/>
+                  </pic:spPr>
+                </pic:pic>
+              </a:graphicData>
+            </a:graphic>
+          </wp:inline>
+        </w:drawing>
+      </w:r>
+    </w:p>
+    <w:p/>
+    <w:p>
+      <w:r>
+        <w:t xml:space="preserve">35- Para centralizar a nossa lista de produtos na </w:t>
+      </w:r>
+      <w:proofErr w:type="spellStart"/>
+      <w:r>
+        <w:t>class</w:t>
+      </w:r>
+      <w:proofErr w:type="spellEnd"/>
+      <w:r>
+        <w:t xml:space="preserve"> produtos demos uma largura de 940px </w:t>
+      </w:r>
+      <w:r>
+        <w:t>utilizamos margin;0 auto.</w:t>
+      </w:r>
+    </w:p>
+    <w:p>
+      <w:pPr>
+        <w:jc w:val="center"/>
+      </w:pPr>
+      <w:r>
+        <w:rPr>
+          <w:noProof/>
+        </w:rPr>
+        <w:drawing>
+          <wp:inline distT="0" distB="0" distL="0" distR="0" wp14:anchorId="6E184330">
+            <wp:extent cx="3294773" cy="1390650"/>
+            <wp:effectExtent l="0" t="0" r="1270" b="0"/>
+            <wp:docPr id="57" name="Imagem 57"/>
+            <wp:cNvGraphicFramePr>
+              <a:graphicFrameLocks xmlns:a="http://schemas.openxmlformats.org/drawingml/2006/main" noChangeAspect="1"/>
+            </wp:cNvGraphicFramePr>
+            <a:graphic xmlns:a="http://schemas.openxmlformats.org/drawingml/2006/main">
+              <a:graphicData uri="http://schemas.openxmlformats.org/drawingml/2006/picture">
+                <pic:pic xmlns:pic="http://schemas.openxmlformats.org/drawingml/2006/picture">
+                  <pic:nvPicPr>
+                    <pic:cNvPr id="0" name="Picture 8"/>
+                    <pic:cNvPicPr>
+                      <a:picLocks noChangeAspect="1" noChangeArrowheads="1"/>
+                    </pic:cNvPicPr>
+                  </pic:nvPicPr>
+                  <pic:blipFill>
+                    <a:blip r:embed="rId63">
+                      <a:extLst>
+                        <a:ext uri="{28A0092B-C50C-407E-A947-70E740481C1C}">
+                          <a14:useLocalDpi xmlns:a14="http://schemas.microsoft.com/office/drawing/2010/main" val="0"/>
+                        </a:ext>
+                      </a:extLst>
+                    </a:blip>
+                    <a:srcRect/>
+                    <a:stretch>
+                      <a:fillRect/>
+                    </a:stretch>
+                  </pic:blipFill>
+                  <pic:spPr bwMode="auto">
+                    <a:xfrm>
+                      <a:off x="0" y="0"/>
+                      <a:ext cx="3399780" cy="1434971"/>
+                    </a:xfrm>
+                    <a:prstGeom prst="rect">
+                      <a:avLst/>
+                    </a:prstGeom>
+                    <a:noFill/>
+                  </pic:spPr>
+                </pic:pic>
+              </a:graphicData>
+            </a:graphic>
+          </wp:inline>
+        </w:drawing>
+      </w:r>
+    </w:p>
+    <w:p>
+      <w:pPr>
+        <w:jc w:val="center"/>
+      </w:pPr>
+      <w:r>
+        <w:rPr>
+          <w:noProof/>
+        </w:rPr>
+        <w:drawing>
+          <wp:inline distT="0" distB="0" distL="0" distR="0" wp14:anchorId="43085392">
+            <wp:extent cx="6134953" cy="2844883"/>
+            <wp:effectExtent l="0" t="0" r="0" b="0"/>
+            <wp:docPr id="58" name="Imagem 58"/>
+            <wp:cNvGraphicFramePr>
+              <a:graphicFrameLocks xmlns:a="http://schemas.openxmlformats.org/drawingml/2006/main" noChangeAspect="1"/>
+            </wp:cNvGraphicFramePr>
+            <a:graphic xmlns:a="http://schemas.openxmlformats.org/drawingml/2006/main">
+              <a:graphicData uri="http://schemas.openxmlformats.org/drawingml/2006/picture">
+                <pic:pic xmlns:pic="http://schemas.openxmlformats.org/drawingml/2006/picture">
+                  <pic:nvPicPr>
+                    <pic:cNvPr id="0" name="Picture 9"/>
+                    <pic:cNvPicPr>
+                      <a:picLocks noChangeAspect="1" noChangeArrowheads="1"/>
+                    </pic:cNvPicPr>
+                  </pic:nvPicPr>
+                  <pic:blipFill>
+                    <a:blip r:embed="rId64">
+                      <a:extLst>
+                        <a:ext uri="{28A0092B-C50C-407E-A947-70E740481C1C}">
+                          <a14:useLocalDpi xmlns:a14="http://schemas.microsoft.com/office/drawing/2010/main" val="0"/>
+                        </a:ext>
+                      </a:extLst>
+                    </a:blip>
+                    <a:srcRect/>
+                    <a:stretch>
+                      <a:fillRect/>
+                    </a:stretch>
+                  </pic:blipFill>
+                  <pic:spPr bwMode="auto">
+                    <a:xfrm>
+                      <a:off x="0" y="0"/>
+                      <a:ext cx="6173306" cy="2862668"/>
+                    </a:xfrm>
+                    <a:prstGeom prst="rect">
+                      <a:avLst/>
+                    </a:prstGeom>
+                    <a:noFill/>
+                  </pic:spPr>
+                </pic:pic>
+              </a:graphicData>
+            </a:graphic>
+          </wp:inline>
+        </w:drawing>
+      </w:r>
+    </w:p>
+    <w:p>
+      <w:pPr>
+        <w:jc w:val="center"/>
+      </w:pPr>
+    </w:p>
+    <w:p>
+      <w:pPr>
+        <w:jc w:val="center"/>
+      </w:pPr>
+    </w:p>
+    <w:p>
+      <w:pPr>
+        <w:jc w:val="center"/>
+      </w:pPr>
+    </w:p>
+    <w:p>
+      <w:pPr>
+        <w:jc w:val="center"/>
+      </w:pPr>
+    </w:p>
+    <w:p>
+      <w:r>
+        <w:t xml:space="preserve">Para centralizar o texto de cada item da lista utilizamos o </w:t>
+      </w:r>
+      <w:proofErr w:type="spellStart"/>
+      <w:r>
+        <w:t>text-align</w:t>
+      </w:r>
+      <w:proofErr w:type="spellEnd"/>
+      <w:r>
+        <w:t xml:space="preserve"> center em produtos li.</w:t>
+      </w:r>
+    </w:p>
+    <w:p>
+      <w:pPr>
+        <w:jc w:val="center"/>
+      </w:pPr>
+      <w:r>
+        <w:rPr>
+          <w:noProof/>
+        </w:rPr>
+        <w:drawing>
+          <wp:inline distT="0" distB="0" distL="0" distR="0" wp14:anchorId="16A01E6B">
+            <wp:extent cx="3452740" cy="1200150"/>
+            <wp:effectExtent l="0" t="0" r="0" b="0"/>
+            <wp:docPr id="59" name="Imagem 59"/>
+            <wp:cNvGraphicFramePr>
+              <a:graphicFrameLocks xmlns:a="http://schemas.openxmlformats.org/drawingml/2006/main" noChangeAspect="1"/>
+            </wp:cNvGraphicFramePr>
+            <a:graphic xmlns:a="http://schemas.openxmlformats.org/drawingml/2006/main">
+              <a:graphicData uri="http://schemas.openxmlformats.org/drawingml/2006/picture">
+                <pic:pic xmlns:pic="http://schemas.openxmlformats.org/drawingml/2006/picture">
+                  <pic:nvPicPr>
+                    <pic:cNvPr id="0" name="Picture 10"/>
+                    <pic:cNvPicPr>
+                      <a:picLocks noChangeAspect="1" noChangeArrowheads="1"/>
+                    </pic:cNvPicPr>
+                  </pic:nvPicPr>
+                  <pic:blipFill>
+                    <a:blip r:embed="rId65">
+                      <a:extLst>
+                        <a:ext uri="{28A0092B-C50C-407E-A947-70E740481C1C}">
+                          <a14:useLocalDpi xmlns:a14="http://schemas.microsoft.com/office/drawing/2010/main" val="0"/>
+                        </a:ext>
+                      </a:extLst>
+                    </a:blip>
+                    <a:srcRect/>
+                    <a:stretch>
+                      <a:fillRect/>
+                    </a:stretch>
+                  </pic:blipFill>
+                  <pic:spPr bwMode="auto">
+                    <a:xfrm>
+                      <a:off x="0" y="0"/>
+                      <a:ext cx="3501844" cy="1217218"/>
+                    </a:xfrm>
+                    <a:prstGeom prst="rect">
+                      <a:avLst/>
+                    </a:prstGeom>
+                    <a:noFill/>
+                  </pic:spPr>
+                </pic:pic>
+              </a:graphicData>
+            </a:graphic>
+          </wp:inline>
+        </w:drawing>
+      </w:r>
+    </w:p>
+    <w:p/>
+    <w:p>
+      <w:r>
+        <w:rPr>
+          <w:noProof/>
+        </w:rPr>
+        <w:drawing>
+          <wp:inline distT="0" distB="0" distL="0" distR="0" wp14:anchorId="7A4434CA">
+            <wp:extent cx="5869417" cy="1952625"/>
+            <wp:effectExtent l="0" t="0" r="0" b="0"/>
+            <wp:docPr id="60" name="Imagem 60"/>
+            <wp:cNvGraphicFramePr>
+              <a:graphicFrameLocks xmlns:a="http://schemas.openxmlformats.org/drawingml/2006/main" noChangeAspect="1"/>
+            </wp:cNvGraphicFramePr>
+            <a:graphic xmlns:a="http://schemas.openxmlformats.org/drawingml/2006/main">
+              <a:graphicData uri="http://schemas.openxmlformats.org/drawingml/2006/picture">
+                <pic:pic xmlns:pic="http://schemas.openxmlformats.org/drawingml/2006/picture">
+                  <pic:nvPicPr>
+                    <pic:cNvPr id="0" name="Picture 11"/>
+                    <pic:cNvPicPr>
+                      <a:picLocks noChangeAspect="1" noChangeArrowheads="1"/>
+                    </pic:cNvPicPr>
+                  </pic:nvPicPr>
+                  <pic:blipFill>
+                    <a:blip r:embed="rId66">
+                      <a:extLst>
+                        <a:ext uri="{28A0092B-C50C-407E-A947-70E740481C1C}">
+                          <a14:useLocalDpi xmlns:a14="http://schemas.microsoft.com/office/drawing/2010/main" val="0"/>
+                        </a:ext>
+                      </a:extLst>
+                    </a:blip>
+                    <a:srcRect/>
+                    <a:stretch>
+                      <a:fillRect/>
+                    </a:stretch>
+                  </pic:blipFill>
+                  <pic:spPr bwMode="auto">
+                    <a:xfrm>
+                      <a:off x="0" y="0"/>
+                      <a:ext cx="5907178" cy="1965187"/>
+                    </a:xfrm>
+                    <a:prstGeom prst="rect">
+                      <a:avLst/>
+                    </a:prstGeom>
+                    <a:noFill/>
+                  </pic:spPr>
+                </pic:pic>
+              </a:graphicData>
+            </a:graphic>
+          </wp:inline>
+        </w:drawing>
+      </w:r>
+    </w:p>
+    <w:p>
+      <w:r>
+        <w:t>36-</w:t>
+      </w:r>
+      <w:r>
+        <w:t>Determinamos que cada item da lista produtos ocupará 30% de largura e alinhamos o texto na parte superior.</w:t>
+      </w:r>
+    </w:p>
+    <w:p>
+      <w:r>
+        <w:rPr>
+          <w:noProof/>
+        </w:rPr>
+        <w:drawing>
+          <wp:inline distT="0" distB="0" distL="0" distR="0" wp14:anchorId="53C0478A">
+            <wp:extent cx="2923282" cy="1743075"/>
+            <wp:effectExtent l="0" t="0" r="0" b="0"/>
+            <wp:docPr id="62" name="Imagem 62"/>
+            <wp:cNvGraphicFramePr>
+              <a:graphicFrameLocks xmlns:a="http://schemas.openxmlformats.org/drawingml/2006/main" noChangeAspect="1"/>
+            </wp:cNvGraphicFramePr>
+            <a:graphic xmlns:a="http://schemas.openxmlformats.org/drawingml/2006/main">
+              <a:graphicData uri="http://schemas.openxmlformats.org/drawingml/2006/picture">
+                <pic:pic xmlns:pic="http://schemas.openxmlformats.org/drawingml/2006/picture">
+                  <pic:nvPicPr>
+                    <pic:cNvPr id="0" name="Picture 12"/>
+                    <pic:cNvPicPr>
+                      <a:picLocks noChangeAspect="1" noChangeArrowheads="1"/>
+                    </pic:cNvPicPr>
+                  </pic:nvPicPr>
+                  <pic:blipFill>
+                    <a:blip r:embed="rId67">
+                      <a:extLst>
+                        <a:ext uri="{28A0092B-C50C-407E-A947-70E740481C1C}">
+                          <a14:useLocalDpi xmlns:a14="http://schemas.microsoft.com/office/drawing/2010/main" val="0"/>
+                        </a:ext>
+                      </a:extLst>
+                    </a:blip>
+                    <a:srcRect/>
+                    <a:stretch>
+                      <a:fillRect/>
+                    </a:stretch>
+                  </pic:blipFill>
+                  <pic:spPr bwMode="auto">
+                    <a:xfrm>
+                      <a:off x="0" y="0"/>
+                      <a:ext cx="2951565" cy="1759939"/>
+                    </a:xfrm>
+                    <a:prstGeom prst="rect">
+                      <a:avLst/>
+                    </a:prstGeom>
+                    <a:noFill/>
+                  </pic:spPr>
+                </pic:pic>
+              </a:graphicData>
+            </a:graphic>
+          </wp:inline>
+        </w:drawing>
+      </w:r>
+    </w:p>
+    <w:p/>
+    <w:p>
+      <w:r>
+        <w:t xml:space="preserve">37- Utilizamos o </w:t>
+      </w:r>
+      <w:proofErr w:type="spellStart"/>
+      <w:r>
+        <w:t>css</w:t>
+      </w:r>
+      <w:proofErr w:type="spellEnd"/>
+      <w:r>
+        <w:t xml:space="preserve"> através de referência por exemplo utilizamos o nome da classe </w:t>
+      </w:r>
+      <w:proofErr w:type="gramStart"/>
+      <w:r>
+        <w:t>o elementos</w:t>
+      </w:r>
+      <w:proofErr w:type="gramEnd"/>
+      <w:r>
+        <w:t>.</w:t>
+      </w:r>
+    </w:p>
+    <w:p>
+      <w:r>
+        <w:t xml:space="preserve">Aumentamos o tamanho da fonte e deixando o texto mais incorporado </w:t>
+      </w:r>
+    </w:p>
+    <w:p>
+      <w:r>
+        <w:rPr>
+          <w:noProof/>
+        </w:rPr>
+        <w:drawing>
+          <wp:inline distT="0" distB="0" distL="0" distR="0" wp14:anchorId="75875A74">
+            <wp:extent cx="2952750" cy="1275880"/>
+            <wp:effectExtent l="0" t="0" r="0" b="635"/>
+            <wp:docPr id="63" name="Imagem 63"/>
+            <wp:cNvGraphicFramePr>
+              <a:graphicFrameLocks xmlns:a="http://schemas.openxmlformats.org/drawingml/2006/main" noChangeAspect="1"/>
+            </wp:cNvGraphicFramePr>
+            <a:graphic xmlns:a="http://schemas.openxmlformats.org/drawingml/2006/main">
+              <a:graphicData uri="http://schemas.openxmlformats.org/drawingml/2006/picture">
+                <pic:pic xmlns:pic="http://schemas.openxmlformats.org/drawingml/2006/picture">
+                  <pic:nvPicPr>
+                    <pic:cNvPr id="0" name="Picture 13"/>
+                    <pic:cNvPicPr>
+                      <a:picLocks noChangeAspect="1" noChangeArrowheads="1"/>
+                    </pic:cNvPicPr>
+                  </pic:nvPicPr>
+                  <pic:blipFill>
+                    <a:blip r:embed="rId68">
+                      <a:extLst>
+                        <a:ext uri="{28A0092B-C50C-407E-A947-70E740481C1C}">
+                          <a14:useLocalDpi xmlns:a14="http://schemas.microsoft.com/office/drawing/2010/main" val="0"/>
+                        </a:ext>
+                      </a:extLst>
+                    </a:blip>
+                    <a:srcRect/>
+                    <a:stretch>
+                      <a:fillRect/>
+                    </a:stretch>
+                  </pic:blipFill>
+                  <pic:spPr bwMode="auto">
+                    <a:xfrm>
+                      <a:off x="0" y="0"/>
+                      <a:ext cx="2996935" cy="1294972"/>
+                    </a:xfrm>
+                    <a:prstGeom prst="rect">
+                      <a:avLst/>
+                    </a:prstGeom>
+                    <a:noFill/>
+                  </pic:spPr>
+                </pic:pic>
+              </a:graphicData>
+            </a:graphic>
+          </wp:inline>
+        </w:drawing>
+      </w:r>
+    </w:p>
+    <w:p/>
+    <w:p>
+      <w:r>
+        <w:t xml:space="preserve">38- Nos parágrafos da lista dos produtos adicionamos as </w:t>
+      </w:r>
+      <w:proofErr w:type="spellStart"/>
+      <w:r>
+        <w:t>class</w:t>
+      </w:r>
+      <w:proofErr w:type="spellEnd"/>
+      <w:r>
+        <w:t xml:space="preserve"> descrição e </w:t>
+      </w:r>
+      <w:proofErr w:type="spellStart"/>
+      <w:r>
+        <w:t>preco</w:t>
+      </w:r>
+      <w:proofErr w:type="spellEnd"/>
+      <w:r>
+        <w:t xml:space="preserve"> para trabalhar com esses dois elementos conforme código abaixo:</w:t>
+      </w:r>
+    </w:p>
+    <w:p>
+      <w:r>
+        <w:rPr>
+          <w:noProof/>
+        </w:rPr>
+        <w:drawing>
+          <wp:inline distT="0" distB="0" distL="0" distR="0" wp14:anchorId="10D8E4BC">
+            <wp:extent cx="2124075" cy="1351684"/>
+            <wp:effectExtent l="0" t="0" r="0" b="1270"/>
+            <wp:docPr id="64" name="Imagem 64"/>
+            <wp:cNvGraphicFramePr>
+              <a:graphicFrameLocks xmlns:a="http://schemas.openxmlformats.org/drawingml/2006/main" noChangeAspect="1"/>
+            </wp:cNvGraphicFramePr>
+            <a:graphic xmlns:a="http://schemas.openxmlformats.org/drawingml/2006/main">
+              <a:graphicData uri="http://schemas.openxmlformats.org/drawingml/2006/picture">
+                <pic:pic xmlns:pic="http://schemas.openxmlformats.org/drawingml/2006/picture">
+                  <pic:nvPicPr>
+                    <pic:cNvPr id="0" name="Picture 14"/>
+                    <pic:cNvPicPr>
+                      <a:picLocks noChangeAspect="1" noChangeArrowheads="1"/>
+                    </pic:cNvPicPr>
+                  </pic:nvPicPr>
+                  <pic:blipFill>
+                    <a:blip r:embed="rId69">
+                      <a:extLst>
+                        <a:ext uri="{28A0092B-C50C-407E-A947-70E740481C1C}">
+                          <a14:useLocalDpi xmlns:a14="http://schemas.microsoft.com/office/drawing/2010/main" val="0"/>
+                        </a:ext>
+                      </a:extLst>
+                    </a:blip>
+                    <a:srcRect/>
+                    <a:stretch>
+                      <a:fillRect/>
+                    </a:stretch>
+                  </pic:blipFill>
+                  <pic:spPr bwMode="auto">
+                    <a:xfrm>
+                      <a:off x="0" y="0"/>
+                      <a:ext cx="2133316" cy="1357565"/>
+                    </a:xfrm>
+                    <a:prstGeom prst="rect">
+                      <a:avLst/>
+                    </a:prstGeom>
+                    <a:noFill/>
+                  </pic:spPr>
+                </pic:pic>
+              </a:graphicData>
+            </a:graphic>
+          </wp:inline>
+        </w:drawing>
+      </w:r>
+    </w:p>
+    <w:p/>
+    <w:p>
+      <w:r>
+        <w:t>39-No produto li inserimos uma cor de fundo e demos uma distancia de 1</w:t>
+      </w:r>
+      <w:r>
+        <w:t xml:space="preserve">,5% tanto para direita como para esquerda utilizando </w:t>
+      </w:r>
+      <w:proofErr w:type="spellStart"/>
+      <w:r>
+        <w:t>margin</w:t>
+      </w:r>
+      <w:proofErr w:type="spellEnd"/>
+      <w:r>
+        <w:t>.</w:t>
+      </w:r>
+    </w:p>
+    <w:p>
+      <w:bookmarkStart w:id="0" w:name="_GoBack"/>
+      <w:r>
+        <w:rPr>
+          <w:noProof/>
+        </w:rPr>
+        <w:drawing>
+          <wp:inline distT="0" distB="0" distL="0" distR="0" wp14:anchorId="1E4A29C7">
+            <wp:extent cx="2533106" cy="1704975"/>
+            <wp:effectExtent l="0" t="0" r="635" b="0"/>
+            <wp:docPr id="65" name="Imagem 65"/>
+            <wp:cNvGraphicFramePr>
+              <a:graphicFrameLocks xmlns:a="http://schemas.openxmlformats.org/drawingml/2006/main" noChangeAspect="1"/>
+            </wp:cNvGraphicFramePr>
+            <a:graphic xmlns:a="http://schemas.openxmlformats.org/drawingml/2006/main">
+              <a:graphicData uri="http://schemas.openxmlformats.org/drawingml/2006/picture">
+                <pic:pic xmlns:pic="http://schemas.openxmlformats.org/drawingml/2006/picture">
+                  <pic:nvPicPr>
+                    <pic:cNvPr id="0" name="Picture 15"/>
+                    <pic:cNvPicPr>
+                      <a:picLocks noChangeAspect="1" noChangeArrowheads="1"/>
+                    </pic:cNvPicPr>
+                  </pic:nvPicPr>
+                  <pic:blipFill>
+                    <a:blip r:embed="rId70">
+                      <a:extLst>
+                        <a:ext uri="{28A0092B-C50C-407E-A947-70E740481C1C}">
+                          <a14:useLocalDpi xmlns:a14="http://schemas.microsoft.com/office/drawing/2010/main" val="0"/>
+                        </a:ext>
+                      </a:extLst>
+                    </a:blip>
+                    <a:srcRect/>
+                    <a:stretch>
+                      <a:fillRect/>
+                    </a:stretch>
+                  </pic:blipFill>
+                  <pic:spPr bwMode="auto">
+                    <a:xfrm>
+                      <a:off x="0" y="0"/>
+                      <a:ext cx="2547386" cy="1714586"/>
+                    </a:xfrm>
+                    <a:prstGeom prst="rect">
+                      <a:avLst/>
+                    </a:prstGeom>
+                    <a:noFill/>
+                  </pic:spPr>
+                </pic:pic>
+              </a:graphicData>
+            </a:graphic>
+          </wp:inline>
+        </w:drawing>
+      </w:r>
+      <w:bookmarkEnd w:id="0"/>
+      <w:r>
+        <w:rPr>
+          <w:noProof/>
+        </w:rPr>
+        <w:drawing>
+          <wp:inline distT="0" distB="0" distL="0" distR="0" wp14:anchorId="6E06CD97">
+            <wp:extent cx="4839970" cy="1795048"/>
+            <wp:effectExtent l="0" t="0" r="0" b="0"/>
+            <wp:docPr id="66" name="Imagem 66"/>
+            <wp:cNvGraphicFramePr>
+              <a:graphicFrameLocks xmlns:a="http://schemas.openxmlformats.org/drawingml/2006/main" noChangeAspect="1"/>
+            </wp:cNvGraphicFramePr>
+            <a:graphic xmlns:a="http://schemas.openxmlformats.org/drawingml/2006/main">
+              <a:graphicData uri="http://schemas.openxmlformats.org/drawingml/2006/picture">
+                <pic:pic xmlns:pic="http://schemas.openxmlformats.org/drawingml/2006/picture">
+                  <pic:nvPicPr>
+                    <pic:cNvPr id="0" name="Picture 16"/>
+                    <pic:cNvPicPr>
+                      <a:picLocks noChangeAspect="1" noChangeArrowheads="1"/>
+                    </pic:cNvPicPr>
+                  </pic:nvPicPr>
+                  <pic:blipFill>
+                    <a:blip r:embed="rId71">
+                      <a:extLst>
+                        <a:ext uri="{28A0092B-C50C-407E-A947-70E740481C1C}">
+                          <a14:useLocalDpi xmlns:a14="http://schemas.microsoft.com/office/drawing/2010/main" val="0"/>
+                        </a:ext>
+                      </a:extLst>
+                    </a:blip>
+                    <a:srcRect/>
+                    <a:stretch>
+                      <a:fillRect/>
+                    </a:stretch>
+                  </pic:blipFill>
+                  <pic:spPr bwMode="auto">
+                    <a:xfrm>
+                      <a:off x="0" y="0"/>
+                      <a:ext cx="4869954" cy="1806168"/>
                     </a:xfrm>
                     <a:prstGeom prst="rect">
                       <a:avLst/>
@@ -1846,7 +6301,7 @@
 </file>
 
 <file path=customXml/itemProps1.xml><?xml version="1.0" encoding="utf-8"?>
-<ds:datastoreItem xmlns:ds="http://schemas.openxmlformats.org/officeDocument/2006/customXml" ds:itemID="{AA14F764-B40C-422B-B16B-C8F6DD120A2F}">
+<ds:datastoreItem xmlns:ds="http://schemas.openxmlformats.org/officeDocument/2006/customXml" ds:itemID="{5C04700D-2F48-4303-8337-8601F5280F8A}">
   <ds:schemaRefs>
     <ds:schemaRef ds:uri="http://schemas.openxmlformats.org/officeDocument/2006/bibliography"/>
   </ds:schemaRefs>

</xml_diff>

<commit_message>
atualização da aula 08/09/2026
</commit_message>
<xml_diff>
--- a/Apostila/Projeto Space for Men.docx
+++ b/Apostila/Projeto Space for Men.docx
@@ -4104,6 +4104,9 @@
         <w:jc w:val="center"/>
       </w:pPr>
       <w:r>
+        <w:rPr>
+          <w:noProof/>
+        </w:rPr>
         <w:drawing>
           <wp:inline distT="0" distB="0" distL="0" distR="0" wp14:anchorId="5164AC14" wp14:editId="58240916">
             <wp:extent cx="2162175" cy="1207448"/>
@@ -4568,6 +4571,9 @@
         <w:t xml:space="preserve">           </w:t>
       </w:r>
       <w:r>
+        <w:rPr>
+          <w:noProof/>
+        </w:rPr>
         <w:drawing>
           <wp:inline distT="0" distB="0" distL="0" distR="0" wp14:anchorId="3A4A3AD3" wp14:editId="4CBF93C8">
             <wp:extent cx="3277057" cy="2619741"/>
@@ -4986,10 +4992,7 @@
     </w:p>
     <w:p>
       <w:r>
-        <w:t>36-</w:t>
-      </w:r>
-      <w:r>
-        <w:t>Determinamos que cada item da lista produtos ocupará 30% de largura e alinhamos o texto na parte superior.</w:t>
+        <w:t>36-Determinamos que cada item da lista produtos ocupará 30% de largura e alinhamos o texto na parte superior.</w:t>
       </w:r>
     </w:p>
     <w:p>
@@ -5215,7 +5218,6 @@
       </w:r>
     </w:p>
     <w:p>
-      <w:bookmarkStart w:id="0" w:name="_GoBack"/>
       <w:r>
         <w:rPr>
           <w:noProof/>
@@ -5266,7 +5268,6 @@
           </wp:inline>
         </w:drawing>
       </w:r>
-      <w:bookmarkEnd w:id="0"/>
       <w:r>
         <w:rPr>
           <w:noProof/>
@@ -5317,6 +5318,758 @@
           </wp:inline>
         </w:drawing>
       </w:r>
+    </w:p>
+    <w:p/>
+    <w:p>
+      <w:r>
+        <w:t xml:space="preserve">40-Na </w:t>
+      </w:r>
+      <w:proofErr w:type="spellStart"/>
+      <w:r>
+        <w:t>class</w:t>
+      </w:r>
+      <w:proofErr w:type="spellEnd"/>
+      <w:r>
+        <w:t xml:space="preserve"> produtos inserimos um espaço interno que aumentou o tamanho tanto para cima como baixo.</w:t>
+      </w:r>
+    </w:p>
+    <w:p>
+      <w:r>
+        <w:drawing>
+          <wp:inline distT="0" distB="0" distL="0" distR="0" wp14:anchorId="68FBAB01" wp14:editId="61F11003">
+            <wp:extent cx="1965871" cy="1276350"/>
+            <wp:effectExtent l="0" t="0" r="0" b="0"/>
+            <wp:docPr id="61" name="Imagem 61"/>
+            <wp:cNvGraphicFramePr>
+              <a:graphicFrameLocks xmlns:a="http://schemas.openxmlformats.org/drawingml/2006/main" noChangeAspect="1"/>
+            </wp:cNvGraphicFramePr>
+            <a:graphic xmlns:a="http://schemas.openxmlformats.org/drawingml/2006/main">
+              <a:graphicData uri="http://schemas.openxmlformats.org/drawingml/2006/picture">
+                <pic:pic xmlns:pic="http://schemas.openxmlformats.org/drawingml/2006/picture">
+                  <pic:nvPicPr>
+                    <pic:cNvPr id="1" name=""/>
+                    <pic:cNvPicPr/>
+                  </pic:nvPicPr>
+                  <pic:blipFill>
+                    <a:blip r:embed="rId72"/>
+                    <a:stretch>
+                      <a:fillRect/>
+                    </a:stretch>
+                  </pic:blipFill>
+                  <pic:spPr>
+                    <a:xfrm>
+                      <a:off x="0" y="0"/>
+                      <a:ext cx="2003377" cy="1300701"/>
+                    </a:xfrm>
+                    <a:prstGeom prst="rect">
+                      <a:avLst/>
+                    </a:prstGeom>
+                  </pic:spPr>
+                </pic:pic>
+              </a:graphicData>
+            </a:graphic>
+          </wp:inline>
+        </w:drawing>
+      </w:r>
+      <w:r>
+        <w:rPr>
+          <w:noProof/>
+        </w:rPr>
+        <w:drawing>
+          <wp:inline distT="0" distB="0" distL="0" distR="0" wp14:anchorId="3A6E3048">
+            <wp:extent cx="2865204" cy="1790700"/>
+            <wp:effectExtent l="0" t="0" r="0" b="0"/>
+            <wp:docPr id="67" name="Imagem 67"/>
+            <wp:cNvGraphicFramePr>
+              <a:graphicFrameLocks xmlns:a="http://schemas.openxmlformats.org/drawingml/2006/main" noChangeAspect="1"/>
+            </wp:cNvGraphicFramePr>
+            <a:graphic xmlns:a="http://schemas.openxmlformats.org/drawingml/2006/main">
+              <a:graphicData uri="http://schemas.openxmlformats.org/drawingml/2006/picture">
+                <pic:pic xmlns:pic="http://schemas.openxmlformats.org/drawingml/2006/picture">
+                  <pic:nvPicPr>
+                    <pic:cNvPr id="0" name="Picture 2"/>
+                    <pic:cNvPicPr>
+                      <a:picLocks noChangeAspect="1" noChangeArrowheads="1"/>
+                    </pic:cNvPicPr>
+                  </pic:nvPicPr>
+                  <pic:blipFill>
+                    <a:blip r:embed="rId73" cstate="print">
+                      <a:extLst>
+                        <a:ext uri="{28A0092B-C50C-407E-A947-70E740481C1C}">
+                          <a14:useLocalDpi xmlns:a14="http://schemas.microsoft.com/office/drawing/2010/main" val="0"/>
+                        </a:ext>
+                      </a:extLst>
+                    </a:blip>
+                    <a:srcRect/>
+                    <a:stretch>
+                      <a:fillRect/>
+                    </a:stretch>
+                  </pic:blipFill>
+                  <pic:spPr bwMode="auto">
+                    <a:xfrm>
+                      <a:off x="0" y="0"/>
+                      <a:ext cx="2881443" cy="1800849"/>
+                    </a:xfrm>
+                    <a:prstGeom prst="rect">
+                      <a:avLst/>
+                    </a:prstGeom>
+                    <a:noFill/>
+                  </pic:spPr>
+                </pic:pic>
+              </a:graphicData>
+            </a:graphic>
+          </wp:inline>
+        </w:drawing>
+      </w:r>
+    </w:p>
+    <w:p>
+      <w:r>
+        <w:t>41-</w:t>
+      </w:r>
+      <w:r>
+        <w:t xml:space="preserve"> </w:t>
+      </w:r>
+      <w:proofErr w:type="gramStart"/>
+      <w:r>
+        <w:t>No produtos</w:t>
+      </w:r>
+      <w:proofErr w:type="gramEnd"/>
+      <w:r>
+        <w:t xml:space="preserve"> li adicionamos um espaço </w:t>
+      </w:r>
+      <w:r>
+        <w:t>interno para cima com para baixo e para direita e esquerda</w:t>
+      </w:r>
+    </w:p>
+    <w:p>
+      <w:r>
+        <w:rPr>
+          <w:noProof/>
+        </w:rPr>
+        <w:drawing>
+          <wp:inline distT="0" distB="0" distL="0" distR="0" wp14:anchorId="44E28B6A">
+            <wp:extent cx="2675255" cy="2860285"/>
+            <wp:effectExtent l="0" t="0" r="0" b="0"/>
+            <wp:docPr id="69" name="Imagem 69"/>
+            <wp:cNvGraphicFramePr>
+              <a:graphicFrameLocks xmlns:a="http://schemas.openxmlformats.org/drawingml/2006/main" noChangeAspect="1"/>
+            </wp:cNvGraphicFramePr>
+            <a:graphic xmlns:a="http://schemas.openxmlformats.org/drawingml/2006/main">
+              <a:graphicData uri="http://schemas.openxmlformats.org/drawingml/2006/picture">
+                <pic:pic xmlns:pic="http://schemas.openxmlformats.org/drawingml/2006/picture">
+                  <pic:nvPicPr>
+                    <pic:cNvPr id="0" name="Picture 4"/>
+                    <pic:cNvPicPr>
+                      <a:picLocks noChangeAspect="1" noChangeArrowheads="1"/>
+                    </pic:cNvPicPr>
+                  </pic:nvPicPr>
+                  <pic:blipFill>
+                    <a:blip r:embed="rId74">
+                      <a:extLst>
+                        <a:ext uri="{28A0092B-C50C-407E-A947-70E740481C1C}">
+                          <a14:useLocalDpi xmlns:a14="http://schemas.microsoft.com/office/drawing/2010/main" val="0"/>
+                        </a:ext>
+                      </a:extLst>
+                    </a:blip>
+                    <a:srcRect/>
+                    <a:stretch>
+                      <a:fillRect/>
+                    </a:stretch>
+                  </pic:blipFill>
+                  <pic:spPr bwMode="auto">
+                    <a:xfrm>
+                      <a:off x="0" y="0"/>
+                      <a:ext cx="2744951" cy="2934801"/>
+                    </a:xfrm>
+                    <a:prstGeom prst="rect">
+                      <a:avLst/>
+                    </a:prstGeom>
+                    <a:noFill/>
+                  </pic:spPr>
+                </pic:pic>
+              </a:graphicData>
+            </a:graphic>
+          </wp:inline>
+        </w:drawing>
+      </w:r>
+      <w:r>
+        <w:rPr>
+          <w:noProof/>
+        </w:rPr>
+        <w:drawing>
+          <wp:inline distT="0" distB="0" distL="0" distR="0" wp14:anchorId="6BD8046D">
+            <wp:extent cx="2723281" cy="3095625"/>
+            <wp:effectExtent l="0" t="0" r="1270" b="0"/>
+            <wp:docPr id="70" name="Imagem 70"/>
+            <wp:cNvGraphicFramePr>
+              <a:graphicFrameLocks xmlns:a="http://schemas.openxmlformats.org/drawingml/2006/main" noChangeAspect="1"/>
+            </wp:cNvGraphicFramePr>
+            <a:graphic xmlns:a="http://schemas.openxmlformats.org/drawingml/2006/main">
+              <a:graphicData uri="http://schemas.openxmlformats.org/drawingml/2006/picture">
+                <pic:pic xmlns:pic="http://schemas.openxmlformats.org/drawingml/2006/picture">
+                  <pic:nvPicPr>
+                    <pic:cNvPr id="0" name="Picture 5"/>
+                    <pic:cNvPicPr>
+                      <a:picLocks noChangeAspect="1" noChangeArrowheads="1"/>
+                    </pic:cNvPicPr>
+                  </pic:nvPicPr>
+                  <pic:blipFill>
+                    <a:blip r:embed="rId75">
+                      <a:extLst>
+                        <a:ext uri="{28A0092B-C50C-407E-A947-70E740481C1C}">
+                          <a14:useLocalDpi xmlns:a14="http://schemas.microsoft.com/office/drawing/2010/main" val="0"/>
+                        </a:ext>
+                      </a:extLst>
+                    </a:blip>
+                    <a:srcRect/>
+                    <a:stretch>
+                      <a:fillRect/>
+                    </a:stretch>
+                  </pic:blipFill>
+                  <pic:spPr bwMode="auto">
+                    <a:xfrm>
+                      <a:off x="0" y="0"/>
+                      <a:ext cx="2735959" cy="3110036"/>
+                    </a:xfrm>
+                    <a:prstGeom prst="rect">
+                      <a:avLst/>
+                    </a:prstGeom>
+                    <a:noFill/>
+                  </pic:spPr>
+                </pic:pic>
+              </a:graphicData>
+            </a:graphic>
+          </wp:inline>
+        </w:drawing>
+      </w:r>
+    </w:p>
+    <w:p/>
+    <w:p>
+      <w:r>
+        <w:t>42- Para ajustar o espaço utilizamos do box-</w:t>
+      </w:r>
+      <w:proofErr w:type="spellStart"/>
+      <w:r>
+        <w:t>sizing</w:t>
+      </w:r>
+      <w:proofErr w:type="spellEnd"/>
+      <w:r>
+        <w:t xml:space="preserve"> onde ele automaticamente ajustou o espaço</w:t>
+      </w:r>
+    </w:p>
+    <w:p>
+      <w:r>
+        <w:t xml:space="preserve"> </w:t>
+      </w:r>
+      <w:r>
+        <w:drawing>
+          <wp:inline distT="0" distB="0" distL="0" distR="0" wp14:anchorId="5558C442" wp14:editId="30586456">
+            <wp:extent cx="2181529" cy="1562318"/>
+            <wp:effectExtent l="0" t="0" r="9525" b="0"/>
+            <wp:docPr id="71" name="Imagem 71"/>
+            <wp:cNvGraphicFramePr>
+              <a:graphicFrameLocks xmlns:a="http://schemas.openxmlformats.org/drawingml/2006/main" noChangeAspect="1"/>
+            </wp:cNvGraphicFramePr>
+            <a:graphic xmlns:a="http://schemas.openxmlformats.org/drawingml/2006/main">
+              <a:graphicData uri="http://schemas.openxmlformats.org/drawingml/2006/picture">
+                <pic:pic xmlns:pic="http://schemas.openxmlformats.org/drawingml/2006/picture">
+                  <pic:nvPicPr>
+                    <pic:cNvPr id="1" name=""/>
+                    <pic:cNvPicPr/>
+                  </pic:nvPicPr>
+                  <pic:blipFill>
+                    <a:blip r:embed="rId76"/>
+                    <a:stretch>
+                      <a:fillRect/>
+                    </a:stretch>
+                  </pic:blipFill>
+                  <pic:spPr>
+                    <a:xfrm>
+                      <a:off x="0" y="0"/>
+                      <a:ext cx="2181529" cy="1562318"/>
+                    </a:xfrm>
+                    <a:prstGeom prst="rect">
+                      <a:avLst/>
+                    </a:prstGeom>
+                  </pic:spPr>
+                </pic:pic>
+              </a:graphicData>
+            </a:graphic>
+          </wp:inline>
+        </w:drawing>
+      </w:r>
+      <w:r>
+        <w:rPr>
+          <w:noProof/>
+        </w:rPr>
+        <w:drawing>
+          <wp:inline distT="0" distB="0" distL="0" distR="0" wp14:anchorId="15A4477B">
+            <wp:extent cx="3152775" cy="1551940"/>
+            <wp:effectExtent l="0" t="0" r="9525" b="0"/>
+            <wp:docPr id="72" name="Imagem 72"/>
+            <wp:cNvGraphicFramePr>
+              <a:graphicFrameLocks xmlns:a="http://schemas.openxmlformats.org/drawingml/2006/main" noChangeAspect="1"/>
+            </wp:cNvGraphicFramePr>
+            <a:graphic xmlns:a="http://schemas.openxmlformats.org/drawingml/2006/main">
+              <a:graphicData uri="http://schemas.openxmlformats.org/drawingml/2006/picture">
+                <pic:pic xmlns:pic="http://schemas.openxmlformats.org/drawingml/2006/picture">
+                  <pic:nvPicPr>
+                    <pic:cNvPr id="0" name="Picture 6"/>
+                    <pic:cNvPicPr>
+                      <a:picLocks noChangeAspect="1" noChangeArrowheads="1"/>
+                    </pic:cNvPicPr>
+                  </pic:nvPicPr>
+                  <pic:blipFill>
+                    <a:blip r:embed="rId77">
+                      <a:extLst>
+                        <a:ext uri="{28A0092B-C50C-407E-A947-70E740481C1C}">
+                          <a14:useLocalDpi xmlns:a14="http://schemas.microsoft.com/office/drawing/2010/main" val="0"/>
+                        </a:ext>
+                      </a:extLst>
+                    </a:blip>
+                    <a:srcRect/>
+                    <a:stretch>
+                      <a:fillRect/>
+                    </a:stretch>
+                  </pic:blipFill>
+                  <pic:spPr bwMode="auto">
+                    <a:xfrm>
+                      <a:off x="0" y="0"/>
+                      <a:ext cx="3221278" cy="1585660"/>
+                    </a:xfrm>
+                    <a:prstGeom prst="rect">
+                      <a:avLst/>
+                    </a:prstGeom>
+                    <a:noFill/>
+                  </pic:spPr>
+                </pic:pic>
+              </a:graphicData>
+            </a:graphic>
+          </wp:inline>
+        </w:drawing>
+      </w:r>
+    </w:p>
+    <w:p/>
+    <w:p>
+      <w:r>
+        <w:t xml:space="preserve">43- </w:t>
+      </w:r>
+      <w:r>
+        <w:t xml:space="preserve">Para </w:t>
+      </w:r>
+      <w:r>
+        <w:t xml:space="preserve">arrumar o espaço externo entre o texto e o preço colocamos um espaço externo </w:t>
+      </w:r>
+      <w:proofErr w:type="spellStart"/>
+      <w:r>
+        <w:t>class</w:t>
+      </w:r>
+      <w:proofErr w:type="spellEnd"/>
+      <w:r>
+        <w:t xml:space="preserve"> preço conforme imagem</w:t>
+      </w:r>
+    </w:p>
+    <w:p>
+      <w:r>
+        <w:rPr>
+          <w:noProof/>
+        </w:rPr>
+        <w:drawing>
+          <wp:inline distT="0" distB="0" distL="0" distR="0" wp14:anchorId="39961066">
+            <wp:extent cx="2414155" cy="1562100"/>
+            <wp:effectExtent l="0" t="0" r="5715" b="0"/>
+            <wp:docPr id="73" name="Imagem 73"/>
+            <wp:cNvGraphicFramePr>
+              <a:graphicFrameLocks xmlns:a="http://schemas.openxmlformats.org/drawingml/2006/main" noChangeAspect="1"/>
+            </wp:cNvGraphicFramePr>
+            <a:graphic xmlns:a="http://schemas.openxmlformats.org/drawingml/2006/main">
+              <a:graphicData uri="http://schemas.openxmlformats.org/drawingml/2006/picture">
+                <pic:pic xmlns:pic="http://schemas.openxmlformats.org/drawingml/2006/picture">
+                  <pic:nvPicPr>
+                    <pic:cNvPr id="0" name="Picture 7"/>
+                    <pic:cNvPicPr>
+                      <a:picLocks noChangeAspect="1" noChangeArrowheads="1"/>
+                    </pic:cNvPicPr>
+                  </pic:nvPicPr>
+                  <pic:blipFill>
+                    <a:blip r:embed="rId78">
+                      <a:extLst>
+                        <a:ext uri="{28A0092B-C50C-407E-A947-70E740481C1C}">
+                          <a14:useLocalDpi xmlns:a14="http://schemas.microsoft.com/office/drawing/2010/main" val="0"/>
+                        </a:ext>
+                      </a:extLst>
+                    </a:blip>
+                    <a:srcRect/>
+                    <a:stretch>
+                      <a:fillRect/>
+                    </a:stretch>
+                  </pic:blipFill>
+                  <pic:spPr bwMode="auto">
+                    <a:xfrm>
+                      <a:off x="0" y="0"/>
+                      <a:ext cx="2437369" cy="1577121"/>
+                    </a:xfrm>
+                    <a:prstGeom prst="rect">
+                      <a:avLst/>
+                    </a:prstGeom>
+                    <a:noFill/>
+                  </pic:spPr>
+                </pic:pic>
+              </a:graphicData>
+            </a:graphic>
+          </wp:inline>
+        </w:drawing>
+      </w:r>
+    </w:p>
+    <w:p/>
+    <w:p/>
+    <w:p/>
+    <w:p/>
+    <w:p>
+      <w:r>
+        <w:t>44-Tiramos a cor de fundo dos produtos li e adicionamos uma borda conforme código.</w:t>
+      </w:r>
+    </w:p>
+    <w:p>
+      <w:r>
+        <w:rPr>
+          <w:noProof/>
+        </w:rPr>
+        <w:drawing>
+          <wp:inline distT="0" distB="0" distL="0" distR="0" wp14:anchorId="7EE07B23">
+            <wp:extent cx="1952625" cy="1511988"/>
+            <wp:effectExtent l="0" t="0" r="0" b="0"/>
+            <wp:docPr id="74" name="Imagem 74"/>
+            <wp:cNvGraphicFramePr>
+              <a:graphicFrameLocks xmlns:a="http://schemas.openxmlformats.org/drawingml/2006/main" noChangeAspect="1"/>
+            </wp:cNvGraphicFramePr>
+            <a:graphic xmlns:a="http://schemas.openxmlformats.org/drawingml/2006/main">
+              <a:graphicData uri="http://schemas.openxmlformats.org/drawingml/2006/picture">
+                <pic:pic xmlns:pic="http://schemas.openxmlformats.org/drawingml/2006/picture">
+                  <pic:nvPicPr>
+                    <pic:cNvPr id="0" name="Picture 8"/>
+                    <pic:cNvPicPr>
+                      <a:picLocks noChangeAspect="1" noChangeArrowheads="1"/>
+                    </pic:cNvPicPr>
+                  </pic:nvPicPr>
+                  <pic:blipFill>
+                    <a:blip r:embed="rId79">
+                      <a:extLst>
+                        <a:ext uri="{28A0092B-C50C-407E-A947-70E740481C1C}">
+                          <a14:useLocalDpi xmlns:a14="http://schemas.microsoft.com/office/drawing/2010/main" val="0"/>
+                        </a:ext>
+                      </a:extLst>
+                    </a:blip>
+                    <a:srcRect/>
+                    <a:stretch>
+                      <a:fillRect/>
+                    </a:stretch>
+                  </pic:blipFill>
+                  <pic:spPr bwMode="auto">
+                    <a:xfrm>
+                      <a:off x="0" y="0"/>
+                      <a:ext cx="1959897" cy="1517619"/>
+                    </a:xfrm>
+                    <a:prstGeom prst="rect">
+                      <a:avLst/>
+                    </a:prstGeom>
+                    <a:noFill/>
+                  </pic:spPr>
+                </pic:pic>
+              </a:graphicData>
+            </a:graphic>
+          </wp:inline>
+        </w:drawing>
+      </w:r>
+      <w:r>
+        <w:rPr>
+          <w:noProof/>
+        </w:rPr>
+        <w:drawing>
+          <wp:inline distT="0" distB="0" distL="0" distR="0" wp14:anchorId="3537AEAE">
+            <wp:extent cx="3419475" cy="1485844"/>
+            <wp:effectExtent l="0" t="0" r="0" b="635"/>
+            <wp:docPr id="75" name="Imagem 75"/>
+            <wp:cNvGraphicFramePr>
+              <a:graphicFrameLocks xmlns:a="http://schemas.openxmlformats.org/drawingml/2006/main" noChangeAspect="1"/>
+            </wp:cNvGraphicFramePr>
+            <a:graphic xmlns:a="http://schemas.openxmlformats.org/drawingml/2006/main">
+              <a:graphicData uri="http://schemas.openxmlformats.org/drawingml/2006/picture">
+                <pic:pic xmlns:pic="http://schemas.openxmlformats.org/drawingml/2006/picture">
+                  <pic:nvPicPr>
+                    <pic:cNvPr id="0" name="Picture 9"/>
+                    <pic:cNvPicPr>
+                      <a:picLocks noChangeAspect="1" noChangeArrowheads="1"/>
+                    </pic:cNvPicPr>
+                  </pic:nvPicPr>
+                  <pic:blipFill>
+                    <a:blip r:embed="rId80">
+                      <a:extLst>
+                        <a:ext uri="{28A0092B-C50C-407E-A947-70E740481C1C}">
+                          <a14:useLocalDpi xmlns:a14="http://schemas.microsoft.com/office/drawing/2010/main" val="0"/>
+                        </a:ext>
+                      </a:extLst>
+                    </a:blip>
+                    <a:srcRect/>
+                    <a:stretch>
+                      <a:fillRect/>
+                    </a:stretch>
+                  </pic:blipFill>
+                  <pic:spPr bwMode="auto">
+                    <a:xfrm>
+                      <a:off x="0" y="0"/>
+                      <a:ext cx="3502131" cy="1521760"/>
+                    </a:xfrm>
+                    <a:prstGeom prst="rect">
+                      <a:avLst/>
+                    </a:prstGeom>
+                    <a:noFill/>
+                  </pic:spPr>
+                </pic:pic>
+              </a:graphicData>
+            </a:graphic>
+          </wp:inline>
+        </w:drawing>
+      </w:r>
+    </w:p>
+    <w:p/>
+    <w:p>
+      <w:r>
+        <w:t xml:space="preserve">45-Arredondando os cantos da nossa </w:t>
+      </w:r>
+      <w:proofErr w:type="spellStart"/>
+      <w:r>
+        <w:t>border-radius</w:t>
+      </w:r>
+      <w:proofErr w:type="spellEnd"/>
+      <w:r>
+        <w:t>: 10px</w:t>
+      </w:r>
+    </w:p>
+    <w:p>
+      <w:r>
+        <w:rPr>
+          <w:noProof/>
+        </w:rPr>
+        <w:drawing>
+          <wp:inline distT="0" distB="0" distL="0" distR="0" wp14:anchorId="40642E76">
+            <wp:extent cx="2038350" cy="1695450"/>
+            <wp:effectExtent l="0" t="0" r="0" b="0"/>
+            <wp:docPr id="76" name="Imagem 76"/>
+            <wp:cNvGraphicFramePr>
+              <a:graphicFrameLocks xmlns:a="http://schemas.openxmlformats.org/drawingml/2006/main" noChangeAspect="1"/>
+            </wp:cNvGraphicFramePr>
+            <a:graphic xmlns:a="http://schemas.openxmlformats.org/drawingml/2006/main">
+              <a:graphicData uri="http://schemas.openxmlformats.org/drawingml/2006/picture">
+                <pic:pic xmlns:pic="http://schemas.openxmlformats.org/drawingml/2006/picture">
+                  <pic:nvPicPr>
+                    <pic:cNvPr id="0" name="Picture 10"/>
+                    <pic:cNvPicPr>
+                      <a:picLocks noChangeAspect="1" noChangeArrowheads="1"/>
+                    </pic:cNvPicPr>
+                  </pic:nvPicPr>
+                  <pic:blipFill>
+                    <a:blip r:embed="rId81">
+                      <a:extLst>
+                        <a:ext uri="{28A0092B-C50C-407E-A947-70E740481C1C}">
+                          <a14:useLocalDpi xmlns:a14="http://schemas.microsoft.com/office/drawing/2010/main" val="0"/>
+                        </a:ext>
+                      </a:extLst>
+                    </a:blip>
+                    <a:srcRect/>
+                    <a:stretch>
+                      <a:fillRect/>
+                    </a:stretch>
+                  </pic:blipFill>
+                  <pic:spPr bwMode="auto">
+                    <a:xfrm>
+                      <a:off x="0" y="0"/>
+                      <a:ext cx="2038350" cy="1695450"/>
+                    </a:xfrm>
+                    <a:prstGeom prst="rect">
+                      <a:avLst/>
+                    </a:prstGeom>
+                    <a:noFill/>
+                  </pic:spPr>
+                </pic:pic>
+              </a:graphicData>
+            </a:graphic>
+          </wp:inline>
+        </w:drawing>
+      </w:r>
+    </w:p>
+    <w:p/>
+    <w:p>
+      <w:r>
+        <w:t xml:space="preserve">46-Vamos trabalhar com comportamento quando o usuário ao passar o mouse sobre o elemento ele realiza uma ação nessa situação vamos trabalhar com o menu ao passar o mouse o elemento muda de cor utilizando o </w:t>
+      </w:r>
+      <w:r>
+        <w:t>houve.</w:t>
+      </w:r>
+    </w:p>
+    <w:p>
+      <w:r>
+        <w:drawing>
+          <wp:inline distT="0" distB="0" distL="0" distR="0" wp14:anchorId="1F117F62" wp14:editId="17428746">
+            <wp:extent cx="2076450" cy="775540"/>
+            <wp:effectExtent l="0" t="0" r="0" b="5715"/>
+            <wp:docPr id="77" name="Imagem 77"/>
+            <wp:cNvGraphicFramePr>
+              <a:graphicFrameLocks xmlns:a="http://schemas.openxmlformats.org/drawingml/2006/main" noChangeAspect="1"/>
+            </wp:cNvGraphicFramePr>
+            <a:graphic xmlns:a="http://schemas.openxmlformats.org/drawingml/2006/main">
+              <a:graphicData uri="http://schemas.openxmlformats.org/drawingml/2006/picture">
+                <pic:pic xmlns:pic="http://schemas.openxmlformats.org/drawingml/2006/picture">
+                  <pic:nvPicPr>
+                    <pic:cNvPr id="1" name=""/>
+                    <pic:cNvPicPr/>
+                  </pic:nvPicPr>
+                  <pic:blipFill>
+                    <a:blip r:embed="rId82"/>
+                    <a:stretch>
+                      <a:fillRect/>
+                    </a:stretch>
+                  </pic:blipFill>
+                  <pic:spPr>
+                    <a:xfrm>
+                      <a:off x="0" y="0"/>
+                      <a:ext cx="2103349" cy="785587"/>
+                    </a:xfrm>
+                    <a:prstGeom prst="rect">
+                      <a:avLst/>
+                    </a:prstGeom>
+                  </pic:spPr>
+                </pic:pic>
+              </a:graphicData>
+            </a:graphic>
+          </wp:inline>
+        </w:drawing>
+      </w:r>
+      <w:r>
+        <w:rPr>
+          <w:noProof/>
+        </w:rPr>
+        <w:drawing>
+          <wp:inline distT="0" distB="0" distL="0" distR="0" wp14:anchorId="7F8BAEF7">
+            <wp:extent cx="2895600" cy="780905"/>
+            <wp:effectExtent l="0" t="0" r="0" b="635"/>
+            <wp:docPr id="78" name="Imagem 78"/>
+            <wp:cNvGraphicFramePr>
+              <a:graphicFrameLocks xmlns:a="http://schemas.openxmlformats.org/drawingml/2006/main" noChangeAspect="1"/>
+            </wp:cNvGraphicFramePr>
+            <a:graphic xmlns:a="http://schemas.openxmlformats.org/drawingml/2006/main">
+              <a:graphicData uri="http://schemas.openxmlformats.org/drawingml/2006/picture">
+                <pic:pic xmlns:pic="http://schemas.openxmlformats.org/drawingml/2006/picture">
+                  <pic:nvPicPr>
+                    <pic:cNvPr id="0" name="Picture 11"/>
+                    <pic:cNvPicPr>
+                      <a:picLocks noChangeAspect="1" noChangeArrowheads="1"/>
+                    </pic:cNvPicPr>
+                  </pic:nvPicPr>
+                  <pic:blipFill>
+                    <a:blip r:embed="rId83" cstate="print">
+                      <a:extLst>
+                        <a:ext uri="{28A0092B-C50C-407E-A947-70E740481C1C}">
+                          <a14:useLocalDpi xmlns:a14="http://schemas.microsoft.com/office/drawing/2010/main" val="0"/>
+                        </a:ext>
+                      </a:extLst>
+                    </a:blip>
+                    <a:srcRect/>
+                    <a:stretch>
+                      <a:fillRect/>
+                    </a:stretch>
+                  </pic:blipFill>
+                  <pic:spPr bwMode="auto">
+                    <a:xfrm>
+                      <a:off x="0" y="0"/>
+                      <a:ext cx="3215138" cy="867080"/>
+                    </a:xfrm>
+                    <a:prstGeom prst="rect">
+                      <a:avLst/>
+                    </a:prstGeom>
+                    <a:noFill/>
+                  </pic:spPr>
+                </pic:pic>
+              </a:graphicData>
+            </a:graphic>
+          </wp:inline>
+        </w:drawing>
+      </w:r>
+    </w:p>
+    <w:p/>
+    <w:p>
+      <w:r>
+        <w:t xml:space="preserve">47- Ainda trabalhando com </w:t>
+      </w:r>
+      <w:proofErr w:type="spellStart"/>
+      <w:r>
+        <w:t>hover</w:t>
+      </w:r>
+      <w:proofErr w:type="spellEnd"/>
+      <w:r>
+        <w:t xml:space="preserve"> ao passar o mouse adicionamos uma linha em cada item do menu</w:t>
+      </w:r>
+    </w:p>
+    <w:p>
+      <w:r>
+        <w:rPr>
+          <w:noProof/>
+        </w:rPr>
+        <w:drawing>
+          <wp:inline distT="0" distB="0" distL="0" distR="0" wp14:anchorId="6B6326E6">
+            <wp:extent cx="2076450" cy="647700"/>
+            <wp:effectExtent l="0" t="0" r="0" b="0"/>
+            <wp:docPr id="79" name="Imagem 79"/>
+            <wp:cNvGraphicFramePr>
+              <a:graphicFrameLocks xmlns:a="http://schemas.openxmlformats.org/drawingml/2006/main" noChangeAspect="1"/>
+            </wp:cNvGraphicFramePr>
+            <a:graphic xmlns:a="http://schemas.openxmlformats.org/drawingml/2006/main">
+              <a:graphicData uri="http://schemas.openxmlformats.org/drawingml/2006/picture">
+                <pic:pic xmlns:pic="http://schemas.openxmlformats.org/drawingml/2006/picture">
+                  <pic:nvPicPr>
+                    <pic:cNvPr id="0" name="Picture 12"/>
+                    <pic:cNvPicPr>
+                      <a:picLocks noChangeAspect="1" noChangeArrowheads="1"/>
+                    </pic:cNvPicPr>
+                  </pic:nvPicPr>
+                  <pic:blipFill>
+                    <a:blip r:embed="rId84">
+                      <a:extLst>
+                        <a:ext uri="{28A0092B-C50C-407E-A947-70E740481C1C}">
+                          <a14:useLocalDpi xmlns:a14="http://schemas.microsoft.com/office/drawing/2010/main" val="0"/>
+                        </a:ext>
+                      </a:extLst>
+                    </a:blip>
+                    <a:srcRect/>
+                    <a:stretch>
+                      <a:fillRect/>
+                    </a:stretch>
+                  </pic:blipFill>
+                  <pic:spPr bwMode="auto">
+                    <a:xfrm>
+                      <a:off x="0" y="0"/>
+                      <a:ext cx="2076450" cy="647700"/>
+                    </a:xfrm>
+                    <a:prstGeom prst="rect">
+                      <a:avLst/>
+                    </a:prstGeom>
+                    <a:noFill/>
+                  </pic:spPr>
+                </pic:pic>
+              </a:graphicData>
+            </a:graphic>
+          </wp:inline>
+        </w:drawing>
+      </w:r>
+    </w:p>
+    <w:p/>
+    <w:p/>
+    <w:p>
+      <w:r>
+        <w:t xml:space="preserve">48-Mudamos a cor </w:t>
+      </w:r>
+      <w:bookmarkStart w:id="0" w:name="_GoBack"/>
+      <w:bookmarkEnd w:id="0"/>
     </w:p>
     <w:sectPr>
       <w:pgSz w:w="11906" w:h="16838"/>
@@ -6301,7 +7054,7 @@
 </file>
 
 <file path=customXml/itemProps1.xml><?xml version="1.0" encoding="utf-8"?>
-<ds:datastoreItem xmlns:ds="http://schemas.openxmlformats.org/officeDocument/2006/customXml" ds:itemID="{5C04700D-2F48-4303-8337-8601F5280F8A}">
+<ds:datastoreItem xmlns:ds="http://schemas.openxmlformats.org/officeDocument/2006/customXml" ds:itemID="{3B88DF4A-C720-4B36-A713-1B1023A3A2B8}">
   <ds:schemaRefs>
     <ds:schemaRef ds:uri="http://schemas.openxmlformats.org/officeDocument/2006/bibliography"/>
   </ds:schemaRefs>

</xml_diff>

<commit_message>
atualização da aula 10/09/2026
</commit_message>
<xml_diff>
--- a/Apostila/Projeto Space for Men.docx
+++ b/Apostila/Projeto Space for Men.docx
@@ -5335,6 +5335,9 @@
     </w:p>
     <w:p>
       <w:r>
+        <w:rPr>
+          <w:noProof/>
+        </w:rPr>
         <w:drawing>
           <wp:inline distT="0" distB="0" distL="0" distR="0" wp14:anchorId="68FBAB01" wp14:editId="61F11003">
             <wp:extent cx="1965871" cy="1276350"/>
@@ -5562,6 +5565,9 @@
         <w:t xml:space="preserve"> </w:t>
       </w:r>
       <w:r>
+        <w:rPr>
+          <w:noProof/>
+        </w:rPr>
         <w:drawing>
           <wp:inline distT="0" distB="0" distL="0" distR="0" wp14:anchorId="5558C442" wp14:editId="30586456">
             <wp:extent cx="2181529" cy="1562318"/>
@@ -5909,6 +5915,9 @@
     </w:p>
     <w:p>
       <w:r>
+        <w:rPr>
+          <w:noProof/>
+        </w:rPr>
         <w:drawing>
           <wp:inline distT="0" distB="0" distL="0" distR="0" wp14:anchorId="1F117F62" wp14:editId="17428746">
             <wp:extent cx="2076450" cy="775540"/>
@@ -6068,8 +6077,495 @@
       <w:r>
         <w:t xml:space="preserve">48-Mudamos a cor </w:t>
       </w:r>
+      <w:r>
+        <w:t xml:space="preserve">da borda ao passar o mouse </w:t>
+      </w:r>
+    </w:p>
+    <w:p>
+      <w:r>
+        <w:drawing>
+          <wp:inline distT="0" distB="0" distL="0" distR="0" wp14:anchorId="65ED7CB0" wp14:editId="63190923">
+            <wp:extent cx="2632398" cy="704850"/>
+            <wp:effectExtent l="0" t="0" r="0" b="0"/>
+            <wp:docPr id="68" name="Imagem 68"/>
+            <wp:cNvGraphicFramePr>
+              <a:graphicFrameLocks xmlns:a="http://schemas.openxmlformats.org/drawingml/2006/main" noChangeAspect="1"/>
+            </wp:cNvGraphicFramePr>
+            <a:graphic xmlns:a="http://schemas.openxmlformats.org/drawingml/2006/main">
+              <a:graphicData uri="http://schemas.openxmlformats.org/drawingml/2006/picture">
+                <pic:pic xmlns:pic="http://schemas.openxmlformats.org/drawingml/2006/picture">
+                  <pic:nvPicPr>
+                    <pic:cNvPr id="1" name=""/>
+                    <pic:cNvPicPr/>
+                  </pic:nvPicPr>
+                  <pic:blipFill>
+                    <a:blip r:embed="rId85"/>
+                    <a:stretch>
+                      <a:fillRect/>
+                    </a:stretch>
+                  </pic:blipFill>
+                  <pic:spPr>
+                    <a:xfrm>
+                      <a:off x="0" y="0"/>
+                      <a:ext cx="2635645" cy="705720"/>
+                    </a:xfrm>
+                    <a:prstGeom prst="rect">
+                      <a:avLst/>
+                    </a:prstGeom>
+                  </pic:spPr>
+                </pic:pic>
+              </a:graphicData>
+            </a:graphic>
+          </wp:inline>
+        </w:drawing>
+      </w:r>
+      <w:r>
+        <w:t xml:space="preserve">    </w:t>
+      </w:r>
+    </w:p>
+    <w:p/>
+    <w:p>
+      <w:r>
+        <w:t xml:space="preserve">49-Mudamos a cor da borda ao clicar sobre ela utilizando o </w:t>
+      </w:r>
+      <w:proofErr w:type="spellStart"/>
+      <w:r>
+        <w:t>active</w:t>
+      </w:r>
+      <w:proofErr w:type="spellEnd"/>
+      <w:r>
+        <w:t>.</w:t>
+      </w:r>
+    </w:p>
+    <w:p>
+      <w:r>
+        <w:rPr>
+          <w:noProof/>
+        </w:rPr>
+        <w:drawing>
+          <wp:inline distT="0" distB="0" distL="0" distR="0" wp14:anchorId="51A5D333">
+            <wp:extent cx="2431883" cy="733425"/>
+            <wp:effectExtent l="0" t="0" r="6985" b="0"/>
+            <wp:docPr id="80" name="Imagem 80"/>
+            <wp:cNvGraphicFramePr>
+              <a:graphicFrameLocks xmlns:a="http://schemas.openxmlformats.org/drawingml/2006/main" noChangeAspect="1"/>
+            </wp:cNvGraphicFramePr>
+            <a:graphic xmlns:a="http://schemas.openxmlformats.org/drawingml/2006/main">
+              <a:graphicData uri="http://schemas.openxmlformats.org/drawingml/2006/picture">
+                <pic:pic xmlns:pic="http://schemas.openxmlformats.org/drawingml/2006/picture">
+                  <pic:nvPicPr>
+                    <pic:cNvPr id="0" name="Picture 2"/>
+                    <pic:cNvPicPr>
+                      <a:picLocks noChangeAspect="1" noChangeArrowheads="1"/>
+                    </pic:cNvPicPr>
+                  </pic:nvPicPr>
+                  <pic:blipFill>
+                    <a:blip r:embed="rId86">
+                      <a:extLst>
+                        <a:ext uri="{28A0092B-C50C-407E-A947-70E740481C1C}">
+                          <a14:useLocalDpi xmlns:a14="http://schemas.microsoft.com/office/drawing/2010/main" val="0"/>
+                        </a:ext>
+                      </a:extLst>
+                    </a:blip>
+                    <a:srcRect/>
+                    <a:stretch>
+                      <a:fillRect/>
+                    </a:stretch>
+                  </pic:blipFill>
+                  <pic:spPr bwMode="auto">
+                    <a:xfrm>
+                      <a:off x="0" y="0"/>
+                      <a:ext cx="2440879" cy="736138"/>
+                    </a:xfrm>
+                    <a:prstGeom prst="rect">
+                      <a:avLst/>
+                    </a:prstGeom>
+                    <a:noFill/>
+                  </pic:spPr>
+                </pic:pic>
+              </a:graphicData>
+            </a:graphic>
+          </wp:inline>
+        </w:drawing>
+      </w:r>
+      <w:r>
+        <w:t xml:space="preserve"> </w:t>
+      </w:r>
+    </w:p>
+    <w:p>
+      <w:r>
+        <w:t xml:space="preserve">   </w:t>
+      </w:r>
+    </w:p>
+    <w:p>
+      <w:r>
+        <w:t xml:space="preserve">   </w:t>
+      </w:r>
+      <w:r>
+        <w:rPr>
+          <w:noProof/>
+        </w:rPr>
+        <w:drawing>
+          <wp:inline distT="0" distB="0" distL="0" distR="0" wp14:anchorId="40B4DA5C">
+            <wp:extent cx="5264802" cy="2362200"/>
+            <wp:effectExtent l="0" t="0" r="0" b="0"/>
+            <wp:docPr id="82" name="Imagem 82"/>
+            <wp:cNvGraphicFramePr>
+              <a:graphicFrameLocks xmlns:a="http://schemas.openxmlformats.org/drawingml/2006/main" noChangeAspect="1"/>
+            </wp:cNvGraphicFramePr>
+            <a:graphic xmlns:a="http://schemas.openxmlformats.org/drawingml/2006/main">
+              <a:graphicData uri="http://schemas.openxmlformats.org/drawingml/2006/picture">
+                <pic:pic xmlns:pic="http://schemas.openxmlformats.org/drawingml/2006/picture">
+                  <pic:nvPicPr>
+                    <pic:cNvPr id="0" name="Picture 4"/>
+                    <pic:cNvPicPr>
+                      <a:picLocks noChangeAspect="1" noChangeArrowheads="1"/>
+                    </pic:cNvPicPr>
+                  </pic:nvPicPr>
+                  <pic:blipFill>
+                    <a:blip r:embed="rId87">
+                      <a:extLst>
+                        <a:ext uri="{28A0092B-C50C-407E-A947-70E740481C1C}">
+                          <a14:useLocalDpi xmlns:a14="http://schemas.microsoft.com/office/drawing/2010/main" val="0"/>
+                        </a:ext>
+                      </a:extLst>
+                    </a:blip>
+                    <a:srcRect/>
+                    <a:stretch>
+                      <a:fillRect/>
+                    </a:stretch>
+                  </pic:blipFill>
+                  <pic:spPr bwMode="auto">
+                    <a:xfrm>
+                      <a:off x="0" y="0"/>
+                      <a:ext cx="5272728" cy="2365756"/>
+                    </a:xfrm>
+                    <a:prstGeom prst="rect">
+                      <a:avLst/>
+                    </a:prstGeom>
+                    <a:noFill/>
+                  </pic:spPr>
+                </pic:pic>
+              </a:graphicData>
+            </a:graphic>
+          </wp:inline>
+        </w:drawing>
+      </w:r>
+      <w:r>
+        <w:t xml:space="preserve">         </w:t>
+      </w:r>
+    </w:p>
+    <w:p>
+      <w:r>
+        <w:t>50-</w:t>
+      </w:r>
+      <w:r>
+        <w:t xml:space="preserve"> Agora vamos deixar a nossa pagina mais interativa colocando um </w:t>
+      </w:r>
+      <w:proofErr w:type="spellStart"/>
+      <w:r>
+        <w:t>houber</w:t>
+      </w:r>
+      <w:proofErr w:type="spellEnd"/>
+      <w:r>
+        <w:t xml:space="preserve"> no </w:t>
+      </w:r>
+      <w:proofErr w:type="spellStart"/>
+      <w:r>
+        <w:t>titulo</w:t>
+      </w:r>
+      <w:proofErr w:type="spellEnd"/>
+      <w:r>
+        <w:t xml:space="preserve">, </w:t>
+      </w:r>
+      <w:proofErr w:type="gramStart"/>
+      <w:r>
+        <w:t>ou seja</w:t>
+      </w:r>
+      <w:proofErr w:type="gramEnd"/>
+      <w:r>
+        <w:t xml:space="preserve"> vamos passar o mouse ele vai aumentar de tamanho </w:t>
+      </w:r>
+      <w:r>
+        <w:t>passando uma impressão que a imagem está se movendo.</w:t>
+      </w:r>
+    </w:p>
+    <w:p>
+      <w:r>
+        <w:drawing>
+          <wp:inline distT="0" distB="0" distL="0" distR="0" wp14:anchorId="65B72F14" wp14:editId="5F51BC66">
+            <wp:extent cx="1914525" cy="533021"/>
+            <wp:effectExtent l="0" t="0" r="0" b="635"/>
+            <wp:docPr id="83" name="Imagem 83"/>
+            <wp:cNvGraphicFramePr>
+              <a:graphicFrameLocks xmlns:a="http://schemas.openxmlformats.org/drawingml/2006/main" noChangeAspect="1"/>
+            </wp:cNvGraphicFramePr>
+            <a:graphic xmlns:a="http://schemas.openxmlformats.org/drawingml/2006/main">
+              <a:graphicData uri="http://schemas.openxmlformats.org/drawingml/2006/picture">
+                <pic:pic xmlns:pic="http://schemas.openxmlformats.org/drawingml/2006/picture">
+                  <pic:nvPicPr>
+                    <pic:cNvPr id="1" name=""/>
+                    <pic:cNvPicPr/>
+                  </pic:nvPicPr>
+                  <pic:blipFill>
+                    <a:blip r:embed="rId88"/>
+                    <a:stretch>
+                      <a:fillRect/>
+                    </a:stretch>
+                  </pic:blipFill>
+                  <pic:spPr>
+                    <a:xfrm>
+                      <a:off x="0" y="0"/>
+                      <a:ext cx="1925496" cy="536075"/>
+                    </a:xfrm>
+                    <a:prstGeom prst="rect">
+                      <a:avLst/>
+                    </a:prstGeom>
+                  </pic:spPr>
+                </pic:pic>
+              </a:graphicData>
+            </a:graphic>
+          </wp:inline>
+        </w:drawing>
+      </w:r>
+    </w:p>
+    <w:p>
+      <w:r>
+        <w:t xml:space="preserve">51- Adicionar uma imagem ao </w:t>
+      </w:r>
+      <w:proofErr w:type="spellStart"/>
+      <w:proofErr w:type="gramStart"/>
+      <w:r>
+        <w:t>footer</w:t>
+      </w:r>
+      <w:proofErr w:type="spellEnd"/>
+      <w:r>
+        <w:t xml:space="preserve"> </w:t>
+      </w:r>
+      <w:r>
+        <w:t xml:space="preserve"> </w:t>
+      </w:r>
+      <w:r>
+        <w:t>conforme</w:t>
+      </w:r>
+      <w:proofErr w:type="gramEnd"/>
+      <w:r>
+        <w:t xml:space="preserve"> código.</w:t>
+      </w:r>
+    </w:p>
+    <w:p>
+      <w:r>
+        <w:t xml:space="preserve">    </w:t>
+      </w:r>
+      <w:r>
+        <w:rPr>
+          <w:noProof/>
+        </w:rPr>
+        <w:drawing>
+          <wp:inline distT="0" distB="0" distL="0" distR="0" wp14:anchorId="128AB48A">
+            <wp:extent cx="3848735" cy="609600"/>
+            <wp:effectExtent l="0" t="0" r="0" b="0"/>
+            <wp:docPr id="84" name="Imagem 84"/>
+            <wp:cNvGraphicFramePr>
+              <a:graphicFrameLocks xmlns:a="http://schemas.openxmlformats.org/drawingml/2006/main" noChangeAspect="1"/>
+            </wp:cNvGraphicFramePr>
+            <a:graphic xmlns:a="http://schemas.openxmlformats.org/drawingml/2006/main">
+              <a:graphicData uri="http://schemas.openxmlformats.org/drawingml/2006/picture">
+                <pic:pic xmlns:pic="http://schemas.openxmlformats.org/drawingml/2006/picture">
+                  <pic:nvPicPr>
+                    <pic:cNvPr id="0" name="Picture 5"/>
+                    <pic:cNvPicPr>
+                      <a:picLocks noChangeAspect="1" noChangeArrowheads="1"/>
+                    </pic:cNvPicPr>
+                  </pic:nvPicPr>
+                  <pic:blipFill>
+                    <a:blip r:embed="rId89">
+                      <a:extLst>
+                        <a:ext uri="{28A0092B-C50C-407E-A947-70E740481C1C}">
+                          <a14:useLocalDpi xmlns:a14="http://schemas.microsoft.com/office/drawing/2010/main" val="0"/>
+                        </a:ext>
+                      </a:extLst>
+                    </a:blip>
+                    <a:srcRect/>
+                    <a:stretch>
+                      <a:fillRect/>
+                    </a:stretch>
+                  </pic:blipFill>
+                  <pic:spPr bwMode="auto">
+                    <a:xfrm>
+                      <a:off x="0" y="0"/>
+                      <a:ext cx="3848735" cy="609600"/>
+                    </a:xfrm>
+                    <a:prstGeom prst="rect">
+                      <a:avLst/>
+                    </a:prstGeom>
+                    <a:noFill/>
+                  </pic:spPr>
+                </pic:pic>
+              </a:graphicData>
+            </a:graphic>
+          </wp:inline>
+        </w:drawing>
+      </w:r>
+      <w:r>
+        <w:t xml:space="preserve">       </w:t>
+      </w:r>
+    </w:p>
+    <w:p/>
+    <w:p>
+      <w:r>
+        <w:t xml:space="preserve">52-Como a imagem </w:t>
+      </w:r>
+      <w:proofErr w:type="spellStart"/>
+      <w:r>
+        <w:t>footer</w:t>
+      </w:r>
+      <w:proofErr w:type="spellEnd"/>
+      <w:r>
+        <w:t xml:space="preserve"> é branca precisamos adicionar uma cor de fundo.</w:t>
+      </w:r>
+    </w:p>
+    <w:p>
+      <w:r>
+        <w:t xml:space="preserve">                     </w:t>
+      </w:r>
+      <w:r>
+        <w:rPr>
+          <w:noProof/>
+        </w:rPr>
+        <w:drawing>
+          <wp:inline distT="0" distB="0" distL="0" distR="0" wp14:anchorId="392C9BA1">
+            <wp:extent cx="2076450" cy="571500"/>
+            <wp:effectExtent l="0" t="0" r="0" b="0"/>
+            <wp:docPr id="86" name="Imagem 86"/>
+            <wp:cNvGraphicFramePr>
+              <a:graphicFrameLocks xmlns:a="http://schemas.openxmlformats.org/drawingml/2006/main" noChangeAspect="1"/>
+            </wp:cNvGraphicFramePr>
+            <a:graphic xmlns:a="http://schemas.openxmlformats.org/drawingml/2006/main">
+              <a:graphicData uri="http://schemas.openxmlformats.org/drawingml/2006/picture">
+                <pic:pic xmlns:pic="http://schemas.openxmlformats.org/drawingml/2006/picture">
+                  <pic:nvPicPr>
+                    <pic:cNvPr id="0" name="Picture 7"/>
+                    <pic:cNvPicPr>
+                      <a:picLocks noChangeAspect="1" noChangeArrowheads="1"/>
+                    </pic:cNvPicPr>
+                  </pic:nvPicPr>
+                  <pic:blipFill>
+                    <a:blip r:embed="rId90">
+                      <a:extLst>
+                        <a:ext uri="{28A0092B-C50C-407E-A947-70E740481C1C}">
+                          <a14:useLocalDpi xmlns:a14="http://schemas.microsoft.com/office/drawing/2010/main" val="0"/>
+                        </a:ext>
+                      </a:extLst>
+                    </a:blip>
+                    <a:srcRect/>
+                    <a:stretch>
+                      <a:fillRect/>
+                    </a:stretch>
+                  </pic:blipFill>
+                  <pic:spPr bwMode="auto">
+                    <a:xfrm>
+                      <a:off x="0" y="0"/>
+                      <a:ext cx="2076450" cy="571500"/>
+                    </a:xfrm>
+                    <a:prstGeom prst="rect">
+                      <a:avLst/>
+                    </a:prstGeom>
+                    <a:noFill/>
+                  </pic:spPr>
+                </pic:pic>
+              </a:graphicData>
+            </a:graphic>
+          </wp:inline>
+        </w:drawing>
+      </w:r>
+      <w:r>
+        <w:t xml:space="preserve">            </w:t>
+      </w:r>
+    </w:p>
+    <w:p>
+      <w:r>
+        <w:t xml:space="preserve">53-Inserimos um </w:t>
+      </w:r>
+      <w:proofErr w:type="spellStart"/>
+      <w:r>
+        <w:t>pararagrafo</w:t>
+      </w:r>
+      <w:proofErr w:type="spellEnd"/>
+      <w:r>
+        <w:t xml:space="preserve"> no </w:t>
+      </w:r>
+      <w:proofErr w:type="spellStart"/>
+      <w:r>
+        <w:t>footer</w:t>
+      </w:r>
+      <w:proofErr w:type="spellEnd"/>
+      <w:r>
+        <w:t xml:space="preserve"> e centralizamos os conteúdos dentro dele.</w:t>
+      </w:r>
+    </w:p>
+    <w:p>
+      <w:r>
+        <w:t xml:space="preserve"> </w:t>
+      </w:r>
+      <w:r>
+        <w:t xml:space="preserve"> </w:t>
+      </w:r>
       <w:bookmarkStart w:id="0" w:name="_GoBack"/>
       <w:bookmarkEnd w:id="0"/>
+      <w:r>
+        <w:rPr>
+          <w:noProof/>
+        </w:rPr>
+        <w:drawing>
+          <wp:inline distT="0" distB="0" distL="0" distR="0" wp14:anchorId="4256813B">
+            <wp:extent cx="3696335" cy="742950"/>
+            <wp:effectExtent l="0" t="0" r="0" b="0"/>
+            <wp:docPr id="87" name="Imagem 87"/>
+            <wp:cNvGraphicFramePr>
+              <a:graphicFrameLocks xmlns:a="http://schemas.openxmlformats.org/drawingml/2006/main" noChangeAspect="1"/>
+            </wp:cNvGraphicFramePr>
+            <a:graphic xmlns:a="http://schemas.openxmlformats.org/drawingml/2006/main">
+              <a:graphicData uri="http://schemas.openxmlformats.org/drawingml/2006/picture">
+                <pic:pic xmlns:pic="http://schemas.openxmlformats.org/drawingml/2006/picture">
+                  <pic:nvPicPr>
+                    <pic:cNvPr id="0" name="Picture 8"/>
+                    <pic:cNvPicPr>
+                      <a:picLocks noChangeAspect="1" noChangeArrowheads="1"/>
+                    </pic:cNvPicPr>
+                  </pic:nvPicPr>
+                  <pic:blipFill>
+                    <a:blip r:embed="rId91">
+                      <a:extLst>
+                        <a:ext uri="{28A0092B-C50C-407E-A947-70E740481C1C}">
+                          <a14:useLocalDpi xmlns:a14="http://schemas.microsoft.com/office/drawing/2010/main" val="0"/>
+                        </a:ext>
+                      </a:extLst>
+                    </a:blip>
+                    <a:srcRect/>
+                    <a:stretch>
+                      <a:fillRect/>
+                    </a:stretch>
+                  </pic:blipFill>
+                  <pic:spPr bwMode="auto">
+                    <a:xfrm>
+                      <a:off x="0" y="0"/>
+                      <a:ext cx="3696335" cy="742950"/>
+                    </a:xfrm>
+                    <a:prstGeom prst="rect">
+                      <a:avLst/>
+                    </a:prstGeom>
+                    <a:noFill/>
+                  </pic:spPr>
+                </pic:pic>
+              </a:graphicData>
+            </a:graphic>
+          </wp:inline>
+        </w:drawing>
+      </w:r>
+      <w:r>
+        <w:t xml:space="preserve">                                                                                                                                                                                                                                                                                                                                                                                                                                                                                                                                                                                                                                                                                                                                                                                                                                                                                                                                                                              </w:t>
+      </w:r>
     </w:p>
     <w:sectPr>
       <w:pgSz w:w="11906" w:h="16838"/>
@@ -7054,7 +7550,7 @@
 </file>
 
 <file path=customXml/itemProps1.xml><?xml version="1.0" encoding="utf-8"?>
-<ds:datastoreItem xmlns:ds="http://schemas.openxmlformats.org/officeDocument/2006/customXml" ds:itemID="{3B88DF4A-C720-4B36-A713-1B1023A3A2B8}">
+<ds:datastoreItem xmlns:ds="http://schemas.openxmlformats.org/officeDocument/2006/customXml" ds:itemID="{B2FC01B7-AD17-4D3C-B604-191205C5327A}">
   <ds:schemaRefs>
     <ds:schemaRef ds:uri="http://schemas.openxmlformats.org/officeDocument/2006/bibliography"/>
   </ds:schemaRefs>

</xml_diff>

<commit_message>
atualização da aula 11/09/2026
</commit_message>
<xml_diff>
--- a/Apostila/Projeto Space for Men.docx
+++ b/Apostila/Projeto Space for Men.docx
@@ -6083,6 +6083,9 @@
     </w:p>
     <w:p>
       <w:r>
+        <w:rPr>
+          <w:noProof/>
+        </w:rPr>
         <w:drawing>
           <wp:inline distT="0" distB="0" distL="0" distR="0" wp14:anchorId="65ED7CB0" wp14:editId="63190923">
             <wp:extent cx="2632398" cy="704850"/>
@@ -6292,6 +6295,9 @@
     </w:p>
     <w:p>
       <w:r>
+        <w:rPr>
+          <w:noProof/>
+        </w:rPr>
         <w:drawing>
           <wp:inline distT="0" distB="0" distL="0" distR="0" wp14:anchorId="65B72F14" wp14:editId="5F51BC66">
             <wp:extent cx="1914525" cy="533021"/>
@@ -6511,8 +6517,6 @@
       <w:r>
         <w:t xml:space="preserve"> </w:t>
       </w:r>
-      <w:bookmarkStart w:id="0" w:name="_GoBack"/>
-      <w:bookmarkEnd w:id="0"/>
       <w:r>
         <w:rPr>
           <w:noProof/>
@@ -6564,7 +6568,286 @@
         </w:drawing>
       </w:r>
       <w:r>
-        <w:t xml:space="preserve">                                                                                                                                                                                                                                                                                                                                                                                                                                                                                                                                                                                                                                                                                                                                                                                                                                                                                                                                                                              </w:t>
+        <w:t xml:space="preserve">           </w:t>
+      </w:r>
+    </w:p>
+    <w:p/>
+    <w:p>
+      <w:r>
+        <w:t>54-</w:t>
+      </w:r>
+      <w:r>
+        <w:t xml:space="preserve">Inserindo uma imagem de fundo no site ao contrario do </w:t>
+      </w:r>
+      <w:proofErr w:type="spellStart"/>
+      <w:r>
+        <w:t>html</w:t>
+      </w:r>
+      <w:proofErr w:type="spellEnd"/>
+      <w:r>
+        <w:t xml:space="preserve"> colocamos uma imagem de fundo pelo CSS e quando realizamos tal função a natureza da imagem e ficar se repetindo no site.</w:t>
+      </w:r>
+    </w:p>
+    <w:p>
+      <w:r>
+        <w:t>Se não quisemos que isso aconteça precisamos adicionar o comando.</w:t>
+      </w:r>
+    </w:p>
+    <w:p>
+      <w:r>
+        <w:t xml:space="preserve">     </w:t>
+      </w:r>
+      <w:r>
+        <w:drawing>
+          <wp:inline distT="0" distB="0" distL="0" distR="0" wp14:anchorId="271B2B52" wp14:editId="257FEFE6">
+            <wp:extent cx="2847975" cy="1141284"/>
+            <wp:effectExtent l="0" t="0" r="0" b="1905"/>
+            <wp:docPr id="81" name="Imagem 81"/>
+            <wp:cNvGraphicFramePr>
+              <a:graphicFrameLocks xmlns:a="http://schemas.openxmlformats.org/drawingml/2006/main" noChangeAspect="1"/>
+            </wp:cNvGraphicFramePr>
+            <a:graphic xmlns:a="http://schemas.openxmlformats.org/drawingml/2006/main">
+              <a:graphicData uri="http://schemas.openxmlformats.org/drawingml/2006/picture">
+                <pic:pic xmlns:pic="http://schemas.openxmlformats.org/drawingml/2006/picture">
+                  <pic:nvPicPr>
+                    <pic:cNvPr id="1" name=""/>
+                    <pic:cNvPicPr/>
+                  </pic:nvPicPr>
+                  <pic:blipFill>
+                    <a:blip r:embed="rId92"/>
+                    <a:stretch>
+                      <a:fillRect/>
+                    </a:stretch>
+                  </pic:blipFill>
+                  <pic:spPr>
+                    <a:xfrm>
+                      <a:off x="0" y="0"/>
+                      <a:ext cx="2853342" cy="1143435"/>
+                    </a:xfrm>
+                    <a:prstGeom prst="rect">
+                      <a:avLst/>
+                    </a:prstGeom>
+                  </pic:spPr>
+                </pic:pic>
+              </a:graphicData>
+            </a:graphic>
+          </wp:inline>
+        </w:drawing>
+      </w:r>
+      <w:r>
+        <w:t xml:space="preserve">        </w:t>
+      </w:r>
+    </w:p>
+    <w:p/>
+    <w:p>
+      <w:r>
+        <w:t>55-</w:t>
+      </w:r>
+      <w:r>
+        <w:t xml:space="preserve">No </w:t>
+      </w:r>
+      <w:proofErr w:type="spellStart"/>
+      <w:r>
+        <w:t>footer</w:t>
+      </w:r>
+      <w:proofErr w:type="spellEnd"/>
+      <w:r>
+        <w:t xml:space="preserve"> após colocamos uma imagem de fundo preta se fez necessário mudar a cor da letra do </w:t>
+      </w:r>
+      <w:proofErr w:type="spellStart"/>
+      <w:r>
+        <w:t>paragrafo</w:t>
+      </w:r>
+      <w:proofErr w:type="spellEnd"/>
+      <w:r>
+        <w:t xml:space="preserve"> (White).</w:t>
+      </w:r>
+    </w:p>
+    <w:p>
+      <w:r>
+        <w:t xml:space="preserve">Aumentamos o espaço interno tanto para cima como para baixo e diminuímos o tamanho da fonte </w:t>
+      </w:r>
+    </w:p>
+    <w:p>
+      <w:r>
+        <w:t xml:space="preserve">  </w:t>
+      </w:r>
+      <w:r>
+        <w:rPr>
+          <w:noProof/>
+        </w:rPr>
+        <w:drawing>
+          <wp:inline distT="0" distB="0" distL="0" distR="0" wp14:anchorId="7954AD5F">
+            <wp:extent cx="2998138" cy="1209675"/>
+            <wp:effectExtent l="0" t="0" r="0" b="0"/>
+            <wp:docPr id="85" name="Imagem 85"/>
+            <wp:cNvGraphicFramePr>
+              <a:graphicFrameLocks xmlns:a="http://schemas.openxmlformats.org/drawingml/2006/main" noChangeAspect="1"/>
+            </wp:cNvGraphicFramePr>
+            <a:graphic xmlns:a="http://schemas.openxmlformats.org/drawingml/2006/main">
+              <a:graphicData uri="http://schemas.openxmlformats.org/drawingml/2006/picture">
+                <pic:pic xmlns:pic="http://schemas.openxmlformats.org/drawingml/2006/picture">
+                  <pic:nvPicPr>
+                    <pic:cNvPr id="0" name="Picture 2"/>
+                    <pic:cNvPicPr>
+                      <a:picLocks noChangeAspect="1" noChangeArrowheads="1"/>
+                    </pic:cNvPicPr>
+                  </pic:nvPicPr>
+                  <pic:blipFill>
+                    <a:blip r:embed="rId93">
+                      <a:extLst>
+                        <a:ext uri="{28A0092B-C50C-407E-A947-70E740481C1C}">
+                          <a14:useLocalDpi xmlns:a14="http://schemas.microsoft.com/office/drawing/2010/main" val="0"/>
+                        </a:ext>
+                      </a:extLst>
+                    </a:blip>
+                    <a:srcRect/>
+                    <a:stretch>
+                      <a:fillRect/>
+                    </a:stretch>
+                  </pic:blipFill>
+                  <pic:spPr bwMode="auto">
+                    <a:xfrm>
+                      <a:off x="0" y="0"/>
+                      <a:ext cx="3009363" cy="1214204"/>
+                    </a:xfrm>
+                    <a:prstGeom prst="rect">
+                      <a:avLst/>
+                    </a:prstGeom>
+                    <a:noFill/>
+                  </pic:spPr>
+                </pic:pic>
+              </a:graphicData>
+            </a:graphic>
+          </wp:inline>
+        </w:drawing>
+      </w:r>
+      <w:r>
+        <w:t xml:space="preserve">                        </w:t>
+      </w:r>
+    </w:p>
+    <w:p/>
+    <w:p>
+      <w:r>
+        <w:t xml:space="preserve">56-Criamos a pagina </w:t>
+      </w:r>
+      <w:r>
+        <w:t xml:space="preserve">contatos.html e contato.css copiamos o cabeçalho (header) da página produtos e colocamos na página contato e repetimos o mesmo processo no </w:t>
+      </w:r>
+      <w:proofErr w:type="spellStart"/>
+      <w:r>
+        <w:t>css</w:t>
+      </w:r>
+      <w:proofErr w:type="spellEnd"/>
+    </w:p>
+    <w:p>
+      <w:r>
+        <w:t xml:space="preserve">        </w:t>
+      </w:r>
+      <w:r>
+        <w:drawing>
+          <wp:inline distT="0" distB="0" distL="0" distR="0" wp14:anchorId="79FC5C5C" wp14:editId="3999822D">
+            <wp:extent cx="3505689" cy="1914792"/>
+            <wp:effectExtent l="0" t="0" r="0" b="9525"/>
+            <wp:docPr id="88" name="Imagem 88"/>
+            <wp:cNvGraphicFramePr>
+              <a:graphicFrameLocks xmlns:a="http://schemas.openxmlformats.org/drawingml/2006/main" noChangeAspect="1"/>
+            </wp:cNvGraphicFramePr>
+            <a:graphic xmlns:a="http://schemas.openxmlformats.org/drawingml/2006/main">
+              <a:graphicData uri="http://schemas.openxmlformats.org/drawingml/2006/picture">
+                <pic:pic xmlns:pic="http://schemas.openxmlformats.org/drawingml/2006/picture">
+                  <pic:nvPicPr>
+                    <pic:cNvPr id="1" name=""/>
+                    <pic:cNvPicPr/>
+                  </pic:nvPicPr>
+                  <pic:blipFill>
+                    <a:blip r:embed="rId94"/>
+                    <a:stretch>
+                      <a:fillRect/>
+                    </a:stretch>
+                  </pic:blipFill>
+                  <pic:spPr>
+                    <a:xfrm>
+                      <a:off x="0" y="0"/>
+                      <a:ext cx="3505689" cy="1914792"/>
+                    </a:xfrm>
+                    <a:prstGeom prst="rect">
+                      <a:avLst/>
+                    </a:prstGeom>
+                  </pic:spPr>
+                </pic:pic>
+              </a:graphicData>
+            </a:graphic>
+          </wp:inline>
+        </w:drawing>
+      </w:r>
+      <w:r>
+        <w:t xml:space="preserve">        </w:t>
+      </w:r>
+    </w:p>
+    <w:p>
+      <w:r>
+        <w:rPr>
+          <w:noProof/>
+        </w:rPr>
+        <w:drawing>
+          <wp:inline distT="0" distB="0" distL="0" distR="0" wp14:anchorId="65BF130E">
+            <wp:extent cx="2791460" cy="4848860"/>
+            <wp:effectExtent l="0" t="0" r="8890" b="8890"/>
+            <wp:docPr id="89" name="Imagem 89"/>
+            <wp:cNvGraphicFramePr>
+              <a:graphicFrameLocks xmlns:a="http://schemas.openxmlformats.org/drawingml/2006/main" noChangeAspect="1"/>
+            </wp:cNvGraphicFramePr>
+            <a:graphic xmlns:a="http://schemas.openxmlformats.org/drawingml/2006/main">
+              <a:graphicData uri="http://schemas.openxmlformats.org/drawingml/2006/picture">
+                <pic:pic xmlns:pic="http://schemas.openxmlformats.org/drawingml/2006/picture">
+                  <pic:nvPicPr>
+                    <pic:cNvPr id="0" name="Picture 3"/>
+                    <pic:cNvPicPr>
+                      <a:picLocks noChangeAspect="1" noChangeArrowheads="1"/>
+                    </pic:cNvPicPr>
+                  </pic:nvPicPr>
+                  <pic:blipFill>
+                    <a:blip r:embed="rId95">
+                      <a:extLst>
+                        <a:ext uri="{28A0092B-C50C-407E-A947-70E740481C1C}">
+                          <a14:useLocalDpi xmlns:a14="http://schemas.microsoft.com/office/drawing/2010/main" val="0"/>
+                        </a:ext>
+                      </a:extLst>
+                    </a:blip>
+                    <a:srcRect/>
+                    <a:stretch>
+                      <a:fillRect/>
+                    </a:stretch>
+                  </pic:blipFill>
+                  <pic:spPr bwMode="auto">
+                    <a:xfrm>
+                      <a:off x="0" y="0"/>
+                      <a:ext cx="2791460" cy="4848860"/>
+                    </a:xfrm>
+                    <a:prstGeom prst="rect">
+                      <a:avLst/>
+                    </a:prstGeom>
+                    <a:noFill/>
+                  </pic:spPr>
+                </pic:pic>
+              </a:graphicData>
+            </a:graphic>
+          </wp:inline>
+        </w:drawing>
+      </w:r>
+    </w:p>
+    <w:p>
+      <w:r>
+        <w:t>57-</w:t>
+      </w:r>
+      <w:r>
+        <w:t xml:space="preserve">    </w:t>
+      </w:r>
+      <w:bookmarkStart w:id="0" w:name="_GoBack"/>
+      <w:bookmarkEnd w:id="0"/>
+      <w:r>
+        <w:t xml:space="preserve">                                                                                                                                                                                                                                                                                                                                                                                                                                                                                                                                                                                                                                                                                                                                                                                                                                               </w:t>
       </w:r>
     </w:p>
     <w:sectPr>
@@ -7550,7 +7833,7 @@
 </file>
 
 <file path=customXml/itemProps1.xml><?xml version="1.0" encoding="utf-8"?>
-<ds:datastoreItem xmlns:ds="http://schemas.openxmlformats.org/officeDocument/2006/customXml" ds:itemID="{B2FC01B7-AD17-4D3C-B604-191205C5327A}">
+<ds:datastoreItem xmlns:ds="http://schemas.openxmlformats.org/officeDocument/2006/customXml" ds:itemID="{F61E97F1-2421-4AA3-82DF-CEEA1DC3A1BC}">
   <ds:schemaRefs>
     <ds:schemaRef ds:uri="http://schemas.openxmlformats.org/officeDocument/2006/bibliography"/>
   </ds:schemaRefs>

</xml_diff>